<commit_message>
Carga de documentacion de la Semana 6
</commit_message>
<xml_diff>
--- a/Documentacion/Semana 6/plataforma-Comercio-Energia.docx
+++ b/Documentacion/Semana 6/plataforma-Comercio-Energia.docx
@@ -1,6 +1,6 @@
 
 <file path=word/document.xml><?xml version="1.0" encoding="utf-8"?>
-<w:document xmlns:wpc="http://schemas.microsoft.com/office/word/2010/wordprocessingCanvas" xmlns:cx="http://schemas.microsoft.com/office/drawing/2014/chartex" xmlns:cx1="http://schemas.microsoft.com/office/drawing/2015/9/8/chartex" xmlns:cx2="http://schemas.microsoft.com/office/drawing/2015/10/21/chartex" xmlns:cx3="http://schemas.microsoft.com/office/drawing/2016/5/9/chartex" xmlns:cx4="http://schemas.microsoft.com/office/drawing/2016/5/10/chartex" xmlns:cx5="http://schemas.microsoft.com/office/drawing/2016/5/11/chartex" xmlns:cx6="http://schemas.microsoft.com/office/drawing/2016/5/12/chartex" xmlns:cx7="http://schemas.microsoft.com/office/drawing/2016/5/13/chartex" xmlns:cx8="http://schemas.microsoft.com/office/drawing/2016/5/14/chartex" xmlns:mc="http://schemas.openxmlformats.org/markup-compatibility/2006" xmlns:m="http://schemas.openxmlformats.org/officeDocument/2006/math" xmlns:aink="http://schemas.microsoft.com/office/drawing/2016/ink" xmlns:am3d="http://schemas.microsoft.com/office/drawing/2017/model3d" xmlns:oel="http://schemas.microsoft.com/office/2019/extlst" xmlns:r="http://schemas.openxmlformats.org/officeDocument/2006/relationships" xmlns:wp14="http://schemas.microsoft.com/office/word/2010/wordprocessingDrawing" xmlns:wp="http://schemas.openxmlformats.org/drawingml/2006/wordprocessingDrawing" xmlns:wpg="http://schemas.microsoft.com/office/word/2010/wordprocessingGroup" xmlns:wpi="http://schemas.microsoft.com/office/word/2010/wordprocessingInk" xmlns:wps="http://schemas.microsoft.com/office/word/2010/wordprocessingShape" xmlns:o="urn:schemas-microsoft-com:office:office" xmlns:v="urn:schemas-microsoft-com:vml" xmlns:w10="urn:schemas-microsoft-com:office:word" xmlns:w="http://schemas.openxmlformats.org/wordprocessingml/2006/main" xmlns:w14="http://schemas.microsoft.com/office/word/2010/wordml" xmlns:w15="http://schemas.microsoft.com/office/word/2012/wordml" xmlns:w16cex="http://schemas.microsoft.com/office/word/2018/wordml/cex" xmlns:w16cid="http://schemas.microsoft.com/office/word/2016/wordml/cid" xmlns:w16="http://schemas.microsoft.com/office/word/2018/wordml" xmlns:w16sdtdh="http://schemas.microsoft.com/office/word/2020/wordml/sdtdatahash" xmlns:w16sdtfl="http://schemas.microsoft.com/office/word/2024/wordml/sdtformatlock" xmlns:w16se="http://schemas.microsoft.com/office/word/2015/wordml/symex" xmlns:w16du="http://schemas.microsoft.com/office/word/2023/wordml/word16du" xmlns:wne="http://schemas.microsoft.com/office/word/2006/wordml" mc:Ignorable="w14 w15 w16se w16cid w16 w16cex w16sdtdh w16sdtfl w16du wp14">
+<w:document xmlns:wpc="http://schemas.microsoft.com/office/word/2010/wordprocessingCanvas" xmlns:cx="http://schemas.microsoft.com/office/drawing/2014/chartex" xmlns:cx1="http://schemas.microsoft.com/office/drawing/2015/9/8/chartex" xmlns:cx2="http://schemas.microsoft.com/office/drawing/2015/10/21/chartex" xmlns:cx3="http://schemas.microsoft.com/office/drawing/2016/5/9/chartex" xmlns:cx4="http://schemas.microsoft.com/office/drawing/2016/5/10/chartex" xmlns:cx5="http://schemas.microsoft.com/office/drawing/2016/5/11/chartex" xmlns:cx6="http://schemas.microsoft.com/office/drawing/2016/5/12/chartex" xmlns:cx7="http://schemas.microsoft.com/office/drawing/2016/5/13/chartex" xmlns:cx8="http://schemas.microsoft.com/office/drawing/2016/5/14/chartex" xmlns:mc="http://schemas.openxmlformats.org/markup-compatibility/2006" xmlns:aink="http://schemas.microsoft.com/office/drawing/2016/ink" xmlns:am3d="http://schemas.microsoft.com/office/drawing/2017/model3d" xmlns:o="urn:schemas-microsoft-com:office:office" xmlns:oel="http://schemas.microsoft.com/office/2019/extlst" xmlns:r="http://schemas.openxmlformats.org/officeDocument/2006/relationships" xmlns:m="http://schemas.openxmlformats.org/officeDocument/2006/math" xmlns:v="urn:schemas-microsoft-com:vml" xmlns:wp14="http://schemas.microsoft.com/office/word/2010/wordprocessingDrawing" xmlns:wp="http://schemas.openxmlformats.org/drawingml/2006/wordprocessingDrawing" xmlns:w10="urn:schemas-microsoft-com:office:word" xmlns:w="http://schemas.openxmlformats.org/wordprocessingml/2006/main" xmlns:w14="http://schemas.microsoft.com/office/word/2010/wordml" xmlns:w15="http://schemas.microsoft.com/office/word/2012/wordml" xmlns:w16cex="http://schemas.microsoft.com/office/word/2018/wordml/cex" xmlns:w16cid="http://schemas.microsoft.com/office/word/2016/wordml/cid" xmlns:w16="http://schemas.microsoft.com/office/word/2018/wordml" xmlns:w16du="http://schemas.microsoft.com/office/word/2023/wordml/word16du" xmlns:w16sdtdh="http://schemas.microsoft.com/office/word/2020/wordml/sdtdatahash" xmlns:w16sdtfl="http://schemas.microsoft.com/office/word/2024/wordml/sdtformatlock" xmlns:w16se="http://schemas.microsoft.com/office/word/2015/wordml/symex" xmlns:wpg="http://schemas.microsoft.com/office/word/2010/wordprocessingGroup" xmlns:wpi="http://schemas.microsoft.com/office/word/2010/wordprocessingInk" xmlns:wne="http://schemas.microsoft.com/office/word/2006/wordml" xmlns:wps="http://schemas.microsoft.com/office/word/2010/wordprocessingShape" mc:Ignorable="w14 w15 w16se w16cid w16 w16cex w16sdtdh w16sdtfl w16du wp14">
   <w:body>
     <w:p>
       <w:pPr>
@@ -1914,6 +1914,340 @@
           <w:tab w:val="right" w:leader="dot" w:pos="9360"/>
         </w:tabs>
         <w:spacing w:after="80" w:line="360" w:lineRule="auto"/>
+        <w:ind w:left="360"/>
+        <w:rPr>
+          <w:lang w:val="es-CO"/>
+        </w:rPr>
+      </w:pPr>
+      <w:r>
+        <w:rPr>
+          <w:lang w:val="es-CO"/>
+        </w:rPr>
+        <w:t>Aplicación del Patrón de Diseño Prototype</w:t>
+      </w:r>
+      <w:r>
+        <w:rPr>
+          <w:lang w:val="es-CO"/>
+        </w:rPr>
+        <w:tab/>
+      </w:r>
+      <w:r>
+        <w:fldChar w:fldCharType="begin"/>
+      </w:r>
+      <w:r>
+        <w:rPr>
+          <w:lang w:val="es-CO"/>
+        </w:rPr>
+        <w:instrText>PAGEREF bm_prototype \h</w:instrText>
+      </w:r>
+      <w:r>
+        <w:fldChar w:fldCharType="separate"/>
+      </w:r>
+      <w:r>
+        <w:rPr>
+          <w:noProof/>
+          <w:lang w:val="es-CO"/>
+        </w:rPr>
+        <w:t>1</w:t>
+      </w:r>
+      <w:r>
+        <w:fldChar w:fldCharType="end"/>
+      </w:r>
+    </w:p>
+    <w:p>
+      <w:pPr>
+        <w:tabs>
+          <w:tab w:val="right" w:leader="dot" w:pos="9360"/>
+        </w:tabs>
+        <w:spacing w:after="80" w:line="360" w:lineRule="auto"/>
+        <w:ind w:left="720"/>
+        <w:rPr>
+          <w:lang w:val="es-CO"/>
+        </w:rPr>
+      </w:pPr>
+      <w:r>
+        <w:rPr>
+          <w:i/>
+          <w:iCs/>
+          <w:lang w:val="es-CO"/>
+        </w:rPr>
+        <w:t>El Problema que Resuelve</w:t>
+      </w:r>
+      <w:r>
+        <w:rPr>
+          <w:lang w:val="es-CO"/>
+        </w:rPr>
+        <w:tab/>
+      </w:r>
+      <w:r>
+        <w:fldChar w:fldCharType="begin"/>
+      </w:r>
+      <w:r>
+        <w:rPr>
+          <w:lang w:val="es-CO"/>
+        </w:rPr>
+        <w:instrText>PAGEREF bm_prototype_problema \h</w:instrText>
+      </w:r>
+      <w:r>
+        <w:fldChar w:fldCharType="separate"/>
+      </w:r>
+      <w:r>
+        <w:rPr>
+          <w:noProof/>
+          <w:lang w:val="es-CO"/>
+        </w:rPr>
+        <w:t>1</w:t>
+      </w:r>
+      <w:r>
+        <w:fldChar w:fldCharType="end"/>
+      </w:r>
+    </w:p>
+    <w:p>
+      <w:pPr>
+        <w:tabs>
+          <w:tab w:val="right" w:leader="dot" w:pos="9360"/>
+        </w:tabs>
+        <w:spacing w:after="80" w:line="360" w:lineRule="auto"/>
+        <w:ind w:left="720"/>
+        <w:rPr>
+          <w:lang w:val="es-CO"/>
+        </w:rPr>
+      </w:pPr>
+      <w:r>
+        <w:rPr>
+          <w:i/>
+          <w:iCs/>
+          <w:lang w:val="es-CO"/>
+        </w:rPr>
+        <w:t>Cómo lo Soluciona el Patrón</w:t>
+      </w:r>
+      <w:r>
+        <w:rPr>
+          <w:lang w:val="es-CO"/>
+        </w:rPr>
+        <w:tab/>
+      </w:r>
+      <w:r>
+        <w:fldChar w:fldCharType="begin"/>
+      </w:r>
+      <w:r>
+        <w:rPr>
+          <w:lang w:val="es-CO"/>
+        </w:rPr>
+        <w:instrText>PAGEREF bm_prototype_solucion \h</w:instrText>
+      </w:r>
+      <w:r>
+        <w:fldChar w:fldCharType="separate"/>
+      </w:r>
+      <w:r>
+        <w:rPr>
+          <w:noProof/>
+          <w:lang w:val="es-CO"/>
+        </w:rPr>
+        <w:t>1</w:t>
+      </w:r>
+      <w:r>
+        <w:fldChar w:fldCharType="end"/>
+      </w:r>
+    </w:p>
+    <w:p>
+      <w:pPr>
+        <w:tabs>
+          <w:tab w:val="right" w:leader="dot" w:pos="9360"/>
+        </w:tabs>
+        <w:spacing w:after="80" w:line="360" w:lineRule="auto"/>
+        <w:ind w:left="720"/>
+        <w:rPr>
+          <w:lang w:val="es-CO"/>
+        </w:rPr>
+      </w:pPr>
+      <w:r>
+        <w:rPr>
+          <w:i/>
+          <w:iCs/>
+          <w:lang w:val="es-CO"/>
+        </w:rPr>
+        <w:t>Qué Gana la Plataforma con Esto</w:t>
+      </w:r>
+      <w:r>
+        <w:rPr>
+          <w:lang w:val="es-CO"/>
+        </w:rPr>
+        <w:tab/>
+      </w:r>
+      <w:r>
+        <w:fldChar w:fldCharType="begin"/>
+      </w:r>
+      <w:r>
+        <w:rPr>
+          <w:lang w:val="es-CO"/>
+        </w:rPr>
+        <w:instrText>PAGEREF bm_prototype_gana \h</w:instrText>
+      </w:r>
+      <w:r>
+        <w:fldChar w:fldCharType="separate"/>
+      </w:r>
+      <w:r>
+        <w:rPr>
+          <w:noProof/>
+          <w:lang w:val="es-CO"/>
+        </w:rPr>
+        <w:t>1</w:t>
+      </w:r>
+      <w:r>
+        <w:fldChar w:fldCharType="end"/>
+      </w:r>
+    </w:p>
+    <w:p>
+      <w:pPr>
+        <w:tabs>
+          <w:tab w:val="right" w:leader="dot" w:pos="9360"/>
+        </w:tabs>
+        <w:spacing w:after="80" w:line="360" w:lineRule="auto"/>
+        <w:ind w:left="720"/>
+        <w:rPr>
+          <w:lang w:val="es-CO"/>
+        </w:rPr>
+      </w:pPr>
+      <w:r>
+        <w:rPr>
+          <w:i/>
+          <w:iCs/>
+          <w:lang w:val="es-CO"/>
+        </w:rPr>
+        <w:t>Justificación de su Uso en el Proyecto</w:t>
+      </w:r>
+      <w:r>
+        <w:rPr>
+          <w:lang w:val="es-CO"/>
+        </w:rPr>
+        <w:tab/>
+      </w:r>
+      <w:r>
+        <w:fldChar w:fldCharType="begin"/>
+      </w:r>
+      <w:r>
+        <w:rPr>
+          <w:lang w:val="es-CO"/>
+        </w:rPr>
+        <w:instrText>PAGEREF bm_prototype_justificacion \h</w:instrText>
+      </w:r>
+      <w:r>
+        <w:fldChar w:fldCharType="separate"/>
+      </w:r>
+      <w:r>
+        <w:rPr>
+          <w:noProof/>
+          <w:lang w:val="es-CO"/>
+        </w:rPr>
+        <w:t>1</w:t>
+      </w:r>
+      <w:r>
+        <w:fldChar w:fldCharType="end"/>
+      </w:r>
+    </w:p>
+    <w:p>
+      <w:pPr>
+        <w:tabs>
+          <w:tab w:val="right" w:leader="dot" w:pos="9360"/>
+        </w:tabs>
+        <w:spacing w:after="80" w:line="360" w:lineRule="auto"/>
+        <w:ind w:left="720"/>
+        <w:rPr>
+          <w:lang w:val="es-CO"/>
+        </w:rPr>
+      </w:pPr>
+      <w:r>
+        <w:rPr>
+          <w:i/>
+          <w:iCs/>
+          <w:lang w:val="es-CO"/>
+        </w:rPr>
+        <w:t>Evaluación: ¿Sirve este patrón para el proyecto?</w:t>
+      </w:r>
+      <w:r>
+        <w:rPr>
+          <w:lang w:val="es-CO"/>
+        </w:rPr>
+        <w:tab/>
+      </w:r>
+      <w:r>
+        <w:fldChar w:fldCharType="begin"/>
+      </w:r>
+      <w:r>
+        <w:rPr>
+          <w:lang w:val="es-CO"/>
+        </w:rPr>
+        <w:instrText>PAGEREF bm_prototype_evaluacion \h</w:instrText>
+      </w:r>
+      <w:r>
+        <w:fldChar w:fldCharType="separate"/>
+      </w:r>
+      <w:r>
+        <w:rPr>
+          <w:noProof/>
+          <w:lang w:val="es-CO"/>
+        </w:rPr>
+        <w:t>1</w:t>
+      </w:r>
+      <w:r>
+        <w:fldChar w:fldCharType="end"/>
+      </w:r>
+    </w:p>
+    <w:p>
+      <w:pPr>
+        <w:tabs>
+          <w:tab w:val="right" w:leader="dot" w:pos="9360"/>
+        </w:tabs>
+        <w:spacing w:after="80" w:line="360" w:lineRule="auto"/>
+        <w:ind w:left="720"/>
+        <w:rPr>
+          <w:lang w:val="es-CO"/>
+        </w:rPr>
+      </w:pPr>
+      <w:r>
+        <w:rPr>
+          <w:i/>
+          <w:iCs/>
+          <w:lang w:val="es-CO"/>
+        </w:rPr>
+        <w:t>Validación del Patrón</w:t>
+      </w:r>
+      <w:r>
+        <w:rPr>
+          <w:lang w:val="es-CO"/>
+        </w:rPr>
+        <w:tab/>
+      </w:r>
+      <w:r>
+        <w:fldChar w:fldCharType="begin"/>
+      </w:r>
+      <w:r>
+        <w:rPr>
+          <w:lang w:val="es-CO"/>
+        </w:rPr>
+        <w:instrText>PAGEREF bm_prototype_validacion \h</w:instrText>
+      </w:r>
+      <w:r>
+        <w:fldChar w:fldCharType="separate"/>
+      </w:r>
+      <w:r>
+        <w:rPr>
+          <w:noProof/>
+          <w:lang w:val="es-CO"/>
+        </w:rPr>
+        <w:t>1</w:t>
+      </w:r>
+      <w:r>
+        <w:fldChar w:fldCharType="end"/>
+      </w:r>
+    </w:p>
+    <w:p>
+      <w:pPr>
+        <w:tabs>
+          <w:tab w:val="right" w:leader="dot" w:pos="9360"/>
+        </w:tabs>
+        <w:spacing w:after="80" w:line="360" w:lineRule="auto"/>
         <w:ind w:left="720"/>
         <w:rPr>
           <w:lang w:val="es-CO"/>
@@ -2908,6 +3242,144 @@
     </w:p>
     <w:p>
       <w:pPr>
+        <w:tabs>
+          <w:tab w:val="right" w:leader="dot" w:pos="9360"/>
+        </w:tabs>
+        <w:spacing w:after="80" w:line="360" w:lineRule="auto"/>
+        <w:ind w:left="360" w:hanging="360"/>
+        <w:rPr>
+          <w:lang w:val="es-CO"/>
+        </w:rPr>
+      </w:pPr>
+      <w:r>
+        <w:rPr>
+          <w:lang w:val="es-CO"/>
+        </w:rPr>
+        <w:t>Figura 20. Método clonar() de DispositivoIoT en prototype.py</w:t>
+      </w:r>
+      <w:r>
+        <w:rPr>
+          <w:lang w:val="es-CO"/>
+        </w:rPr>
+        <w:tab/>
+      </w:r>
+      <w:r>
+        <w:fldChar w:fldCharType="begin"/>
+      </w:r>
+      <w:r>
+        <w:rPr>
+          <w:lang w:val="es-CO"/>
+        </w:rPr>
+        <w:instrText>PAGEREF bm_fig20 \h</w:instrText>
+      </w:r>
+      <w:r>
+        <w:fldChar w:fldCharType="separate"/>
+      </w:r>
+      <w:r>
+        <w:rPr>
+          <w:noProof/>
+          <w:lang w:val="es-CO"/>
+        </w:rPr>
+        <w:t>1</w:t>
+      </w:r>
+      <w:r>
+        <w:fldChar w:fldCharType="end"/>
+      </w:r>
+    </w:p>
+    <w:p>
+      <w:pPr>
+        <w:tabs>
+          <w:tab w:val="right" w:leader="dot" w:pos="9360"/>
+        </w:tabs>
+        <w:spacing w:after="80" w:line="360" w:lineRule="auto"/>
+        <w:ind w:left="360" w:hanging="360"/>
+        <w:rPr>
+          <w:lang w:val="es-CO"/>
+        </w:rPr>
+      </w:pPr>
+      <w:r>
+        <w:rPr>
+          <w:lang w:val="es-CO"/>
+        </w:rPr>
+        <w:t>Figura 21. Resultados de la ejecución de las pruebas unitarias del patrón Prototype</w:t>
+      </w:r>
+      <w:r>
+        <w:rPr>
+          <w:lang w:val="es-CO"/>
+        </w:rPr>
+        <w:tab/>
+      </w:r>
+      <w:r>
+        <w:fldChar w:fldCharType="begin"/>
+      </w:r>
+      <w:r>
+        <w:rPr>
+          <w:lang w:val="es-CO"/>
+        </w:rPr>
+        <w:instrText>PAGEREF bm_fig21 \h</w:instrText>
+      </w:r>
+      <w:r>
+        <w:fldChar w:fldCharType="separate"/>
+      </w:r>
+      <w:r>
+        <w:rPr>
+          <w:noProof/>
+          <w:lang w:val="es-CO"/>
+        </w:rPr>
+        <w:t>1</w:t>
+      </w:r>
+      <w:r>
+        <w:fldChar w:fldCharType="end"/>
+      </w:r>
+    </w:p>
+    <w:p>
+      <w:pPr>
+        <w:tabs>
+          <w:tab w:val="right" w:leader="dot" w:pos="9360"/>
+        </w:tabs>
+        <w:spacing w:after="80" w:line="360" w:lineRule="auto"/>
+        <w:ind w:left="360" w:hanging="360"/>
+        <w:rPr>
+          <w:lang w:val="es-CO"/>
+        </w:rPr>
+      </w:pPr>
+      <w:r>
+        <w:rPr>
+          <w:lang w:val="es-CO"/>
+        </w:rPr>
+        <w:t>Figura 22. Interfaz de la plataforma para clonar un dispositivo IoT ya calibrado</w:t>
+      </w:r>
+      <w:r>
+        <w:rPr>
+          <w:lang w:val="es-CO"/>
+        </w:rPr>
+        <w:tab/>
+      </w:r>
+      <w:r>
+        <w:fldChar w:fldCharType="begin"/>
+      </w:r>
+      <w:r>
+        <w:rPr>
+          <w:lang w:val="es-CO"/>
+        </w:rPr>
+        <w:instrText>PAGEREF bm_fig22 \h</w:instrText>
+      </w:r>
+      <w:r>
+        <w:fldChar w:fldCharType="separate"/>
+      </w:r>
+      <w:r>
+        <w:rPr>
+          <w:noProof/>
+          <w:lang w:val="es-CO"/>
+        </w:rPr>
+        <w:t>1</w:t>
+      </w:r>
+      <w:r>
+        <w:fldChar w:fldCharType="end"/>
+      </w:r>
+    </w:p>
+    <w:p>
+      <w:pPr>
         <w:pageBreakBefore/>
         <w:rPr>
           <w:lang w:val="es-CO"/>
@@ -2947,25 +3419,7 @@
         <w:rPr>
           <w:lang w:val="es-CO"/>
         </w:rPr>
-        <w:t>El presente documento contextualiza el proyecto Plataforma de Comercio de Energía, una solución digital orientada a facilitar la compra y venta de excedentes energéticos entre usuarios en contextos de generación distribuida, como paneles solares domésticos y baterías inteligentes. Adicionalmente, se explica la implementación de cuatro patrones de diseño aplicados en el sistema: el patrón Singleton, que garantiza un punto único y consistente de acceso al estado de la plataforma (PlataformaEnergia</w:t>
-      </w:r>
-      <w:r>
-        <w:rPr>
-          <w:lang w:val="es-CO"/>
-        </w:rPr>
-        <w:t>) de forma segura ante la concurrencia; el patrón Factory Method, que resuelve la integración de distintos tipos de dispositivos IoT</w:t>
-      </w:r>
-      <w:r>
-        <w:rPr>
-          <w:lang w:val="es-CO"/>
-        </w:rPr>
-        <w:t xml:space="preserve"> domésticos (paneles solares, baterías inteligentes y medidores); el patrón Abstract Factory, que organiza los canales de notificación (correo, SMS y notificación push) para que cada uno genere la familia completa de avisos con un formato coherente; y el patrón Builder, que construye el reporte energético del usuario paso a paso para obtenerlo en distintas representaciones (diccionario, objeto con secciones o texto). Se describe la problemática que motiva el proyecto, la propuesta de solución, las funcional</w:t>
-      </w:r>
-      <w:r>
-        <w:rPr>
-          <w:lang w:val="es-CO"/>
-        </w:rPr>
-        <w:t>idades principales, el objetivo general y el impacto esperado, así como el problema técnico que motiva cada patrón, la solución propuesta a partir de las clases involucradas y los beneficios que aportan a la consistencia, la escalabilidad y la mantenibilidad del sistema.</w:t>
+        <w:t>El presente documento contextualiza el proyecto Plataforma de Comercio de Energía, una solución digital orientada a facilitar la compra y venta de excedentes energéticos entre usuarios en contextos de generación distribuida, como paneles solares domésticos y baterías inteligentes. Adicionalmente, se explica la implementación de cinco patrones de diseño aplicados en el sistema: el patrón Singleton, que garantiza un punto único y consistente de acceso al estado de la plataforma (PlataformaEnergia) de forma segura ante la concurrencia; el patrón Factory Method, que resuelve la integración de distintos tipos de dispositivos IoT domésticos (paneles solares, baterías inteligentes y medidores); el patrón Abstract Factory, que organiza los canales de notificación (correo, SMS y notificación push) para que cada uno genere la familia completa de avisos con un formato coherente; y el patrón Builder, que construye el reporte energético del usuario paso a paso para obtenerlo en distintas representaciones (diccionario, objeto con secciones o texto); y el patrón Prototype, que permite clonar un dispositivo IoT ya calibrado para dar de alta otros similares sin repetir su configuración. Se describe la problemática que motiva el proyecto, la propuesta de solución, las funcionalidades principales, el objetivo general y el impacto esperado, así como el problema técnico que motiva cada patrón, la solución propuesta a partir de las clases involucradas y los beneficios que aportan a la consistencia, la escalabilidad y la mantenibilidad del sistema.</w:t>
       </w:r>
     </w:p>
     <w:p>
@@ -2987,7 +3441,7 @@
         <w:rPr>
           <w:lang w:val="es-CO"/>
         </w:rPr>
-        <w:t>comercio de energía, Singleton, Factory Method, Abstract Factory, Builder, patrones de diseño, IoT, arquitectura de software, principio abierto/cerrado.</w:t>
+        <w:t>comercio de energía, Singleton, Factory Method, Abstract Factory, Builder, Prototype, patrones de diseño, IoT, arquitectura de software, principio abierto/cerrado.</w:t>
       </w:r>
     </w:p>
     <w:p>
@@ -3159,10 +3613,7 @@
         <w:t xml:space="preserve">El crecimiento de las energías renovables ha permitido que los hogares y pequeñas empresas generen parte de la energía que consumen. Sin embargo, todavía existen dificultades para administrar, monitorear y comercializar los excedentes energéticos. </w:t>
       </w:r>
       <w:r>
-        <w:t xml:space="preserve">Entre </w:t>
-      </w:r>
-      <w:r>
-        <w:t>los principales problemas se encuentran:</w:t>
+        <w:t>Entre los principales problemas se encuentran:</w:t>
       </w:r>
     </w:p>
     <w:p>
@@ -3344,13 +3795,7 @@
         <w:rPr>
           <w:lang w:val="es-CO"/>
         </w:rPr>
-        <w:t>Además, la plataforma integrará dispositivos IoT</w:t>
-      </w:r>
-      <w:r>
-        <w:rPr>
-          <w:lang w:val="es-CO"/>
-        </w:rPr>
-        <w:t xml:space="preserve"> domésticos para obtener datos sobre la producción, el consumo y el almacenamiento de energía. Esta información será utilizada para monitorear el comportamiento energético y mejorar la gestión de las transacciones.</w:t>
+        <w:t>Además, la plataforma integrará dispositivos IoT domésticos para obtener datos sobre la producción, el consumo y el almacenamiento de energía. Esta información será utilizada para monitorear el comportamiento energético y mejorar la gestión de las transacciones.</w:t>
       </w:r>
     </w:p>
     <w:p>
@@ -3489,10 +3934,7 @@
         <w:spacing w:line="480" w:lineRule="auto"/>
       </w:pPr>
       <w:r>
-        <w:t>Predicción</w:t>
-      </w:r>
-      <w:r>
-        <w:t xml:space="preserve"> de consumo energético.</w:t>
+        <w:t>Predicción de consumo energético.</w:t>
       </w:r>
     </w:p>
     <w:p>
@@ -3693,15 +4135,7 @@
           <w:iCs/>
           <w:lang w:val="es-CO"/>
         </w:rPr>
-        <w:t xml:space="preserve">Implementación de la metaclase SingletonMeta y la clase </w:t>
-      </w:r>
-      <w:r>
-        <w:rPr>
-          <w:i/>
-          <w:iCs/>
-          <w:lang w:val="es-CO"/>
-        </w:rPr>
-        <w:t>PlataformaEnergia</w:t>
+        <w:t>Implementación de la metaclase SingletonMeta y la clase PlataformaEnergia</w:t>
       </w:r>
     </w:p>
     <w:p>
@@ -4147,13 +4581,7 @@
         <w:rPr>
           <w:lang w:val="es-CO"/>
         </w:rPr>
-        <w:t>La metaclase SingletonMeta intercepta cada instanciación de PlataformaEnergia mediante double-checked locking</w:t>
-      </w:r>
-      <w:r>
-        <w:rPr>
-          <w:lang w:val="es-CO"/>
-        </w:rPr>
-        <w:t>: si ya existe una instancia almacenada, la devuelve directamente; si no existe, la crea una única vez dentro de un bloque protegido por un Lock, lo que evita que dos hilos concurrentes generen dos instancias distintas del mismo objeto (véase Figura 1).</w:t>
+        <w:t>La metaclase SingletonMeta intercepta cada instanciación de PlataformaEnergia mediante double-checked locking: si ya existe una instancia almacenada, la devuelve directamente; si no existe, la crea una única vez dentro de un bloque protegido por un Lock, lo que evita que dos hilos concurrentes generen dos instancias distintas del mismo objeto (véase Figura 1).</w:t>
       </w:r>
     </w:p>
     <w:p>
@@ -4168,13 +4596,7 @@
         <w:rPr>
           <w:lang w:val="es-CO"/>
         </w:rPr>
-        <w:t>La clase que adopta este comportamiento es PlataformaEnergia, definida como class PlataformaEnergia(metaclass=SingletonMeta). Esta clase se consume en main.py, donde se instancia una única vez como plataforma = PlataformaEnergia(), y todos los endpoints</w:t>
-      </w:r>
-      <w:r>
-        <w:rPr>
-          <w:lang w:val="es-CO"/>
-        </w:rPr>
-        <w:t xml:space="preserve"> del sistema (usuarios, órdenes, subasta, dispositivos IoT y autenticación) leen y escriben sobre ese mismo objeto compartido. El endpoint /estado, definido en main.py, expone el identificador de memoria de la instancia (id(plataforma)) precisamente para permitir verificar que se trata siempre del mismo objeto.</w:t>
+        <w:t>La clase que adopta este comportamiento es PlataformaEnergia, definida como class PlataformaEnergia(metaclass=SingletonMeta). Esta clase se consume en main.py, donde se instancia una única vez como plataforma = PlataformaEnergia(), y todos los endpoints del sistema (usuarios, órdenes, subasta, dispositivos IoT y autenticación) leen y escriben sobre ese mismo objeto compartido. El endpoint /estado, definido en main.py, expone el identificador de memoria de la instancia (id(plataforma)) precisamente para permitir verificar que se trata siempre del mismo objeto.</w:t>
       </w:r>
     </w:p>
     <w:p>
@@ -4189,13 +4611,7 @@
         <w:rPr>
           <w:lang w:val="es-CO"/>
         </w:rPr>
-        <w:t>La adopción de este patrón le aporta varios beneficios a la plataforma. En primer lugar, mantiene un estado único y consistente sin necesidad de una base de datos: los usuarios, las contraseñas, el libro de órdenes, el historial de transacciones y las lecturas de los dispositivos IoT residen en un solo objeto compartido por todas las peticiones HTTP. En segundo lugar, ofrece seguridad ante la concurrencia, ya que el servidor uvicorn</w:t>
-      </w:r>
-      <w:r>
-        <w:rPr>
-          <w:lang w:val="es-CO"/>
-        </w:rPr>
-        <w:t xml:space="preserve"> puede atender múltiples solicitudes simultáneas (varios usuarios operando o dispositivos IoT enviando lecturas al mismo tiempo) y el Lock evita condiciones de carrera durante la creación de la instancia. En tercer lugar, sirve como base para el proceso de autenticación, dado que el token JWT verifica la identidad contra el mismo diccionario de usuarios del Singleton; sin esta garantía, cada solicitud podría terminar autenticándose contra una copia distinta del sistema.</w:t>
+        <w:t>La adopción de este patrón le aporta varios beneficios a la plataforma. En primer lugar, mantiene un estado único y consistente sin necesidad de una base de datos: los usuarios, las contraseñas, el libro de órdenes, el historial de transacciones y las lecturas de los dispositivos IoT residen en un solo objeto compartido por todas las peticiones HTTP. En segundo lugar, ofrece seguridad ante la concurrencia, ya que el servidor uvicorn puede atender múltiples solicitudes simultáneas (varios usuarios operando o dispositivos IoT enviando lecturas al mismo tiempo) y el Lock evita condiciones de carrera durante la creación de la instancia. En tercer lugar, sirve como base para el proceso de autenticación, dado que el token JWT verifica la identidad contra el mismo diccionario de usuarios del Singleton; sin esta garantía, cada solicitud podría terminar autenticándose contra una copia distinta del sistema.</w:t>
       </w:r>
     </w:p>
     <w:p>
@@ -4355,25 +4771,7 @@
         <w:rPr>
           <w:lang w:val="es-CO"/>
         </w:rPr>
-        <w:t>El patrón Singleton resulta especialmente útil para este proyecto porque la Plataforma de Comercio de Energía debe coordinar, en tiempo real, las órdenes de compra y venta, las lecturas de los dispositivos IoT</w:t>
-      </w:r>
-      <w:r>
-        <w:rPr>
-          <w:lang w:val="es-CO"/>
-        </w:rPr>
-        <w:t xml:space="preserve"> y la ejecución de la subasta que publican múltiples usuarios de manera simultánea. Si cada solicitud HTTP pudiera operar sobre una instancia distinta del dominio, el libro de órdenes, el historial de transacciones y los saldos de los usuarios se desincronizarían entre sí, lo que haría inviable un mercado energético confiable. Al garantizar una única instancia de PlataformaEnergia</w:t>
-      </w:r>
-      <w:r>
-        <w:rPr>
-          <w:lang w:val="es-CO"/>
-        </w:rPr>
-        <w:t xml:space="preserve"> compartida por toda la API, el Singleton asegura que todas las operaciones descritas en la Contextualización del Proyecto (publicación de excedentes, ofertas de compra, ejecución de subastas y monitoreo de dispositivos IoT</w:t>
-      </w:r>
-      <w:r>
-        <w:rPr>
-          <w:lang w:val="es-CO"/>
-        </w:rPr>
-        <w:t>) se resuelvan siempre sobre el mismo estado consistente, sin necesidad de introducir una base de datos externa en esta etapa de prototipo. Adicionalmente, dado que la plataforma debe atender solicitudes concurrentes (varios usuarios operando y dispositivos enviando lecturas al mismo tiempo), el mecanismo de bloqueo (Lock) incorporado en la metaclase evita condiciones de carrera que podrían comprometer la integridad de las transacciones energéticas.</w:t>
+        <w:t>El patrón Singleton resulta especialmente útil para este proyecto porque la Plataforma de Comercio de Energía debe coordinar, en tiempo real, las órdenes de compra y venta, las lecturas de los dispositivos IoT y la ejecución de la subasta que publican múltiples usuarios de manera simultánea. Si cada solicitud HTTP pudiera operar sobre una instancia distinta del dominio, el libro de órdenes, el historial de transacciones y los saldos de los usuarios se desincronizarían entre sí, lo que haría inviable un mercado energético confiable. Al garantizar una única instancia de PlataformaEnergia compartida por toda la API, el Singleton asegura que todas las operaciones descritas en la Contextualización del Proyecto (publicación de excedentes, ofertas de compra, ejecución de subastas y monitoreo de dispositivos IoT) se resuelvan siempre sobre el mismo estado consistente, sin necesidad de introducir una base de datos externa en esta etapa de prototipo. Adicionalmente, dado que la plataforma debe atender solicitudes concurrentes (varios usuarios operando y dispositivos enviando lecturas al mismo tiempo), el mecanismo de bloqueo (Lock) incorporado en la metaclase evita condiciones de carrera que podrían comprometer la integridad de las transacciones energéticas.</w:t>
       </w:r>
     </w:p>
     <w:p>
@@ -4425,13 +4823,7 @@
           <w:lang w:val="es-CO"/>
         </w:rPr>
         <w:lastRenderedPageBreak/>
-        <w:t xml:space="preserve">fuente única de verdad sin añadir infraestructura </w:t>
-      </w:r>
-      <w:r>
-        <w:rPr>
-          <w:lang w:val="es-CO"/>
-        </w:rPr>
-        <w:t>adicional, y el Lock de la metaclase resuelve de forma directa el riesgo de condiciones de carrera cuando llegan varias peticiones al mismo tiempo.</w:t>
+        <w:t>fuente única de verdad sin añadir infraestructura adicional, y el Lock de la metaclase resuelve de forma directa el riesgo de condiciones de carrera cuando llegan varias peticiones al mismo tiempo.</w:t>
       </w:r>
     </w:p>
     <w:p>
@@ -4454,13 +4846,7 @@
         <w:rPr>
           <w:lang w:val="es-CO"/>
         </w:rPr>
-        <w:t>el propio patrón trae una limitación que hay que tener presente a futuro: un Singleton solo garantiza una única instancia dentro de un mismo proceso. Si más adelante la plataforma se despliega con varios workers de uvicorn o en varios contenedores para soportar más tráfico, cada proceso tendría su propio Singleton y el estado volvería a fragmentarse, exactamente el problema que el patrón busca evitar hoy. Por ejemplo, si mañana se levantan dos instancias del backend detrás de un balanceador de carga, un usu</w:t>
-      </w:r>
-      <w:r>
-        <w:rPr>
-          <w:lang w:val="es-CO"/>
-        </w:rPr>
-        <w:t>ario podría publicar una venta en la instancia A y otro usuario pujar por ella en la instancia B, sin que ninguna de las dos vea la orden de la otra.</w:t>
+        <w:t>el propio patrón trae una limitación que hay que tener presente a futuro: un Singleton solo garantiza una única instancia dentro de un mismo proceso. Si más adelante la plataforma se despliega con varios workers de uvicorn o en varios contenedores para soportar más tráfico, cada proceso tendría su propio Singleton y el estado volvería a fragmentarse, exactamente el problema que el patrón busca evitar hoy. Por ejemplo, si mañana se levantan dos instancias del backend detrás de un balanceador de carga, un usuario podría publicar una venta en la instancia A y otro usuario pujar por ella en la instancia B, sin que ninguna de las dos vea la orden de la otra.</w:t>
       </w:r>
     </w:p>
     <w:p>
@@ -4625,13 +5011,7 @@
         <w:rPr>
           <w:lang w:val="es-CO"/>
         </w:rPr>
-        <w:t>Vista del módulo Mercado de la plataforma Voltia</w:t>
-      </w:r>
-      <w:r>
-        <w:rPr>
-          <w:lang w:val="es-CO"/>
-        </w:rPr>
-        <w:t>, con la usuaria Ana (u1) autenticada. El libro de órdenes en vivo, el conteo de órdenes de venta y compra, y el resultado de la subasta ejecutada provienen todos del mismo objeto PlataformaEnergia, lo que evidencia que toda la plataforma comparte un único estado gestionado por el Singleton.</w:t>
+        <w:t>Vista del módulo Mercado de la plataforma Voltia, con la usuaria Ana (u1) autenticada. El libro de órdenes en vivo, el conteo de órdenes de venta y compra, y el resultado de la subasta ejecutada provienen todos del mismo objeto PlataformaEnergia, lo que evidencia que toda la plataforma comparte un único estado gestionado por el Singleton.</w:t>
       </w:r>
     </w:p>
     <w:p>
@@ -4679,15 +5059,7 @@
           <w:iCs/>
           <w:lang w:val="es-CO"/>
         </w:rPr>
-        <w:t>Código fuente de la metaclase SingletonMeta</w:t>
-      </w:r>
-      <w:r>
-        <w:rPr>
-          <w:i/>
-          <w:iCs/>
-          <w:lang w:val="es-CO"/>
-        </w:rPr>
-        <w:t xml:space="preserve"> en el archivo plataforma.py del proyecto</w:t>
+        <w:t>Código fuente de la metaclase SingletonMeta en el archivo plataforma.py del proyecto</w:t>
       </w:r>
     </w:p>
     <w:p>
@@ -4796,13 +5168,7 @@
         <w:rPr>
           <w:lang w:val="es-CO"/>
         </w:rPr>
-        <w:t>La validación del patrón Singleton se realizó mediante pruebas unitarias automatizadas con pytest, las cuales verifican que el comportamiento de la metaclase SingletonMeta</w:t>
-      </w:r>
-      <w:r>
-        <w:rPr>
-          <w:lang w:val="es-CO"/>
-        </w:rPr>
-        <w:t xml:space="preserve"> y de la clase PlataformaEnergia se ajusta a lo esperado. Como se observa en la Figura 4, la suite Patrones/Semana 2/test_singleton.py ejecutó 18 pruebas, todas ellas superadas exitosamente.</w:t>
+        <w:t>La validación del patrón Singleton se realizó mediante pruebas unitarias automatizadas con pytest, las cuales verifican que el comportamiento de la metaclase SingletonMeta y de la clase PlataformaEnergia se ajusta a lo esperado. Como se observa en la Figura 4, la suite Patrones/Semana 2/test_singleton.py ejecutó 18 pruebas, todas ellas superadas exitosamente.</w:t>
       </w:r>
     </w:p>
     <w:p>
@@ -4976,13 +5342,7 @@
         <w:rPr>
           <w:lang w:val="es-CO"/>
         </w:rPr>
-        <w:t>El Factory Method que se incorpora a la plataforma resuelve el requerimiento de integración con dispositivos IoT</w:t>
-      </w:r>
-      <w:r>
-        <w:rPr>
-          <w:lang w:val="es-CO"/>
-        </w:rPr>
-        <w:t xml:space="preserve"> domésticos (paneles solares, baterías y medidores). A continuación, se explica qué hace este patrón y por qué es necesario, tomando como referencia el código implementado en el archivo factory_method.py.</w:t>
+        <w:t>El Factory Method que se incorpora a la plataforma resuelve el requerimiento de integración con dispositivos IoT domésticos (paneles solares, baterías y medidores). A continuación, se explica qué hace este patrón y por qué es necesario, tomando como referencia el código implementado en el archivo factory_method.py.</w:t>
       </w:r>
     </w:p>
     <w:p>
@@ -5400,13 +5760,7 @@
         <w:rPr>
           <w:lang w:val="es-CO"/>
         </w:rPr>
-        <w:t>El sistema es extensible sin tocar nada existente: para sumar un cargador de vehículo eléctrico, solo se agregan las clases CargadorEV y CargadorEVFactory</w:t>
-      </w:r>
-      <w:r>
-        <w:rPr>
-          <w:lang w:val="es-CO"/>
-        </w:rPr>
-        <w:t xml:space="preserve"> y se registran en _FACTORIES. El resto de la plataforma (subastas, predicción, IoT) sigue funcionando igual.</w:t>
+        <w:t>El sistema es extensible sin tocar nada existente: para sumar un cargador de vehículo eléctrico, solo se agregan las clases CargadorEV y CargadorEVFactory y se registran en _FACTORIES. El resto de la plataforma (subastas, predicción, IoT) sigue funcionando igual.</w:t>
       </w:r>
     </w:p>
     <w:p>
@@ -5559,32 +5913,14 @@
         <w:rPr>
           <w:lang w:val="es-CO"/>
         </w:rPr>
-        <w:t xml:space="preserve">El patrón Factory Method resulta útil para este proyecto porque, según lo planteado en la Contextualización del Proyecto, la plataforma debe integrar distintos tipos de dispositivos IoT domésticos (paneles solares, baterías inteligentes y medidores) y </w:t>
-      </w:r>
-      <w:r>
-        <w:rPr>
-          <w:lang w:val="es-CO"/>
-        </w:rPr>
-        <w:t xml:space="preserve">dejar abierta la posibilidad de incorporar nuevos tipos de dispositivos a futuro, como cargadores de vehículos eléctricos u otras fuentes de generación distribuida. Cada tipo de dispositivo genera sus lecturas de kWh de forma distinta, por lo que centralizar esa lógica en condicionales dispersos por el código haría cada vez más difícil mantener y extender la plataforma a medida que crezca el catálogo de dispositivos </w:t>
+        <w:t xml:space="preserve">El patrón Factory Method resulta útil para este proyecto porque, según lo planteado en la Contextualización del Proyecto, la plataforma debe integrar distintos tipos de dispositivos IoT domésticos (paneles solares, baterías inteligentes y medidores) y dejar abierta la posibilidad de incorporar nuevos tipos de dispositivos a futuro, como cargadores de vehículos eléctricos u otras fuentes de generación distribuida. Cada tipo de dispositivo genera sus lecturas de kWh de forma distinta, por lo que centralizar esa lógica en condicionales dispersos por el código haría cada vez más difícil mantener y extender la plataforma a medida que crezca el catálogo de dispositivos </w:t>
       </w:r>
       <w:r>
         <w:rPr>
           <w:lang w:val="es-CO"/>
         </w:rPr>
         <w:lastRenderedPageBreak/>
-        <w:t>soportados. Al delegar la creación de cada dispositivo a una fábrica concreta, el Factory Me</w:t>
-      </w:r>
-      <w:r>
-        <w:rPr>
-          <w:lang w:val="es-CO"/>
-        </w:rPr>
-        <w:t xml:space="preserve">thod permite que la API, el módulo de simulación de lecturas y el módulo de predicción trabajen siempre contra la interfaz común </w:t>
-      </w:r>
-      <w:r>
-        <w:rPr>
-          <w:lang w:val="es-CO"/>
-        </w:rPr>
-        <w:t>DispositivoIoT, sin conocer los detalles de cada implementación. Esto es coherente con el impacto esperado del proyecto de servir como base para futuras soluciones relacionadas con redes eléctricas inteligentes y automatización de hogares, ya que permite agregar nuevos tipos de dispositivos sin modificar el código existente, en línea con el principio abierto/cerrado.</w:t>
+        <w:t>soportados. Al delegar la creación de cada dispositivo a una fábrica concreta, el Factory Method permite que la API, el módulo de simulación de lecturas y el módulo de predicción trabajen siempre contra la interfaz común DispositivoIoT, sin conocer los detalles de cada implementación. Esto es coherente con el impacto esperado del proyecto de servir como base para futuras soluciones relacionadas con redes eléctricas inteligentes y automatización de hogares, ya que permite agregar nuevos tipos de dispositivos sin modificar el código existente, en línea con el principio abierto/cerrado.</w:t>
       </w:r>
     </w:p>
     <w:p>
@@ -5629,13 +5965,7 @@
         <w:rPr>
           <w:lang w:val="es-CO"/>
         </w:rPr>
-        <w:t>el patrón Factory Method sí sirve para el proyecto y es, de los cuatro, el que menos inconvenientes presenta. La plataforma ya soporta tres tipos de dispositivo (panel solar, batería, medidor) y, según la Contextualización del Proyecto, se espera integrar cada vez más dispositivos domésticos, incluyendo posibles cargadores de vehículos eléctricos u otras fuentes de generación distribuida. Cada nuevo tipo se agrega creando solo dos clases nuevas (el producto y su fábrica) sin tocar el código existente, que e</w:t>
-      </w:r>
-      <w:r>
-        <w:rPr>
-          <w:lang w:val="es-CO"/>
-        </w:rPr>
-        <w:t>s exactamente el escenario para el que este patrón fue pensado.</w:t>
+        <w:t>el patrón Factory Method sí sirve para el proyecto y es, de los cuatro, el que menos inconvenientes presenta. La plataforma ya soporta tres tipos de dispositivo (panel solar, batería, medidor) y, según la Contextualización del Proyecto, se espera integrar cada vez más dispositivos domésticos, incluyendo posibles cargadores de vehículos eléctricos u otras fuentes de generación distribuida. Cada nuevo tipo se agrega creando solo dos clases nuevas (el producto y su fábrica) sin tocar el código existente, que es exactamente el escenario para el que este patrón fue pensado.</w:t>
       </w:r>
     </w:p>
     <w:p>
@@ -5849,15 +6179,7 @@
           <w:iCs/>
           <w:lang w:val="es-CO"/>
         </w:rPr>
-        <w:t xml:space="preserve">Documentación interactiva (Swagger) de los endpoints de dispositivos </w:t>
-      </w:r>
-      <w:r>
-        <w:rPr>
-          <w:i/>
-          <w:iCs/>
-          <w:lang w:val="es-CO"/>
-        </w:rPr>
-        <w:t>IoT de la API</w:t>
+        <w:t>Documentación interactiva (Swagger) de los endpoints de dispositivos IoT de la API</w:t>
       </w:r>
     </w:p>
     <w:p>
@@ -5943,13 +6265,7 @@
         <w:rPr>
           <w:lang w:val="es-CO"/>
         </w:rPr>
-        <w:t>Por su parte, la Figura 7 evidencia el uso del patrón desde la interfaz de usuario de la plataforma: en la pestaña IoT</w:t>
-      </w:r>
-      <w:r>
-        <w:rPr>
-          <w:lang w:val="es-CO"/>
-        </w:rPr>
-        <w:t xml:space="preserve"> &amp; Predicción, el formulario Conectar Dispositivo permite seleccionar el tipo de dispositivo (por ejemplo, Batería) antes de conectarlo, selección que la API traduce en el parámetro tipo recibido por crear_dispositivo. Es precisamente este parámetro el que el Factory Method utiliza para decidir, en tiempo de ejecución, qué producto concreto (PanelSolar, BateriaInteligente o MedidorInteligente) debe instanciarse, sin que el resto de la plataforma necesite conocer esa decisión.</w:t>
+        <w:t>Por su parte, la Figura 7 evidencia el uso del patrón desde la interfaz de usuario de la plataforma: en la pestaña IoT &amp; Predicción, el formulario Conectar Dispositivo permite seleccionar el tipo de dispositivo (por ejemplo, Batería) antes de conectarlo, selección que la API traduce en el parámetro tipo recibido por crear_dispositivo. Es precisamente este parámetro el que el Factory Method utiliza para decidir, en tiempo de ejecución, qué producto concreto (PanelSolar, BateriaInteligente o MedidorInteligente) debe instanciarse, sin que el resto de la plataforma necesite conocer esa decisión.</w:t>
       </w:r>
     </w:p>
     <w:p>
@@ -6099,13 +6415,7 @@
         <w:rPr>
           <w:lang w:val="es-CO"/>
         </w:rPr>
-        <w:t>El patrón Abstract Factory incorporado a la plataforma resuelve la manera en que el sistema comunica a los usuarios los eventos relevantes del mercado energético. La Plataforma de Comercio de Energía debe notificar en tres momentos distintos —el cierre de una operación en la subasta, una lectura de un dispositivo IoT fuera de su rango normal y el envío del reporte periódico de producción y consumo— y cada usuario elige el canal por el que desea recibir esos avisos: correo electrónico, mensaje de texto (SMS)</w:t>
-      </w:r>
-      <w:r>
-        <w:rPr>
-          <w:lang w:val="es-CO"/>
-        </w:rPr>
-        <w:t xml:space="preserve"> o notificación push a la aplicación móvil. Este módulo forma parte de la lógica de dominio del backend (notificaciones.py) y es consumido por la clase PlataformaEnergia y por la API FastAPI (main.py).</w:t>
+        <w:t>El patrón Abstract Factory incorporado a la plataforma resuelve la manera en que el sistema comunica a los usuarios los eventos relevantes del mercado energético. La Plataforma de Comercio de Energía debe notificar en tres momentos distintos —el cierre de una operación en la subasta, una lectura de un dispositivo IoT fuera de su rango normal y el envío del reporte periódico de producción y consumo— y cada usuario elige el canal por el que desea recibir esos avisos: correo electrónico, mensaje de texto (SMS) o notificación push a la aplicación móvil. Este módulo forma parte de la lógica de dominio del backend (notificaciones.py) y es consumido por la clase PlataformaEnergia y por la API FastAPI (main.py).</w:t>
       </w:r>
     </w:p>
     <w:p>
@@ -6551,16 +6861,12 @@
     <w:p>
       <w:pPr>
         <w:ind w:left="720"/>
-        <w:rPr>
-          <w:lang w:val="es-CO"/>
-        </w:rPr>
       </w:pPr>
       <w:r>
         <w:rPr>
           <w:rFonts w:ascii="Courier New" w:eastAsia="Courier New" w:hAnsi="Courier New" w:cs="Courier New"/>
           <w:sz w:val="20"/>
           <w:szCs w:val="20"/>
-          <w:lang w:val="es-CO"/>
         </w:rPr>
         <w:t>class CanalNotificacionFactory(ABC):</w:t>
       </w:r>
@@ -6568,16 +6874,12 @@
     <w:p>
       <w:pPr>
         <w:ind w:left="720"/>
-        <w:rPr>
-          <w:lang w:val="es-CO"/>
-        </w:rPr>
       </w:pPr>
       <w:r>
         <w:rPr>
           <w:rFonts w:ascii="Courier New" w:eastAsia="Courier New" w:hAnsi="Courier New" w:cs="Courier New"/>
           <w:sz w:val="20"/>
           <w:szCs w:val="20"/>
-          <w:lang w:val="es-CO"/>
         </w:rPr>
         <w:t xml:space="preserve">    @property</w:t>
       </w:r>
@@ -6585,16 +6887,12 @@
     <w:p>
       <w:pPr>
         <w:ind w:left="720"/>
-        <w:rPr>
-          <w:lang w:val="es-CO"/>
-        </w:rPr>
       </w:pPr>
       <w:r>
         <w:rPr>
           <w:rFonts w:ascii="Courier New" w:eastAsia="Courier New" w:hAnsi="Courier New" w:cs="Courier New"/>
           <w:sz w:val="20"/>
           <w:szCs w:val="20"/>
-          <w:lang w:val="es-CO"/>
         </w:rPr>
         <w:t xml:space="preserve">    @abstractmethod</w:t>
       </w:r>
@@ -6602,16 +6900,12 @@
     <w:p>
       <w:pPr>
         <w:ind w:left="720"/>
-        <w:rPr>
-          <w:lang w:val="es-CO"/>
-        </w:rPr>
       </w:pPr>
       <w:r>
         <w:rPr>
           <w:rFonts w:ascii="Courier New" w:eastAsia="Courier New" w:hAnsi="Courier New" w:cs="Courier New"/>
           <w:sz w:val="20"/>
           <w:szCs w:val="20"/>
-          <w:lang w:val="es-CO"/>
         </w:rPr>
         <w:t xml:space="preserve">    def canal(self) -&gt; str: ...</w:t>
       </w:r>
@@ -6619,16 +6913,12 @@
     <w:p>
       <w:pPr>
         <w:ind w:left="720"/>
-        <w:rPr>
-          <w:lang w:val="es-CO"/>
-        </w:rPr>
       </w:pPr>
       <w:r>
         <w:rPr>
           <w:rFonts w:ascii="Courier New" w:eastAsia="Courier New" w:hAnsi="Courier New" w:cs="Courier New"/>
           <w:sz w:val="20"/>
           <w:szCs w:val="20"/>
-          <w:lang w:val="es-CO"/>
         </w:rPr>
         <w:t xml:space="preserve"> </w:t>
       </w:r>
@@ -6645,18 +6935,9 @@
           <w:rFonts w:ascii="Courier New" w:eastAsia="Courier New" w:hAnsi="Courier New" w:cs="Courier New"/>
           <w:sz w:val="20"/>
           <w:szCs w:val="20"/>
-          <w:lang w:val="es-CO"/>
-        </w:rPr>
-        <w:t xml:space="preserve">    @abstractmethod</w:t>
-      </w:r>
-    </w:p>
-    <w:p>
-      <w:pPr>
-        <w:ind w:left="720"/>
-        <w:rPr>
-          <w:lang w:val="es-CO"/>
-        </w:rPr>
-      </w:pPr>
+        </w:rPr>
+        <w:t xml:space="preserve">    </w:t>
+      </w:r>
       <w:r>
         <w:rPr>
           <w:rFonts w:ascii="Courier New" w:eastAsia="Courier New" w:hAnsi="Courier New" w:cs="Courier New"/>
@@ -6664,8 +6945,7 @@
           <w:szCs w:val="20"/>
           <w:lang w:val="es-CO"/>
         </w:rPr>
-        <w:lastRenderedPageBreak/>
-        <w:t xml:space="preserve">    def crear_notificador_transaccion(self) -&gt; NotificadorTransaccion: ...</w:t>
+        <w:t>@abstractmethod</w:t>
       </w:r>
     </w:p>
     <w:p>
@@ -6682,7 +6962,8 @@
           <w:szCs w:val="20"/>
           <w:lang w:val="es-CO"/>
         </w:rPr>
-        <w:t xml:space="preserve"> </w:t>
+        <w:lastRenderedPageBreak/>
+        <w:t xml:space="preserve">    def crear_notificador_transaccion(self) -&gt; NotificadorTransaccion: ...</w:t>
       </w:r>
     </w:p>
     <w:p>
@@ -6699,7 +6980,7 @@
           <w:szCs w:val="20"/>
           <w:lang w:val="es-CO"/>
         </w:rPr>
-        <w:t xml:space="preserve">    @abstractmethod</w:t>
+        <w:t xml:space="preserve"> </w:t>
       </w:r>
     </w:p>
     <w:p>
@@ -6716,7 +6997,7 @@
           <w:szCs w:val="20"/>
           <w:lang w:val="es-CO"/>
         </w:rPr>
-        <w:t xml:space="preserve">    def crear_notificador_alerta_iot(self) -&gt; NotificadorAlertaIoT: ...</w:t>
+        <w:t xml:space="preserve">    @abstractmethod</w:t>
       </w:r>
     </w:p>
     <w:p>
@@ -6733,7 +7014,7 @@
           <w:szCs w:val="20"/>
           <w:lang w:val="es-CO"/>
         </w:rPr>
-        <w:t xml:space="preserve"> </w:t>
+        <w:t xml:space="preserve">    def crear_notificador_alerta_iot(self) -&gt; NotificadorAlertaIoT: ...</w:t>
       </w:r>
     </w:p>
     <w:p>
@@ -6750,7 +7031,7 @@
           <w:szCs w:val="20"/>
           <w:lang w:val="es-CO"/>
         </w:rPr>
-        <w:t xml:space="preserve">    @abstractmethod</w:t>
+        <w:t xml:space="preserve"> </w:t>
       </w:r>
     </w:p>
     <w:p>
@@ -6767,7 +7048,7 @@
           <w:szCs w:val="20"/>
           <w:lang w:val="es-CO"/>
         </w:rPr>
-        <w:t xml:space="preserve">    def crear_formateador_reporte(self) -&gt; FormateadorReporte: ...</w:t>
+        <w:t xml:space="preserve">    @abstractmethod</w:t>
       </w:r>
     </w:p>
     <w:p>
@@ -6784,7 +7065,7 @@
           <w:szCs w:val="20"/>
           <w:lang w:val="es-CO"/>
         </w:rPr>
-        <w:t xml:space="preserve"> </w:t>
+        <w:t xml:space="preserve">    def crear_formateador_reporte(self) -&gt; FormateadorReporte: ...</w:t>
       </w:r>
     </w:p>
     <w:p>
@@ -6818,58 +7099,71 @@
           <w:szCs w:val="20"/>
           <w:lang w:val="es-CO"/>
         </w:rPr>
-        <w:t>class CanalSMS(CanalNotificacionFactory):</w:t>
-      </w:r>
-    </w:p>
-    <w:p>
-      <w:pPr>
-        <w:ind w:left="720"/>
-        <w:rPr>
-          <w:lang w:val="es-CO"/>
-        </w:rPr>
+        <w:t xml:space="preserve"> </w:t>
+      </w:r>
+    </w:p>
+    <w:p>
+      <w:pPr>
+        <w:ind w:left="720"/>
       </w:pPr>
       <w:r>
         <w:rPr>
           <w:rFonts w:ascii="Courier New" w:eastAsia="Courier New" w:hAnsi="Courier New" w:cs="Courier New"/>
           <w:sz w:val="20"/>
           <w:szCs w:val="20"/>
-          <w:lang w:val="es-CO"/>
-        </w:rPr>
-        <w:t xml:space="preserve">    @property</w:t>
-      </w:r>
-    </w:p>
-    <w:p>
-      <w:pPr>
-        <w:ind w:left="720"/>
-        <w:rPr>
-          <w:lang w:val="es-CO"/>
-        </w:rPr>
+        </w:rPr>
+        <w:t>class CanalSMS(CanalNotificacionFactory):</w:t>
+      </w:r>
+    </w:p>
+    <w:p>
+      <w:pPr>
+        <w:ind w:left="720"/>
       </w:pPr>
       <w:r>
         <w:rPr>
           <w:rFonts w:ascii="Courier New" w:eastAsia="Courier New" w:hAnsi="Courier New" w:cs="Courier New"/>
           <w:sz w:val="20"/>
           <w:szCs w:val="20"/>
-          <w:lang w:val="es-CO"/>
-        </w:rPr>
-        <w:t xml:space="preserve">    def canal(self) -&gt; str:</w:t>
-      </w:r>
-    </w:p>
-    <w:p>
-      <w:pPr>
-        <w:ind w:left="720"/>
-        <w:rPr>
-          <w:lang w:val="es-CO"/>
-        </w:rPr>
+        </w:rPr>
+        <w:t xml:space="preserve">    @property</w:t>
+      </w:r>
+    </w:p>
+    <w:p>
+      <w:pPr>
+        <w:ind w:left="720"/>
       </w:pPr>
       <w:r>
         <w:rPr>
           <w:rFonts w:ascii="Courier New" w:eastAsia="Courier New" w:hAnsi="Courier New" w:cs="Courier New"/>
           <w:sz w:val="20"/>
           <w:szCs w:val="20"/>
-          <w:lang w:val="es-CO"/>
-        </w:rPr>
-        <w:t xml:space="preserve">        return "sms"</w:t>
+        </w:rPr>
+        <w:t xml:space="preserve">    def canal(self) -&gt; str:</w:t>
+      </w:r>
+    </w:p>
+    <w:p>
+      <w:pPr>
+        <w:ind w:left="720"/>
+        <w:rPr>
+          <w:lang w:val="es-CO"/>
+        </w:rPr>
+      </w:pPr>
+      <w:r>
+        <w:rPr>
+          <w:rFonts w:ascii="Courier New" w:eastAsia="Courier New" w:hAnsi="Courier New" w:cs="Courier New"/>
+          <w:sz w:val="20"/>
+          <w:szCs w:val="20"/>
+        </w:rPr>
+        <w:t xml:space="preserve">        </w:t>
+      </w:r>
+      <w:r>
+        <w:rPr>
+          <w:rFonts w:ascii="Courier New" w:eastAsia="Courier New" w:hAnsi="Courier New" w:cs="Courier New"/>
+          <w:sz w:val="20"/>
+          <w:szCs w:val="20"/>
+          <w:lang w:val="es-CO"/>
+        </w:rPr>
+        <w:t>return "sms"</w:t>
       </w:r>
     </w:p>
     <w:p>
@@ -7218,13 +7512,7 @@
           <w:lang w:val="es-CO"/>
         </w:rPr>
         <w:lastRenderedPageBreak/>
-        <w:t>El patrón Abstract Factory resulta pertinente para este proyecto porque, según lo planteado en la Contextualización del Proyecto, la plataforma debe mantener informados a productores y consumidores sobre la actividad del mercado en tiempo real y sobre el estado de sus dispositivos. Esa comunicación es transversal a varias funcionalidades —subastas, monitoreo IoT y reportes— y multiplataforma por naturaleza, ya que los usuarios interactúan desde distintos dispositivos y prefieren distintos medios. Agrupar lo</w:t>
-      </w:r>
-      <w:r>
-        <w:rPr>
-          <w:lang w:val="es-CO"/>
-        </w:rPr>
-        <w:t>s notificadores por canal en una fábrica evita que la lógica de negocio conozca los detalles de cada medio y permite que la plataforma evolucione hacia nuevos canales sin arriesgar la coherencia de los mensajes existentes, en línea con el principio abierto/cerrado.</w:t>
+        <w:t>El patrón Abstract Factory resulta pertinente para este proyecto porque, según lo planteado en la Contextualización del Proyecto, la plataforma debe mantener informados a productores y consumidores sobre la actividad del mercado en tiempo real y sobre el estado de sus dispositivos. Esa comunicación es transversal a varias funcionalidades —subastas, monitoreo IoT y reportes— y multiplataforma por naturaleza, ya que los usuarios interactúan desde distintos dispositivos y prefieren distintos medios. Agrupar los notificadores por canal en una fábrica evita que la lógica de negocio conozca los detalles de cada medio y permite que la plataforma evolucione hacia nuevos canales sin arriesgar la coherencia de los mensajes existentes, en línea con el principio abierto/cerrado.</w:t>
       </w:r>
     </w:p>
     <w:p>
@@ -7269,13 +7557,7 @@
         <w:rPr>
           <w:lang w:val="es-CO"/>
         </w:rPr>
-        <w:t xml:space="preserve">el patrón Abstract Factory sí sirve para el proyecto porque el requisito no es enviar un solo tipo de aviso, sino tres avisos distintos (transacción, alerta </w:t>
-      </w:r>
-      <w:r>
-        <w:rPr>
-          <w:lang w:val="es-CO"/>
-        </w:rPr>
-        <w:t>IoT, reporte) que deben mantenerse coherentes entre sí según el canal elegido por el usuario. Ese es justamente el caso de uso para el que existe este patrón: familias completas de productos relacionados que deben usarse juntas. Gracias a él, es imposible que la plataforma arme, por accidente, un SMS con asunto o una notificación push sin su payload.</w:t>
+        <w:t>el patrón Abstract Factory sí sirve para el proyecto porque el requisito no es enviar un solo tipo de aviso, sino tres avisos distintos (transacción, alerta IoT, reporte) que deben mantenerse coherentes entre sí según el canal elegido por el usuario. Ese es justamente el caso de uso para el que existe este patrón: familias completas de productos relacionados que deben usarse juntas. Gracias a él, es imposible que la plataforma arme, por accidente, un SMS con asunto o una notificación push sin su payload.</w:t>
       </w:r>
     </w:p>
     <w:p>
@@ -7298,13 +7580,7 @@
         <w:rPr>
           <w:lang w:val="es-CO"/>
         </w:rPr>
-        <w:t xml:space="preserve">el patrón también trae un costo conocido en la literatura: agregar una familia nueva (un canal, por ejemplo WhatsApp) es barato, pero agregar un producto nuevo a la familia (por ejemplo, un cuarto tipo de aviso además de transacción/alerta/reporte) obliga a tocar las tres fábricas concretas existentes (CanalEmail, CanalSMS, CanalPush) para que cada una implemente el método nuevo. Si el proyecto proyecta agregar canales con frecuencia, el patrón encaja perfecto; si en cambio lo que va a crecer seguido es el </w:t>
-      </w:r>
-      <w:r>
-        <w:rPr>
-          <w:lang w:val="es-CO"/>
-        </w:rPr>
-        <w:t>número de tipos de aviso (no de canales), esa es la parte que más mantenimiento va a pedir.</w:t>
+        <w:t>el patrón también trae un costo conocido en la literatura: agregar una familia nueva (un canal, por ejemplo WhatsApp) es barato, pero agregar un producto nuevo a la familia (por ejemplo, un cuarto tipo de aviso además de transacción/alerta/reporte) obliga a tocar las tres fábricas concretas existentes (CanalEmail, CanalSMS, CanalPush) para que cada una implemente el método nuevo. Si el proyecto proyecta agregar canales con frecuencia, el patrón encaja perfecto; si en cambio lo que va a crecer seguido es el número de tipos de aviso (no de canales), esa es la parte que más mantenimiento va a pedir.</w:t>
       </w:r>
     </w:p>
     <w:p>
@@ -7365,13 +7641,7 @@
         <w:rPr>
           <w:lang w:val="es-CO"/>
         </w:rPr>
-        <w:t xml:space="preserve">La validación del patrón Abstract Factory se realizó mediante pruebas unitarias automatizadas con pytest, que verifican que el código cliente nunca instancia notificadores concretos, que cada fábrica de canal construye la familia completa (transacción, alerta IoT y reporte) y que todos los mensajes de un mismo servicio salen por el mismo canal respetando sus restricciones de formato. Como se observa en la </w:t>
-      </w:r>
-      <w:r>
-        <w:rPr>
-          <w:lang w:val="es-CO"/>
-        </w:rPr>
-        <w:t>Figura 9, la suite Patrones/Semana 4/test_abstract_factory.py ejecutó 27 casos, todos superados, y el conjunto completo de pruebas del proyecto —Singleton, Factory Method y Abstract Factory— pasa sin errores.</w:t>
+        <w:t>La validación del patrón Abstract Factory se realizó mediante pruebas unitarias automatizadas con pytest, que verifican que el código cliente nunca instancia notificadores concretos, que cada fábrica de canal construye la familia completa (transacción, alerta IoT y reporte) y que todos los mensajes de un mismo servicio salen por el mismo canal respetando sus restricciones de formato. Como se observa en la Figura 9, la suite Patrones/Semana 4/test_abstract_factory.py ejecutó 27 casos, todos superados, y el conjunto completo de pruebas del proyecto —Singleton, Factory Method y Abstract Factory— pasa sin errores.</w:t>
       </w:r>
     </w:p>
     <w:p>
@@ -7422,7 +7692,7 @@
           <w:noProof/>
         </w:rPr>
         <w:drawing>
-          <wp:anchor distT="0" distB="0" distL="114300" distR="114300" simplePos="0" relativeHeight="251658240" behindDoc="0" locked="0" layoutInCell="1" allowOverlap="1" wp14:anchorId="73810800" wp14:editId="7706887B">
+          <wp:anchor distT="0" distB="0" distL="114300" distR="114300" simplePos="0" relativeHeight="251658240" behindDoc="0" locked="0" layoutInCell="1" allowOverlap="1" wp14:anchorId="73810800" wp14:editId="32563686">
             <wp:simplePos x="0" y="0"/>
             <wp:positionH relativeFrom="column">
               <wp:posOffset>0</wp:posOffset>
@@ -7602,13 +7872,7 @@
         <w:rPr>
           <w:lang w:val="es-CO"/>
         </w:rPr>
-        <w:t xml:space="preserve">Además de las pruebas unitarias, el funcionamiento del patrón se validó de manera funcional a través de la API y de la interfaz. La Figura 10 muestra la documentación </w:t>
-      </w:r>
-      <w:r>
-        <w:rPr>
-          <w:lang w:val="es-CO"/>
-        </w:rPr>
-        <w:t>interactiva (Swagger) de FastAPI con los endpoints de notificaciones —GET /notificaciones, GET /notificaciones/canales, PUT /usuarios/me/canal y POST /reportes/generar—, que internamente invocan crear_servicio(canal) para construir la familia de avisos del usuario.</w:t>
+        <w:t>Además de las pruebas unitarias, el funcionamiento del patrón se validó de manera funcional a través de la API y de la interfaz. La Figura 10 muestra la documentación interactiva (Swagger) de FastAPI con los endpoints de notificaciones —GET /notificaciones, GET /notificaciones/canales, PUT /usuarios/me/canal y POST /reportes/generar—, que internamente invocan crear_servicio(canal) para construir la familia de avisos del usuario.</w:t>
       </w:r>
     </w:p>
     <w:p>
@@ -7663,7 +7927,7 @@
           <w:lang w:val="es-CO"/>
         </w:rPr>
         <w:drawing>
-          <wp:anchor distT="0" distB="0" distL="114300" distR="114300" simplePos="0" relativeHeight="251662336" behindDoc="0" locked="0" layoutInCell="1" allowOverlap="1" wp14:anchorId="01FE50A0" wp14:editId="71FFA269">
+          <wp:anchor distT="0" distB="0" distL="114300" distR="114300" simplePos="0" relativeHeight="251662336" behindDoc="0" locked="0" layoutInCell="1" allowOverlap="1" wp14:anchorId="01FE50A0" wp14:editId="189F4CE9">
             <wp:simplePos x="0" y="0"/>
             <wp:positionH relativeFrom="column">
               <wp:posOffset>0</wp:posOffset>
@@ -7758,13 +8022,7 @@
         <w:rPr>
           <w:lang w:val="es-CO"/>
         </w:rPr>
-        <w:t>Por su parte, la Figura 11 evidencia el uso del patrón desde la interfaz de usuario: en la pestaña Notificaciones, un mismo evento —el cierre de una operación en la subasta— se presenta a cada usuario con el formato de su canal (un SMS breve sin asunto para quien eligió ese medio y una notificación push con payload para quien optó por la aplicación móvil). Es la fábrica de canal seleccionada según canal_notificacion la que determina, en tiempo de ejecución, qué familia de notificadores construye los mensaje</w:t>
-      </w:r>
-      <w:r>
-        <w:rPr>
-          <w:lang w:val="es-CO"/>
-        </w:rPr>
-        <w:t>s.</w:t>
+        <w:t>Por su parte, la Figura 11 evidencia el uso del patrón desde la interfaz de usuario: en la pestaña Notificaciones, un mismo evento —el cierre de una operación en la subasta— se presenta a cada usuario con el formato de su canal (un SMS breve sin asunto para quien eligió ese medio y una notificación push con payload para quien optó por la aplicación móvil). Es la fábrica de canal seleccionada según canal_notificacion la que determina, en tiempo de ejecución, qué familia de notificadores construye los mensajes.</w:t>
       </w:r>
     </w:p>
     <w:p>
@@ -8069,13 +8327,7 @@
         <w:rPr>
           <w:lang w:val="es-CO"/>
         </w:rPr>
-        <w:t>El reporte energético no es un objeto simple. Por un lado, tiene muchas partes opcionales: el resumen ejecutivo solo lleva el balance y el número de operaciones; el reporte completo añade el desglose por dispositivo y la predicción; el reporte pensado para adjuntar a una factura lleva el historial de operaciones y el balance, pero no la predicción. Por otro lado, debe existir en varias representaciones: el canal de notificación (patrón Abstract Factory) necesita un diccionario plano con unas claves concreta</w:t>
-      </w:r>
-      <w:r>
-        <w:rPr>
-          <w:lang w:val="es-CO"/>
-        </w:rPr>
-        <w:t>s; el panel web necesita un objeto con secciones tipadas; un correo o un archivo de texto necesitan una cadena ya formateada.</w:t>
+        <w:t>El reporte energético no es un objeto simple. Por un lado, tiene muchas partes opcionales: el resumen ejecutivo solo lleva el balance y el número de operaciones; el reporte completo añade el desglose por dispositivo y la predicción; el reporte pensado para adjuntar a una factura lleva el historial de operaciones y el balance, pero no la predicción. Por otro lado, debe existir en varias representaciones: el canal de notificación (patrón Abstract Factory) necesita un diccionario plano con unas claves concretas; el panel web necesita un objeto con secciones tipadas; un correo o un archivo de texto necesitan una cadena ya formateada.</w:t>
       </w:r>
     </w:p>
     <w:p>
@@ -8181,16 +8433,12 @@
     <w:p>
       <w:pPr>
         <w:ind w:left="720"/>
-        <w:rPr>
-          <w:lang w:val="es-CO"/>
-        </w:rPr>
       </w:pPr>
       <w:r>
         <w:rPr>
           <w:rFonts w:ascii="Courier New" w:eastAsia="Courier New" w:hAnsi="Courier New" w:cs="Courier New"/>
           <w:sz w:val="20"/>
           <w:szCs w:val="20"/>
-          <w:lang w:val="es-CO"/>
         </w:rPr>
         <w:t>if formato == "dict":</w:t>
       </w:r>
@@ -8198,16 +8446,12 @@
     <w:p>
       <w:pPr>
         <w:ind w:left="720"/>
-        <w:rPr>
-          <w:lang w:val="es-CO"/>
-        </w:rPr>
       </w:pPr>
       <w:r>
         <w:rPr>
           <w:rFonts w:ascii="Courier New" w:eastAsia="Courier New" w:hAnsi="Courier New" w:cs="Courier New"/>
           <w:sz w:val="20"/>
           <w:szCs w:val="20"/>
-          <w:lang w:val="es-CO"/>
         </w:rPr>
         <w:t xml:space="preserve">    return {"usuario": ..., "balance_kwh": ...}</w:t>
       </w:r>
@@ -8215,16 +8459,12 @@
     <w:p>
       <w:pPr>
         <w:ind w:left="720"/>
-        <w:rPr>
-          <w:lang w:val="es-CO"/>
-        </w:rPr>
       </w:pPr>
       <w:r>
         <w:rPr>
           <w:rFonts w:ascii="Courier New" w:eastAsia="Courier New" w:hAnsi="Courier New" w:cs="Courier New"/>
           <w:sz w:val="20"/>
           <w:szCs w:val="20"/>
-          <w:lang w:val="es-CO"/>
         </w:rPr>
         <w:t>elif formato == "texto":</w:t>
       </w:r>
@@ -8232,16 +8472,12 @@
     <w:p>
       <w:pPr>
         <w:ind w:left="720"/>
-        <w:rPr>
-          <w:lang w:val="es-CO"/>
-        </w:rPr>
       </w:pPr>
       <w:r>
         <w:rPr>
           <w:rFonts w:ascii="Courier New" w:eastAsia="Courier New" w:hAnsi="Courier New" w:cs="Courier New"/>
           <w:sz w:val="20"/>
           <w:szCs w:val="20"/>
-          <w:lang w:val="es-CO"/>
         </w:rPr>
         <w:t xml:space="preserve">    return "\n".join(lineas)</w:t>
       </w:r>
@@ -8315,13 +8551,7 @@
           <w:lang w:val="es-CO"/>
         </w:rPr>
         <w:lastRenderedPageBreak/>
-        <w:t xml:space="preserve">prediccion_consumo()— y un método </w:t>
-      </w:r>
-      <w:r>
-        <w:rPr>
-          <w:lang w:val="es-CO"/>
-        </w:rPr>
-        <w:t>obtener_reporte() que entrega el producto terminado. Cada paso devuelve el propio builder, de modo que se pueden encadenar.</w:t>
+        <w:t>prediccion_consumo()— y un método obtener_reporte() que entrega el producto terminado. Cada paso devuelve el propio builder, de modo que se pueden encadenar.</w:t>
       </w:r>
     </w:p>
     <w:p>
@@ -9094,13 +9324,7 @@
           <w:lang w:val="es-CO"/>
         </w:rPr>
         <w:lastRenderedPageBreak/>
-        <w:t xml:space="preserve">o un correo—, cada uno con su propio formato, y su contenido varía según el propósito. Construirlo paso a paso con un builder mantiene la lógica de qué </w:t>
-      </w:r>
-      <w:r>
-        <w:rPr>
-          <w:lang w:val="es-CO"/>
-        </w:rPr>
-        <w:t>información incluir separada de la de cómo presentarla, y permite añadir nuevos formatos de salida sin arriesgar los existentes, en línea con el principio abierto/cerrado.</w:t>
+        <w:t>o un correo—, cada uno con su propio formato, y su contenido varía según el propósito. Construirlo paso a paso con un builder mantiene la lógica de qué información incluir separada de la de cómo presentarla, y permite añadir nuevos formatos de salida sin arriesgar los existentes, en línea con el principio abierto/cerrado.</w:t>
       </w:r>
     </w:p>
     <w:p>
@@ -9145,13 +9369,7 @@
         <w:rPr>
           <w:lang w:val="es-CO"/>
         </w:rPr>
-        <w:t>el patrón Builder sí sirve para el proyecto porque el reporte energético cumple las dos condiciones que justifican este patrón: tiene secciones opcionales que varían según la receta (ejecutivo, completo, para factura) y debe salir en representaciones distintas según quién lo consuma (un diccionario para el canal de notificación, un objeto con secciones para el panel web, texto plano para un correo o un archivo). Separar quién decide los datos, quién decide la receta y quién decide el formato de salida evita</w:t>
-      </w:r>
-      <w:r>
-        <w:rPr>
-          <w:lang w:val="es-CO"/>
-        </w:rPr>
-        <w:t xml:space="preserve"> condicionales dispersos y mantiene extensible cada eje por separado.</w:t>
+        <w:t>el patrón Builder sí sirve para el proyecto porque el reporte energético cumple las dos condiciones que justifican este patrón: tiene secciones opcionales que varían según la receta (ejecutivo, completo, para factura) y debe salir en representaciones distintas según quién lo consuma (un diccionario para el canal de notificación, un objeto con secciones para el panel web, texto plano para un correo o un archivo). Separar quién decide los datos, quién decide la receta y quién decide el formato de salida evita condicionales dispersos y mantiene extensible cada eje por separado.</w:t>
       </w:r>
     </w:p>
     <w:p>
@@ -9174,13 +9392,7 @@
         <w:rPr>
           <w:lang w:val="es-CO"/>
         </w:rPr>
-        <w:t>si el reporte fuera a existir siempre en un único formato y con una única receta fija, el Builder sería una capa de abstracción innecesaria: bastaría una función que arme ese único objeto directamente. Ese no es el caso aquí porque el proyecto ya necesita al menos tres formatos distintos y tres recetas distintas de fábrica, y todo apunta a que ese número siga creciendo (por ejemplo, un futuro formato Markdown</w:t>
-      </w:r>
-      <w:r>
-        <w:rPr>
-          <w:lang w:val="es-CO"/>
-        </w:rPr>
-        <w:t xml:space="preserve"> o PDF), que es justamente lo que la prueba automatizada del proyecto demuestra al agregar un ReporteMarkdownBuilder sin tocar el resto del código.</w:t>
+        <w:t>si el reporte fuera a existir siempre en un único formato y con una única receta fija, el Builder sería una capa de abstracción innecesaria: bastaría una función que arme ese único objeto directamente. Ese no es el caso aquí porque el proyecto ya necesita al menos tres formatos distintos y tres recetas distintas de fábrica, y todo apunta a que ese número siga creciendo (por ejemplo, un futuro formato Markdown o PDF), que es justamente lo que la prueba automatizada del proyecto demuestra al agregar un ReporteMarkdownBuilder sin tocar el resto del código.</w:t>
       </w:r>
     </w:p>
     <w:p>
@@ -9217,13 +9429,7 @@
         <w:rPr>
           <w:lang w:val="es-CO"/>
         </w:rPr>
-        <w:t xml:space="preserve">La validación del patrón Builder se realizó mediante pruebas unitarias automatizadas con pytest, que verifican que el builder abstracto no se puede instanciar, que el director ejecuta la misma secuencia de pasos con cualquier builder, que cada builder concreto devuelve su propia representación, que reiniciar aísla reportes consecutivos y que el </w:t>
-      </w:r>
-      <w:r>
-        <w:rPr>
-          <w:lang w:val="es-CO"/>
-        </w:rPr>
-        <w:t xml:space="preserve">diccionario del formato resumen </w:t>
+        <w:t xml:space="preserve">La validación del patrón Builder se realizó mediante pruebas unitarias automatizadas con pytest, que verifican que el builder abstracto no se puede instanciar, que el director ejecuta la misma secuencia de pasos con cualquier builder, que cada builder concreto devuelve su propia representación, que reiniciar aísla reportes consecutivos y que el diccionario del formato resumen </w:t>
       </w:r>
       <w:r>
         <w:rPr>
@@ -9282,6 +9488,7 @@
         <w:spacing w:before="120"/>
         <w:rPr>
           <w:noProof/>
+          <w:lang w:val="es-CO"/>
         </w:rPr>
       </w:pPr>
       <w:r>
@@ -9289,7 +9496,7 @@
           <w:noProof/>
         </w:rPr>
         <w:drawing>
-          <wp:anchor distT="0" distB="0" distL="114300" distR="114300" simplePos="0" relativeHeight="251659264" behindDoc="0" locked="0" layoutInCell="1" allowOverlap="1" wp14:anchorId="6B006350" wp14:editId="4F4054BC">
+          <wp:anchor distT="0" distB="0" distL="114300" distR="114300" simplePos="0" relativeHeight="251659264" behindDoc="0" locked="0" layoutInCell="1" allowOverlap="1" wp14:anchorId="6B006350" wp14:editId="7D434447">
             <wp:simplePos x="0" y="0"/>
             <wp:positionH relativeFrom="column">
               <wp:posOffset>-72068</wp:posOffset>
@@ -9351,6 +9558,7 @@
         <w:spacing w:before="120"/>
         <w:rPr>
           <w:noProof/>
+          <w:lang w:val="es-CO"/>
         </w:rPr>
       </w:pPr>
     </w:p>
@@ -9359,6 +9567,7 @@
         <w:spacing w:before="120"/>
         <w:rPr>
           <w:noProof/>
+          <w:lang w:val="es-CO"/>
         </w:rPr>
       </w:pPr>
     </w:p>
@@ -9367,6 +9576,7 @@
         <w:spacing w:before="120"/>
         <w:rPr>
           <w:noProof/>
+          <w:lang w:val="es-CO"/>
         </w:rPr>
       </w:pPr>
     </w:p>
@@ -9515,7 +9725,7 @@
           <w:lang w:val="es-CO"/>
         </w:rPr>
         <w:drawing>
-          <wp:anchor distT="0" distB="0" distL="114300" distR="114300" simplePos="0" relativeHeight="251660288" behindDoc="0" locked="0" layoutInCell="1" allowOverlap="1" wp14:anchorId="7F037427" wp14:editId="7F67E16F">
+          <wp:anchor distT="0" distB="0" distL="114300" distR="114300" simplePos="0" relativeHeight="251660288" behindDoc="0" locked="0" layoutInCell="1" allowOverlap="1" wp14:anchorId="7F037427" wp14:editId="4CE4B6BD">
             <wp:simplePos x="0" y="0"/>
             <wp:positionH relativeFrom="column">
               <wp:posOffset>0</wp:posOffset>
@@ -9726,7 +9936,7 @@
         </w:rPr>
         <w:lastRenderedPageBreak/>
         <w:drawing>
-          <wp:anchor distT="0" distB="0" distL="114300" distR="114300" simplePos="0" relativeHeight="251661312" behindDoc="0" locked="0" layoutInCell="1" allowOverlap="1" wp14:anchorId="1CEC624F" wp14:editId="774078D1">
+          <wp:anchor distT="0" distB="0" distL="114300" distR="114300" simplePos="0" relativeHeight="251661312" behindDoc="0" locked="0" layoutInCell="1" allowOverlap="1" wp14:anchorId="1CEC624F" wp14:editId="57B16E63">
             <wp:simplePos x="0" y="0"/>
             <wp:positionH relativeFrom="column">
               <wp:posOffset>0</wp:posOffset>
@@ -9877,13 +10087,88 @@
     </w:p>
     <w:p>
       <w:pPr>
+        <w:spacing w:before="120"/>
+        <w:rPr>
+          <w:lang w:val="es-CO"/>
+        </w:rPr>
+      </w:pPr>
+    </w:p>
+    <w:p>
+      <w:pPr>
+        <w:spacing w:before="120"/>
+        <w:rPr>
+          <w:lang w:val="es-CO"/>
+        </w:rPr>
+      </w:pPr>
+    </w:p>
+    <w:p>
+      <w:pPr>
+        <w:pStyle w:val="Ttulo2"/>
+        <w:spacing w:before="240" w:after="120" w:line="480" w:lineRule="auto"/>
+        <w:rPr>
+          <w:lang w:val="es-CO"/>
+        </w:rPr>
+      </w:pPr>
+      <w:bookmarkStart w:id="57" w:name="bm_prototype"/>
+      <w:r>
+        <w:rPr>
+          <w:b/>
+          <w:bCs/>
+          <w:color w:val="000000"/>
+          <w:sz w:val="24"/>
+          <w:szCs w:val="24"/>
+          <w:lang w:val="es-CO"/>
+        </w:rPr>
+        <w:t xml:space="preserve">Aplicación del Patrón de Diseño </w:t>
+      </w:r>
+      <w:r>
+        <w:rPr>
+          <w:b/>
+          <w:bCs/>
+          <w:color w:val="000000"/>
+          <w:sz w:val="24"/>
+          <w:szCs w:val="24"/>
+          <w:lang w:val="es-CO"/>
+        </w:rPr>
+        <w:t>Prototype</w:t>
+      </w:r>
+      <w:r>
+        <w:rPr>
+          <w:b/>
+          <w:bCs/>
+          <w:color w:val="000000"/>
+          <w:sz w:val="24"/>
+          <w:szCs w:val="24"/>
+          <w:lang w:val="es-CO"/>
+        </w:rPr>
+        <w:t xml:space="preserve"> </w:t>
+      </w:r>
+      <w:bookmarkEnd w:id="57"/>
+    </w:p>
+    <w:p>
+      <w:pPr>
+        <w:ind w:firstLine="720"/>
+        <w:jc w:val="both"/>
+        <w:rPr>
+          <w:lang w:val="es-CO"/>
+        </w:rPr>
+      </w:pPr>
+      <w:r>
+        <w:rPr>
+          <w:lang w:val="es-CO"/>
+        </w:rPr>
+        <w:t xml:space="preserve">El patrón Prototype incorporado a la plataforma resuelve la forma en que se dan de alta dispositivos IoT ya calibrados: en lugar de crear cada dispositivo nuevo desde cero con los umbrales por defecto de su tipo, permite clonar un dispositivo existente —con sus umbrales ya ajustados en campo— y reutilizar esa configuración en altas posteriores. Este módulo forma parte de la lógica de dominio del backend (plataforma.py, método clonar_dispositivo) y se expone en la API FastAPI (main.py) a través del endpoint POST /iot/dispositivos/{id}/clonar; la implementación educativa completa, con la interfaz PrototipoDispositivo y el registro de plantillas RegistroPlantillas, se encuentra en Documentacion/Semana 6/prototype.py.</w:t>
+      </w:r>
+    </w:p>
+    <w:p>
+      <w:pPr>
         <w:pStyle w:val="Ttulo3"/>
         <w:spacing w:before="200" w:after="100" w:line="480" w:lineRule="auto"/>
         <w:rPr>
           <w:lang w:val="es-CO"/>
         </w:rPr>
       </w:pPr>
-      <w:bookmarkStart w:id="55" w:name="bm_factory_conclusion"/>
+      <w:bookmarkStart w:id="58" w:name="bm_prototype_problema"/>
       <w:r>
         <w:rPr>
           <w:b/>
@@ -9893,9 +10178,9 @@
           <w:color w:val="000000"/>
           <w:lang w:val="es-CO"/>
         </w:rPr>
-        <w:t>Conclusión</w:t>
-      </w:r>
-      <w:bookmarkEnd w:id="55"/>
+        <w:t>El Problema que Resuelve</w:t>
+      </w:r>
+      <w:bookmarkEnd w:id="58"/>
     </w:p>
     <w:p>
       <w:pPr>
@@ -9909,19 +10194,885 @@
         <w:rPr>
           <w:lang w:val="es-CO"/>
         </w:rPr>
-        <w:t xml:space="preserve">En resumen, el patrón Singleton garantiza que toda la plataforma comparta un mismo estado consistente, el Factory Method garantiza que cada tipo de dispositivo IoT </w:t>
-      </w:r>
-      <w:r>
-        <w:rPr>
-          <w:lang w:val="es-CO"/>
-        </w:rPr>
-        <w:t>se cree y se comporte correctamente sin acoplar ese conocimiento al resto del sistema, el Abstract Factory garantiza que cada canal de notificación genere la familia completa de avisos con un formato coherente, y el Builder permite construir el reporte energético paso a paso y obtenerlo en distintas representaciones sin duplicar la lógica de negocio. Los cuatro patrones son complementarios: el primero define cuántas instancias de la plataforma existen, el segundo y el tercero definen cómo se crean los objet</w:t>
-      </w:r>
-      <w:r>
-        <w:rPr>
-          <w:lang w:val="es-CO"/>
-        </w:rPr>
-        <w:t>os —individuales o en familia— que la plataforma administra, y el cuarto define cómo se ensambla un objeto complejo a partir de esos datos.</w:t>
+        <w:t xml:space="preserve">El patrón Factory Method (Semana 3) da de alta un dispositivo IoT asignándole los umbrales por defecto de su tipo —panel solar, batería o medidor—, definidos en el diccionario UMBRALES_IOT. Ese comportamiento es correcto para el caso general, pero no para el más frecuente en una instalación real: un técnico calibra un dispositivo en campo —ajusta umbral_min y umbral_max según la orientación del techo, una sombra parcial u otra condición local— y luego necesita dar de alta varios dispositivos idénticos más en la misma instalación, con exactamente esos umbrales ya ajustados, no los de fábrica.</w:t>
+      </w:r>
+    </w:p>
+    <w:p>
+      <w:pPr>
+        <w:ind w:firstLine="720"/>
+        <w:jc w:val="both"/>
+        <w:rPr>
+          <w:lang w:val="es-CO"/>
+        </w:rPr>
+      </w:pPr>
+      <w:r>
+        <w:rPr>
+          <w:lang w:val="es-CO"/>
+        </w:rPr>
+        <w:t xml:space="preserve">Sin este patrón, la única forma de repetir ese ajuste es que el operador vuelva a escribir los mismos valores a mano en cada alta nueva, con el riesgo de transcribirlos mal, o que la fábrica termine acumulando parámetros de calibración que no le corresponden y deje de ser una fábrica «por tipo».</w:t>
+      </w:r>
+    </w:p>
+    <w:p>
+      <w:pPr>
+        <w:pStyle w:val="Ttulo3"/>
+        <w:spacing w:before="200" w:after="100" w:line="480" w:lineRule="auto"/>
+        <w:rPr>
+          <w:lang w:val="es-CO"/>
+        </w:rPr>
+      </w:pPr>
+      <w:bookmarkStart w:id="59" w:name="bm_prototype_solucion"/>
+      <w:r>
+        <w:rPr>
+          <w:b/>
+          <w:bCs/>
+          <w:i/>
+          <w:iCs/>
+          <w:color w:val="000000"/>
+          <w:lang w:val="es-CO"/>
+        </w:rPr>
+        <w:t>Cómo lo Soluciona el Patrón</w:t>
+      </w:r>
+      <w:bookmarkEnd w:id="59"/>
+    </w:p>
+    <w:p>
+      <w:pPr>
+        <w:pStyle w:val="Prrafodelista"/>
+        <w:numPr>
+          <w:ilvl w:val="0"/>
+          <w:numId w:val="2"/>
+        </w:numPr>
+        <w:spacing w:line="480" w:lineRule="auto"/>
+        <w:jc w:val="both"/>
+        <w:rPr>
+          <w:lang w:val="es-CO"/>
+        </w:rPr>
+      </w:pPr>
+      <w:r>
+        <w:rPr>
+          <w:b/>
+          <w:bCs/>
+          <w:lang w:val="es-CO"/>
+        </w:rPr>
+        <w:t xml:space="preserve">Interfaz PrototipoDispositivo. </w:t>
+      </w:r>
+      <w:r>
+        <w:rPr>
+          <w:lang w:val="es-CO"/>
+        </w:rPr>
+        <w:t xml:space="preserve">Declara el método abstracto clonar(nuevo_id, nuevo_usuario_id), de modo que el cliente nunca invoca el constructor de la clase concreta: siempre clona un objeto ya existente.</w:t>
+      </w:r>
+      <w:r>
+        <w:rPr>
+          <w:lang w:val="es-CO"/>
+        </w:rPr>
+        <w:lastRenderedPageBreak/>
+        <w:t>prediccion_consumo()— y un método obtener_reporte() que entrega el producto terminado. Cada paso devuelve el propio builder, de modo que se pueden encadenar.</w:t>
+      </w:r>
+    </w:p>
+    <w:p>
+      <w:pPr>
+        <w:pStyle w:val="Prrafodelista"/>
+        <w:numPr>
+          <w:ilvl w:val="0"/>
+          <w:numId w:val="2"/>
+        </w:numPr>
+        <w:spacing w:line="480" w:lineRule="auto"/>
+        <w:jc w:val="both"/>
+        <w:rPr>
+          <w:lang w:val="es-CO"/>
+        </w:rPr>
+      </w:pPr>
+      <w:r>
+        <w:rPr>
+          <w:b/>
+          <w:bCs/>
+          <w:lang w:val="es-CO"/>
+        </w:rPr>
+        <w:t xml:space="preserve">Producto DispositivoIoT. </w:t>
+      </w:r>
+      <w:r>
+        <w:rPr>
+          <w:lang w:val="es-CO"/>
+        </w:rPr>
+        <w:t xml:space="preserve">Implementa clonar() con copia profunda (copy.deepcopy), no superficial: conserva tipo, umbrales y notas de calibración sin compartir listas mutables por referencia entre el original y el clon, ni entre dos clones del mismo original. Admite además **cambios para ajustar campos puntuales, como un umbral distinto, sin perder el resto de la configuración clonada.</w:t>
+      </w:r>
+      <w:r>
+        <w:rPr>
+          <w:lang w:val="es-CO"/>
+        </w:rPr>
+        <w:lastRenderedPageBreak/>
+        <w:t>prediccion_consumo()— y un método obtener_reporte() que entrega el producto terminado. Cada paso devuelve el propio builder, de modo que se pueden encadenar.</w:t>
+      </w:r>
+    </w:p>
+    <w:p>
+      <w:pPr>
+        <w:pStyle w:val="Prrafodelista"/>
+        <w:numPr>
+          <w:ilvl w:val="0"/>
+          <w:numId w:val="2"/>
+        </w:numPr>
+        <w:spacing w:line="480" w:lineRule="auto"/>
+        <w:jc w:val="both"/>
+        <w:rPr>
+          <w:lang w:val="es-CO"/>
+        </w:rPr>
+      </w:pPr>
+      <w:r>
+        <w:rPr>
+          <w:b/>
+          <w:bCs/>
+          <w:lang w:val="es-CO"/>
+        </w:rPr>
+        <w:t xml:space="preserve">RegistroPlantillas. </w:t>
+      </w:r>
+      <w:r>
+        <w:rPr>
+          <w:lang w:val="es-CO"/>
+        </w:rPr>
+        <w:t xml:space="preserve">Guarda dispositivos ya calibrados con un nombre de catálogo (registrar_plantilla) y los clona bajo demanda (crear_desde_plantilla): el mismo rol que obtener_factory (Factory Method), obtener_canal (Abstract Factory) o crear_builder (Builder), un punto único donde se resuelve «a partir de cuál», con un ValueError y la lista de plantillas disponibles ante un nombre desconocido.</w:t>
+      </w:r>
+      <w:r>
+        <w:rPr>
+          <w:lang w:val="es-CO"/>
+        </w:rPr>
+        <w:lastRenderedPageBreak/>
+        <w:t>prediccion_consumo()— y un método obtener_reporte() que entrega el producto terminado. Cada paso devuelve el propio builder, de modo que se pueden encadenar.</w:t>
+      </w:r>
+    </w:p>
+    <w:p>
+      <w:pPr>
+        <w:pStyle w:val="Prrafodelista"/>
+        <w:numPr>
+          <w:ilvl w:val="0"/>
+          <w:numId w:val="2"/>
+        </w:numPr>
+        <w:spacing w:line="480" w:lineRule="auto"/>
+        <w:jc w:val="both"/>
+        <w:rPr>
+          <w:lang w:val="es-CO"/>
+        </w:rPr>
+      </w:pPr>
+      <w:r>
+        <w:rPr>
+          <w:b/>
+          <w:bCs/>
+          <w:lang w:val="es-CO"/>
+        </w:rPr>
+        <w:t xml:space="preserve">Uso real en la plataforma. </w:t>
+      </w:r>
+      <w:r>
+        <w:rPr>
+          <w:lang w:val="es-CO"/>
+        </w:rPr>
+        <w:t xml:space="preserve">PlataformaEnergia.clonar_dispositivo() aplica la misma idea sobre el dispositivo real de la app: copia profunda del original, nueva identidad y umbrales opcionalmente ajustables, expuesto como POST /iot/dispositivos/{id}/clonar.</w:t>
+      </w:r>
+      <w:r>
+        <w:rPr>
+          <w:lang w:val="es-CO"/>
+        </w:rPr>
+        <w:lastRenderedPageBreak/>
+        <w:t>prediccion_consumo()— y un método obtener_reporte() que entrega el producto terminado. Cada paso devuelve el propio builder, de modo que se pueden encadenar.</w:t>
+      </w:r>
+    </w:p>
+    <w:p>
+      <w:pPr>
+        <w:spacing w:before="200"/>
+        <w:rPr>
+          <w:lang w:val="es-CO"/>
+        </w:rPr>
+      </w:pPr>
+      <w:bookmarkStart w:id="60" w:name="bm_fig20"/>
+      <w:r>
+        <w:rPr>
+          <w:b/>
+          <w:bCs/>
+          <w:lang w:val="es-CO"/>
+        </w:rPr>
+        <w:t>Figura 20</w:t>
+      </w:r>
+      <w:bookmarkEnd w:id="60"/>
+    </w:p>
+    <w:p>
+      <w:pPr>
+        <w:rPr>
+          <w:lang w:val="es-CO"/>
+        </w:rPr>
+      </w:pPr>
+      <w:r>
+        <w:rPr>
+          <w:i/>
+          <w:iCs/>
+          <w:lang w:val="es-CO"/>
+        </w:rPr>
+        <w:t xml:space="preserve">Método clonar() de DispositivoIoT en prototype.py</w:t>
+      </w:r>
+    </w:p>
+    <w:p>
+      <w:pPr>
+        <w:ind w:left="720"/>
+        <w:rPr>
+          <w:lang w:val="es-CO"/>
+        </w:rPr>
+      </w:pPr>
+      <w:r>
+        <w:rPr>
+          <w:rFonts w:ascii="Courier New" w:eastAsia="Courier New" w:hAnsi="Courier New" w:cs="Courier New"/>
+          <w:sz w:val="20"/>
+          <w:szCs w:val="20"/>
+          <w:lang w:val="es-CO"/>
+        </w:rPr>
+        <w:t xml:space="preserve">def clonar(self, nuevo_id, nuevo_usuario_id=None, **cambios):</w:t>
+      </w:r>
+    </w:p>
+    <w:p>
+      <w:pPr>
+        <w:ind w:left="720"/>
+        <w:rPr>
+          <w:lang w:val="es-CO"/>
+        </w:rPr>
+      </w:pPr>
+      <w:r>
+        <w:rPr>
+          <w:rFonts w:ascii="Courier New" w:eastAsia="Courier New" w:hAnsi="Courier New" w:cs="Courier New"/>
+          <w:sz w:val="20"/>
+          <w:szCs w:val="20"/>
+          <w:lang w:val="es-CO"/>
+        </w:rPr>
+        <w:t xml:space="preserve">    copia = copy.deepcopy(self)</w:t>
+      </w:r>
+    </w:p>
+    <w:p>
+      <w:pPr>
+        <w:ind w:left="720"/>
+        <w:rPr>
+          <w:lang w:val="es-CO"/>
+        </w:rPr>
+      </w:pPr>
+      <w:r>
+        <w:rPr>
+          <w:rFonts w:ascii="Courier New" w:eastAsia="Courier New" w:hAnsi="Courier New" w:cs="Courier New"/>
+          <w:sz w:val="20"/>
+          <w:szCs w:val="20"/>
+          <w:lang w:val="es-CO"/>
+        </w:rPr>
+        <w:t xml:space="preserve">    copia.id = nuevo_id</w:t>
+      </w:r>
+    </w:p>
+    <w:p>
+      <w:pPr>
+        <w:ind w:left="720"/>
+        <w:rPr>
+          <w:lang w:val="es-CO"/>
+        </w:rPr>
+      </w:pPr>
+      <w:r>
+        <w:rPr>
+          <w:rFonts w:ascii="Courier New" w:eastAsia="Courier New" w:hAnsi="Courier New" w:cs="Courier New"/>
+          <w:sz w:val="20"/>
+          <w:szCs w:val="20"/>
+          <w:lang w:val="es-CO"/>
+        </w:rPr>
+        <w:t xml:space="preserve">    if nuevo_usuario_id is not None:</w:t>
+      </w:r>
+    </w:p>
+    <w:p>
+      <w:pPr>
+        <w:ind w:left="720"/>
+        <w:rPr>
+          <w:lang w:val="es-CO"/>
+        </w:rPr>
+      </w:pPr>
+      <w:r>
+        <w:rPr>
+          <w:rFonts w:ascii="Courier New" w:eastAsia="Courier New" w:hAnsi="Courier New" w:cs="Courier New"/>
+          <w:sz w:val="20"/>
+          <w:szCs w:val="20"/>
+          <w:lang w:val="es-CO"/>
+        </w:rPr>
+        <w:t xml:space="preserve">        copia.usuario_id = nuevo_usuario_id</w:t>
+      </w:r>
+    </w:p>
+    <w:p>
+      <w:pPr>
+        <w:ind w:left="720"/>
+        <w:rPr>
+          <w:lang w:val="es-CO"/>
+        </w:rPr>
+      </w:pPr>
+      <w:r>
+        <w:rPr>
+          <w:rFonts w:ascii="Courier New" w:eastAsia="Courier New" w:hAnsi="Courier New" w:cs="Courier New"/>
+          <w:sz w:val="20"/>
+          <w:szCs w:val="20"/>
+          <w:lang w:val="es-CO"/>
+        </w:rPr>
+        <w:t xml:space="preserve">    for campo, valor in cambios.items():</w:t>
+      </w:r>
+    </w:p>
+    <w:p>
+      <w:pPr>
+        <w:ind w:left="720"/>
+        <w:rPr>
+          <w:lang w:val="es-CO"/>
+        </w:rPr>
+      </w:pPr>
+      <w:r>
+        <w:rPr>
+          <w:rFonts w:ascii="Courier New" w:eastAsia="Courier New" w:hAnsi="Courier New" w:cs="Courier New"/>
+          <w:sz w:val="20"/>
+          <w:szCs w:val="20"/>
+          <w:lang w:val="es-CO"/>
+        </w:rPr>
+        <w:t xml:space="preserve">        setattr(copia, campo, valor)</w:t>
+      </w:r>
+    </w:p>
+    <w:p>
+      <w:pPr>
+        <w:ind w:left="720"/>
+        <w:rPr>
+          <w:lang w:val="es-CO"/>
+        </w:rPr>
+      </w:pPr>
+      <w:r>
+        <w:rPr>
+          <w:rFonts w:ascii="Courier New" w:eastAsia="Courier New" w:hAnsi="Courier New" w:cs="Courier New"/>
+          <w:sz w:val="20"/>
+          <w:szCs w:val="20"/>
+          <w:lang w:val="es-CO"/>
+        </w:rPr>
+        <w:t xml:space="preserve">    return copia</w:t>
+      </w:r>
+    </w:p>
+    <w:p>
+      <w:pPr>
+        <w:spacing w:before="120"/>
+        <w:rPr>
+          <w:lang w:val="es-CO"/>
+        </w:rPr>
+      </w:pPr>
+      <w:r>
+        <w:rPr>
+          <w:i/>
+          <w:iCs/>
+          <w:lang w:val="es-CO"/>
+        </w:rPr>
+        <w:t xml:space="preserve">Nota. </w:t>
+      </w:r>
+      <w:r>
+        <w:rPr>
+          <w:lang w:val="es-CO"/>
+        </w:rPr>
+        <w:t xml:space="preserve">Extracto de Documentacion/Semana 6/prototype.py. La copia profunda (deepcopy) evita que dos dispositivos clonados compartan por referencia la lista notas_calibracion; **cambios permite sobrescribir un campo puntual, como un umbral, sin perder el resto de la configuración clonada.</w:t>
+      </w:r>
+    </w:p>
+    <w:p>
+      <w:pPr>
+        <w:pStyle w:val="Ttulo3"/>
+        <w:spacing w:before="200" w:after="100" w:line="480" w:lineRule="auto"/>
+        <w:rPr>
+          <w:lang w:val="es-CO"/>
+        </w:rPr>
+      </w:pPr>
+      <w:bookmarkStart w:id="61" w:name="bm_prototype_gana"/>
+      <w:r>
+        <w:rPr>
+          <w:b/>
+          <w:bCs/>
+          <w:i/>
+          <w:iCs/>
+          <w:color w:val="000000"/>
+          <w:lang w:val="es-CO"/>
+        </w:rPr>
+        <w:t>Qué Gana la Plataforma con Esto</w:t>
+      </w:r>
+      <w:bookmarkEnd w:id="61"/>
+    </w:p>
+    <w:p>
+      <w:pPr>
+        <w:ind w:firstLine="720"/>
+        <w:jc w:val="both"/>
+        <w:rPr>
+          <w:lang w:val="es-CO"/>
+        </w:rPr>
+      </w:pPr>
+      <w:r>
+        <w:rPr>
+          <w:b/>
+          <w:bCs/>
+          <w:lang w:val="es-CO"/>
+        </w:rPr>
+        <w:t xml:space="preserve">No repetir configuración fina. </w:t>
+      </w:r>
+      <w:r>
+        <w:rPr>
+          <w:lang w:val="es-CO"/>
+        </w:rPr>
+        <w:t xml:space="preserve">Un ajuste de calibración hecho una vez se reutiliza en todas las altas siguientes, sin volver a escribir los umbrales a mano en cada dispositivo nuevo.</w:t>
+      </w:r>
+    </w:p>
+    <w:p>
+      <w:pPr>
+        <w:ind w:firstLine="720"/>
+        <w:jc w:val="both"/>
+        <w:rPr>
+          <w:lang w:val="es-CO"/>
+        </w:rPr>
+      </w:pPr>
+      <w:r>
+        <w:rPr>
+          <w:b/>
+          <w:bCs/>
+          <w:lang w:val="es-CO"/>
+        </w:rPr>
+        <w:t xml:space="preserve">Copia profunda por contrato. </w:t>
+      </w:r>
+      <w:r>
+        <w:rPr>
+          <w:lang w:val="es-CO"/>
+        </w:rPr>
+        <w:t xml:space="preserve">El propio patrón obliga a decidir explícitamente la semántica de copia —superficial o profunda— para el estado mutable del dispositivo, evitando un bug sutil (dos «copias» que en realidad comparten la misma lista de notas) que sería fácil pasar por alto si cada módulo clonara «a mano» con una asignación directa.</w:t>
+      </w:r>
+    </w:p>
+    <w:p>
+      <w:pPr>
+        <w:ind w:firstLine="720"/>
+        <w:jc w:val="both"/>
+        <w:rPr>
+          <w:lang w:val="es-CO"/>
+        </w:rPr>
+      </w:pPr>
+      <w:r>
+        <w:rPr>
+          <w:b/>
+          <w:bCs/>
+          <w:lang w:val="es-CO"/>
+        </w:rPr>
+        <w:t xml:space="preserve">Desacopla cómo se creó de a partir de qué. </w:t>
+      </w:r>
+      <w:r>
+        <w:rPr>
+          <w:lang w:val="es-CO"/>
+        </w:rPr>
+        <w:t xml:space="preserve">El cliente clona sin conocer la clase concreta del original, igual que las fábricas del proyecto crean sin que el cliente conozca la clase concreta del producto.</w:t>
+      </w:r>
+    </w:p>
+    <w:p>
+      <w:pPr>
+        <w:ind w:firstLine="720"/>
+        <w:jc w:val="both"/>
+        <w:rPr>
+          <w:lang w:val="es-CO"/>
+        </w:rPr>
+      </w:pPr>
+      <w:r>
+        <w:rPr>
+          <w:b/>
+          <w:bCs/>
+          <w:lang w:val="es-CO"/>
+        </w:rPr>
+        <w:t xml:space="preserve">Relación con las demás fábricas del proyecto. </w:t>
+      </w:r>
+      <w:r>
+        <w:rPr>
+          <w:lang w:val="es-CO"/>
+        </w:rPr>
+        <w:t xml:space="preserve">El Factory Method y el Abstract Factory crean objetos desde una descripción estática (un tipo, un canal); el Prototype crea objetos a partir de una instancia ya configurada en tiempo de ejecución, incluyendo ajustes que nadie escribió en el código. Son complementarios: la fábrica sigue siendo el punto de entrada para el primer dispositivo de un tipo; el Prototype entra cuando ya existe uno calibrado y hay que repetirlo.</w:t>
+      </w:r>
+    </w:p>
+    <w:p>
+      <w:pPr>
+        <w:pStyle w:val="Ttulo3"/>
+        <w:spacing w:before="200" w:after="100" w:line="480" w:lineRule="auto"/>
+        <w:rPr>
+          <w:lang w:val="es-CO"/>
+        </w:rPr>
+      </w:pPr>
+      <w:bookmarkStart w:id="62" w:name="bm_prototype_justificacion"/>
+      <w:r>
+        <w:rPr>
+          <w:b/>
+          <w:bCs/>
+          <w:i/>
+          <w:iCs/>
+          <w:color w:val="000000"/>
+          <w:lang w:val="es-CO"/>
+        </w:rPr>
+        <w:t>Justificación de su Uso en el Proyecto</w:t>
+      </w:r>
+      <w:bookmarkEnd w:id="62"/>
+    </w:p>
+    <w:p>
+      <w:pPr>
+        <w:ind w:firstLine="720"/>
+        <w:jc w:val="both"/>
+        <w:rPr>
+          <w:lang w:val="es-CO"/>
+        </w:rPr>
+      </w:pPr>
+      <w:r>
+        <w:rPr>
+          <w:lang w:val="es-CO"/>
+        </w:rPr>
+        <w:t xml:space="preserve">El patrón Prototype resulta pertinente para este proyecto porque, según lo planteado en la Contextualización del Proyecto, la plataforma debe facilitar la integración con dispositivos IoT domésticos, y en una instalación real rara vez se conecta un único dispositivo aislado: lo habitual es dar de alta varios equipos del mismo tipo, con la misma calibración, en una misma vivienda o instalación comercial. Clonar un dispositivo ya calibrado mantiene esa configuración separada de la lógica de creación por tipo del Factory Method, y permite repetirla sin arriesgar los umbrales por defecto que la fábrica sigue ofreciendo para el primer dispositivo de cada tipo.</w:t>
+      </w:r>
+    </w:p>
+    <w:p>
+      <w:pPr>
+        <w:pStyle w:val="Ttulo3"/>
+        <w:spacing w:before="200" w:after="100" w:line="480" w:lineRule="auto"/>
+        <w:rPr>
+          <w:lang w:val="es-CO"/>
+        </w:rPr>
+      </w:pPr>
+      <w:bookmarkStart w:id="63" w:name="bm_prototype_evaluacion"/>
+      <w:r>
+        <w:rPr>
+          <w:b/>
+          <w:bCs/>
+          <w:i/>
+          <w:iCs/>
+          <w:color w:val="000000"/>
+          <w:lang w:val="es-CO"/>
+        </w:rPr>
+        <w:t>Evaluación: ¿Sirve este patrón para el proyecto?</w:t>
+      </w:r>
+      <w:bookmarkEnd w:id="63"/>
+    </w:p>
+    <w:p>
+      <w:pPr>
+        <w:ind w:firstLine="720"/>
+        <w:jc w:val="both"/>
+        <w:rPr>
+          <w:lang w:val="es-CO"/>
+        </w:rPr>
+      </w:pPr>
+      <w:r>
+        <w:rPr>
+          <w:b/>
+          <w:bCs/>
+          <w:lang w:val="es-CO"/>
+        </w:rPr>
+        <w:t xml:space="preserve">Veredicto: sí sirve. </w:t>
+      </w:r>
+      <w:r>
+        <w:rPr>
+          <w:lang w:val="es-CO"/>
+        </w:rPr>
+        <w:t xml:space="preserve">El patrón Prototype sí sirve para el proyecto porque resuelve un caso de uso real y frecuente del dominio —instalaciones con varios dispositivos IoT idénticos— sin requerir infraestructura nueva ni modificar el Factory Method existente: se integró como un método adicional (clonar_dispositivo) y un endpoint nuevo, y los 91 casos de los cuatro patrones anteriores siguen pasando sin cambios.</w:t>
+      </w:r>
+    </w:p>
+    <w:p>
+      <w:pPr>
+        <w:ind w:firstLine="720"/>
+        <w:jc w:val="both"/>
+        <w:rPr>
+          <w:lang w:val="es-CO"/>
+        </w:rPr>
+      </w:pPr>
+      <w:r>
+        <w:rPr>
+          <w:lang w:val="es-CO"/>
+        </w:rPr>
+        <w:t xml:space="preserve">Matiz a tener en cuenta: no todas las entidades de la plataforma se benefician igual de este patrón. Orden y Usuario no se prestan a clonarse, porque su variabilidad está en campos que cambian en cada instancia (usuario, cantidad, precio) más que en configuración repetida; ahí basta con el constructor normal. El patrón se justifica específicamente donde existe estado de configuración calibrado a mano que conviene preservar exactamente igual entre varias instancias, que es el caso de los umbrales de los dispositivos IoT.</w:t>
+      </w:r>
+    </w:p>
+    <w:p>
+      <w:pPr>
+        <w:pStyle w:val="Ttulo3"/>
+        <w:spacing w:before="200" w:after="100" w:line="480" w:lineRule="auto"/>
+        <w:rPr>
+          <w:lang w:val="es-CO"/>
+        </w:rPr>
+      </w:pPr>
+      <w:bookmarkStart w:id="64" w:name="bm_prototype_validacion"/>
+      <w:r>
+        <w:rPr>
+          <w:b/>
+          <w:bCs/>
+          <w:i/>
+          <w:iCs/>
+          <w:color w:val="000000"/>
+          <w:lang w:val="es-CO"/>
+        </w:rPr>
+        <w:t>Validación del Patrón</w:t>
+      </w:r>
+      <w:bookmarkEnd w:id="64"/>
+    </w:p>
+    <w:p>
+      <w:pPr>
+        <w:ind w:firstLine="720"/>
+        <w:jc w:val="both"/>
+        <w:rPr>
+          <w:lang w:val="es-CO"/>
+        </w:rPr>
+      </w:pPr>
+      <w:r>
+        <w:rPr>
+          <w:lang w:val="es-CO"/>
+        </w:rPr>
+        <w:t xml:space="preserve">La validación del patrón Prototype se realizó mediante pruebas unitarias automatizadas con pytest, que verifican que clonar produce un objeto distinto del original, que la copia es profunda —el clon no comparte listas mutables con el original ni con otros clones—, que los overrides puntuales no alteran el original, y que el RegistroPlantillas resuelve plantillas por nombre con el mismo contrato que las demás fábricas del proyecto. Como se observa en la Figura 21, la suite Documentacion/Semana 6/test_prototype.py ejecutó 24 casos, todos superados, y el conjunto completo de pruebas del proyecto —Singleton, Factory Method, Abstract Factory, Builder y Prototype— pasa sin errores (115 casos en total).</w:t>
+      </w:r>
+    </w:p>
+    <w:p>
+      <w:pPr>
+        <w:spacing w:before="200"/>
+        <w:rPr>
+          <w:lang w:val="es-CO"/>
+        </w:rPr>
+      </w:pPr>
+      <w:bookmarkStart w:id="65" w:name="bm_fig21"/>
+      <w:r>
+        <w:rPr>
+          <w:b/>
+          <w:bCs/>
+          <w:lang w:val="es-CO"/>
+        </w:rPr>
+        <w:t>Figura 21</w:t>
+      </w:r>
+      <w:bookmarkEnd w:id="65"/>
+    </w:p>
+    <w:p>
+      <w:pPr>
+        <w:rPr>
+          <w:lang w:val="es-CO"/>
+        </w:rPr>
+      </w:pPr>
+      <w:r>
+        <w:rPr>
+          <w:i/>
+          <w:iCs/>
+          <w:lang w:val="es-CO"/>
+        </w:rPr>
+        <w:t xml:space="preserve">Resultados de la ejecución de las pruebas unitarias del patrón Prototype</w:t>
+      </w:r>
+    </w:p>
+    <w:p>
+      <w:pPr>
+        <w:spacing w:before="120"/>
+        <w:rPr>
+          <w:lang w:val="es-CO"/>
+        </w:rPr>
+      </w:pPr>
+      <w:r>
+        <w:rPr>
+          <w:lang w:val="es-CO"/>
+        </w:rPr>
+        <w:lastRenderedPageBreak/>
+        <w:drawing>
+          <wp:inline distT="0" distB="0" distL="0" distR="0" wp14:anchorId="0D2BA4B2" wp14:editId="4079D387">
+            <wp:extent cx="5433060" cy="3155354"/>
+            <wp:effectExtent l="0" t="0" r="0" b="6985"/>
+            <wp:docPr id="915045009" name="Imagen 1"/>
+            <wp:cNvGraphicFramePr>
+              <a:graphicFrameLocks xmlns:a="http://schemas.openxmlformats.org/drawingml/2006/main" noChangeAspect="1"/>
+            </wp:cNvGraphicFramePr>
+            <a:graphic xmlns:a="http://schemas.openxmlformats.org/drawingml/2006/main">
+              <a:graphicData uri="http://schemas.openxmlformats.org/drawingml/2006/picture">
+                <pic:pic xmlns:pic="http://schemas.openxmlformats.org/drawingml/2006/picture">
+                  <pic:nvPicPr>
+                    <pic:cNvPr id="915045009" name=""/>
+                    <pic:cNvPicPr/>
+                  </pic:nvPicPr>
+                  <pic:blipFill>
+                    <a:blip r:embed="rId24"/>
+                    <a:stretch>
+                      <a:fillRect/>
+                    </a:stretch>
+                  </pic:blipFill>
+                  <pic:spPr>
+                    <a:xfrm>
+                      <a:off x="0" y="0"/>
+                      <a:ext cx="5440059" cy="3159419"/>
+                    </a:xfrm>
+                    <a:prstGeom prst="rect">
+                      <a:avLst/>
+                    </a:prstGeom>
+                  </pic:spPr>
+                </pic:pic>
+              </a:graphicData>
+            </a:graphic>
+          </wp:inline>
+        </w:drawing>
+      </w:r>
+    </w:p>
+    <w:p>
+      <w:pPr>
+        <w:spacing w:before="120"/>
+        <w:rPr>
+          <w:lang w:val="es-CO"/>
+        </w:rPr>
+      </w:pPr>
+      <w:r>
+        <w:rPr>
+          <w:i/>
+          <w:iCs/>
+          <w:lang w:val="es-CO"/>
+        </w:rPr>
+        <w:t xml:space="preserve">Nota. </w:t>
+      </w:r>
+      <w:r>
+        <w:rPr>
+          <w:lang w:val="es-CO"/>
+        </w:rPr>
+        <w:t xml:space="preserve">Salida de consola de la ejecución de pytest sobre Documentacion/Semana 6/test_prototype.py, mostrando la recolección y aprobación de los 24 casos (24 passed), agrupados por comportamiento: identidad del clon, configuración preservada, copia profunda, override al clonar y registro de plantillas.</w:t>
+      </w:r>
+    </w:p>
+    <w:p>
+      <w:pPr>
+        <w:ind w:firstLine="720"/>
+        <w:jc w:val="both"/>
+        <w:rPr>
+          <w:lang w:val="es-CO"/>
+        </w:rPr>
+      </w:pPr>
+      <w:r>
+        <w:rPr>
+          <w:lang w:val="es-CO"/>
+        </w:rPr>
+        <w:t xml:space="preserve">Además de las pruebas unitarias, el funcionamiento del patrón se validó de manera funcional desde la interfaz. La Figura 22 muestra la pestaña IoT &amp; Predicción de la plataforma Voltia, con la tabla Dispositivos conectados —que expone los umbrales de cada uno— y la tarjeta Clonar dispositivo calibrado, donde se elige el dispositivo de origen, se asigna un id nuevo y, opcionalmente, se ajusta un umbral puntual antes de clonar.</w:t>
+      </w:r>
+    </w:p>
+    <w:p>
+      <w:pPr>
+        <w:spacing w:before="200"/>
+        <w:rPr>
+          <w:lang w:val="es-CO"/>
+        </w:rPr>
+      </w:pPr>
+      <w:bookmarkStart w:id="66" w:name="bm_fig22"/>
+      <w:r>
+        <w:rPr>
+          <w:b/>
+          <w:bCs/>
+          <w:lang w:val="es-CO"/>
+        </w:rPr>
+        <w:t>Figura 22</w:t>
+      </w:r>
+      <w:bookmarkEnd w:id="66"/>
+    </w:p>
+    <w:p>
+      <w:pPr>
+        <w:rPr>
+          <w:lang w:val="es-CO"/>
+        </w:rPr>
+      </w:pPr>
+      <w:r>
+        <w:rPr>
+          <w:i/>
+          <w:iCs/>
+          <w:lang w:val="es-CO"/>
+        </w:rPr>
+        <w:t xml:space="preserve">Interfaz de la plataforma para clonar un dispositivo IoT ya calibrado</w:t>
+      </w:r>
+    </w:p>
+    <w:p>
+      <w:pPr>
+        <w:spacing w:before="120"/>
+        <w:rPr>
+          <w:lang w:val="es-CO"/>
+        </w:rPr>
+      </w:pPr>
+      <w:r>
+        <w:rPr>
+          <w:lang w:val="es-CO"/>
+        </w:rPr>
+        <w:lastRenderedPageBreak/>
+        <w:drawing>
+          <wp:inline distT="0" distB="0" distL="0" distR="0" wp14:anchorId="1151411E" wp14:editId="115E2509">
+            <wp:extent cx="5943600" cy="3559175"/>
+            <wp:effectExtent l="0" t="0" r="0" b="3175"/>
+            <wp:docPr id="205493360" name="Imagen 1"/>
+            <wp:cNvGraphicFramePr>
+              <a:graphicFrameLocks xmlns:a="http://schemas.openxmlformats.org/drawingml/2006/main" noChangeAspect="1"/>
+            </wp:cNvGraphicFramePr>
+            <a:graphic xmlns:a="http://schemas.openxmlformats.org/drawingml/2006/main">
+              <a:graphicData uri="http://schemas.openxmlformats.org/drawingml/2006/picture">
+                <pic:pic xmlns:pic="http://schemas.openxmlformats.org/drawingml/2006/picture">
+                  <pic:nvPicPr>
+                    <pic:cNvPr id="205493360" name=""/>
+                    <pic:cNvPicPr/>
+                  </pic:nvPicPr>
+                  <pic:blipFill>
+                    <a:blip r:embed="rId26"/>
+                    <a:stretch>
+                      <a:fillRect/>
+                    </a:stretch>
+                  </pic:blipFill>
+                  <pic:spPr>
+                    <a:xfrm>
+                      <a:off x="0" y="0"/>
+                      <a:ext cx="5943600" cy="3559175"/>
+                    </a:xfrm>
+                    <a:prstGeom prst="rect">
+                      <a:avLst/>
+                    </a:prstGeom>
+                  </pic:spPr>
+                </pic:pic>
+              </a:graphicData>
+            </a:graphic>
+          </wp:inline>
+        </w:drawing>
+      </w:r>
+    </w:p>
+    <w:p>
+      <w:pPr>
+        <w:spacing w:before="120"/>
+        <w:rPr>
+          <w:lang w:val="es-CO"/>
+        </w:rPr>
+      </w:pPr>
+      <w:r>
+        <w:rPr>
+          <w:i/>
+          <w:iCs/>
+          <w:lang w:val="es-CO"/>
+        </w:rPr>
+        <w:t xml:space="preserve">Nota. </w:t>
+      </w:r>
+      <w:r>
+        <w:rPr>
+          <w:lang w:val="es-CO"/>
+        </w:rPr>
+        <w:t xml:space="preserve">Vista de la pestaña IoT &amp; Predicción de la plataforma Voltia, mostrando la tabla Dispositivos conectados y la tarjeta Clonar dispositivo calibrado (patrón Prototype), con el selector del dispositivo de origen y los campos opcionales de umbral.</w:t>
+      </w:r>
+    </w:p>
+    <w:p/>
+    <w:p>
+      <w:pPr>
+        <w:pStyle w:val="Ttulo3"/>
+        <w:spacing w:before="200" w:after="100" w:line="480" w:lineRule="auto"/>
+        <w:rPr>
+          <w:lang w:val="es-CO"/>
+        </w:rPr>
+      </w:pPr>
+      <w:bookmarkStart w:id="55" w:name="bm_factory_conclusion"/>
+      <w:r>
+        <w:rPr>
+          <w:b/>
+          <w:bCs/>
+          <w:i/>
+          <w:iCs/>
+          <w:color w:val="000000"/>
+          <w:lang w:val="es-CO"/>
+        </w:rPr>
+        <w:t>Conclusión</w:t>
+      </w:r>
+      <w:bookmarkEnd w:id="55"/>
+    </w:p>
+    <w:p>
+      <w:pPr>
+        <w:ind w:firstLine="720"/>
+        <w:jc w:val="both"/>
+        <w:rPr>
+          <w:lang w:val="es-CO"/>
+        </w:rPr>
+      </w:pPr>
+      <w:r>
+        <w:rPr>
+          <w:lang w:val="es-CO"/>
+        </w:rPr>
+        <w:lastRenderedPageBreak/>
+        <w:t>En resumen, el patrón Singleton garantiza que toda la plataforma comparta un mismo estado consistente, el Factory Method garantiza que cada tipo de dispositivo IoT se cree y se comporte correctamente sin acoplar ese conocimiento al resto del sistema, el Abstract Factory garantiza que cada canal de notificación genere la familia completa de avisos con un formato coherente, el Builder permite construir el reporte energético paso a paso y obtenerlo en distintas representaciones sin duplicar la lógica de negocio, y el Prototype permite clonar un dispositivo IoT ya calibrado para repetir esa configuración en altas posteriores sin volver a escribirla a mano. Los cinco patrones son complementarios: el primero define cuántas instancias de la plataforma existen; el segundo y el tercero definen cómo se crean los objetos —individuales o en familia— que la plataforma administra; el cuarto define cómo se ensambla un objeto complejo a partir de esos datos; y el quinto define cómo se reutiliza un objeto ya configurado para crear otros similares sin repetir su configuración.</w:t>
       </w:r>
     </w:p>
     <w:p>
@@ -10001,9 +11152,6 @@
         </w:rPr>
       </w:pPr>
       <w:r>
-        <w:rPr>
-          <w:lang w:val="es-CO"/>
-        </w:rPr>
         <w:t xml:space="preserve">Refactoring.Guru. (s.f.). </w:t>
       </w:r>
       <w:r>
@@ -10029,28 +11177,27 @@
         </w:rPr>
       </w:pPr>
       <w:r>
-        <w:rPr>
-          <w:lang w:val="es-CO"/>
-        </w:rPr>
         <w:t xml:space="preserve">Refactoring.Guru. (s.f.). </w:t>
       </w:r>
       <w:r>
         <w:rPr>
           <w:i/>
           <w:iCs/>
-          <w:lang w:val="es-CO"/>
         </w:rPr>
         <w:t>Builder.</w:t>
       </w:r>
       <w:r>
-        <w:rPr>
-          <w:lang w:val="es-CO"/>
-        </w:rPr>
-        <w:t xml:space="preserve"> Recuperado en 2026, de https://refactoring.guru/es/design-patterns/builder</w:t>
+        <w:t xml:space="preserve"> </w:t>
+      </w:r>
+      <w:r>
+        <w:rPr>
+          <w:lang w:val="es-CO"/>
+        </w:rPr>
+        <w:t>Recuperado en 2026, de https://refactoring.guru/es/design-patterns/builder</w:t>
       </w:r>
     </w:p>
     <w:sectPr>
-      <w:headerReference w:type="default" r:id="rId24"/>
+      <w:headerReference w:type="default" r:id="rId27"/>
       <w:pgSz w:w="12240" w:h="15840"/>
       <w:pgMar w:top="1440" w:right="1440" w:bottom="1440" w:left="1440" w:header="708" w:footer="708" w:gutter="0"/>
       <w:cols w:space="720"/>
@@ -10061,7 +11208,7 @@
 </file>
 
 <file path=word/endnotes.xml><?xml version="1.0" encoding="utf-8"?>
-<w:endnotes xmlns:wpc="http://schemas.microsoft.com/office/word/2010/wordprocessingCanvas" xmlns:cx="http://schemas.microsoft.com/office/drawing/2014/chartex" xmlns:cx1="http://schemas.microsoft.com/office/drawing/2015/9/8/chartex" xmlns:cx2="http://schemas.microsoft.com/office/drawing/2015/10/21/chartex" xmlns:cx3="http://schemas.microsoft.com/office/drawing/2016/5/9/chartex" xmlns:cx4="http://schemas.microsoft.com/office/drawing/2016/5/10/chartex" xmlns:cx5="http://schemas.microsoft.com/office/drawing/2016/5/11/chartex" xmlns:cx6="http://schemas.microsoft.com/office/drawing/2016/5/12/chartex" xmlns:cx7="http://schemas.microsoft.com/office/drawing/2016/5/13/chartex" xmlns:cx8="http://schemas.microsoft.com/office/drawing/2016/5/14/chartex" xmlns:mc="http://schemas.openxmlformats.org/markup-compatibility/2006" xmlns:m="http://schemas.openxmlformats.org/officeDocument/2006/math" xmlns:aink="http://schemas.microsoft.com/office/drawing/2016/ink" xmlns:am3d="http://schemas.microsoft.com/office/drawing/2017/model3d" xmlns:oel="http://schemas.microsoft.com/office/2019/extlst" xmlns:r="http://schemas.openxmlformats.org/officeDocument/2006/relationships" xmlns:wp14="http://schemas.microsoft.com/office/word/2010/wordprocessingDrawing" xmlns:wp="http://schemas.openxmlformats.org/drawingml/2006/wordprocessingDrawing" xmlns:wpg="http://schemas.microsoft.com/office/word/2010/wordprocessingGroup" xmlns:wpi="http://schemas.microsoft.com/office/word/2010/wordprocessingInk" xmlns:wps="http://schemas.microsoft.com/office/word/2010/wordprocessingShape" xmlns:o="urn:schemas-microsoft-com:office:office" xmlns:v="urn:schemas-microsoft-com:vml" xmlns:w10="urn:schemas-microsoft-com:office:word" xmlns:w="http://schemas.openxmlformats.org/wordprocessingml/2006/main" xmlns:w14="http://schemas.microsoft.com/office/word/2010/wordml" xmlns:w15="http://schemas.microsoft.com/office/word/2012/wordml" xmlns:w16cex="http://schemas.microsoft.com/office/word/2018/wordml/cex" xmlns:w16cid="http://schemas.microsoft.com/office/word/2016/wordml/cid" xmlns:w16="http://schemas.microsoft.com/office/word/2018/wordml" xmlns:w16sdtdh="http://schemas.microsoft.com/office/word/2020/wordml/sdtdatahash" xmlns:w16sdtfl="http://schemas.microsoft.com/office/word/2024/wordml/sdtformatlock" xmlns:w16se="http://schemas.microsoft.com/office/word/2015/wordml/symex" xmlns:w16du="http://schemas.microsoft.com/office/word/2023/wordml/word16du" xmlns:wne="http://schemas.microsoft.com/office/word/2006/wordml" mc:Ignorable="w14 w15 w16se w16cid w16 w16cex w16sdtdh w16sdtfl w16du wp14">
+<w:endnotes xmlns:wpc="http://schemas.microsoft.com/office/word/2010/wordprocessingCanvas" xmlns:cx="http://schemas.microsoft.com/office/drawing/2014/chartex" xmlns:cx1="http://schemas.microsoft.com/office/drawing/2015/9/8/chartex" xmlns:cx2="http://schemas.microsoft.com/office/drawing/2015/10/21/chartex" xmlns:cx3="http://schemas.microsoft.com/office/drawing/2016/5/9/chartex" xmlns:cx4="http://schemas.microsoft.com/office/drawing/2016/5/10/chartex" xmlns:cx5="http://schemas.microsoft.com/office/drawing/2016/5/11/chartex" xmlns:cx6="http://schemas.microsoft.com/office/drawing/2016/5/12/chartex" xmlns:cx7="http://schemas.microsoft.com/office/drawing/2016/5/13/chartex" xmlns:cx8="http://schemas.microsoft.com/office/drawing/2016/5/14/chartex" xmlns:mc="http://schemas.openxmlformats.org/markup-compatibility/2006" xmlns:aink="http://schemas.microsoft.com/office/drawing/2016/ink" xmlns:am3d="http://schemas.microsoft.com/office/drawing/2017/model3d" xmlns:o="urn:schemas-microsoft-com:office:office" xmlns:oel="http://schemas.microsoft.com/office/2019/extlst" xmlns:r="http://schemas.openxmlformats.org/officeDocument/2006/relationships" xmlns:m="http://schemas.openxmlformats.org/officeDocument/2006/math" xmlns:v="urn:schemas-microsoft-com:vml" xmlns:wp14="http://schemas.microsoft.com/office/word/2010/wordprocessingDrawing" xmlns:wp="http://schemas.openxmlformats.org/drawingml/2006/wordprocessingDrawing" xmlns:w10="urn:schemas-microsoft-com:office:word" xmlns:w="http://schemas.openxmlformats.org/wordprocessingml/2006/main" xmlns:w14="http://schemas.microsoft.com/office/word/2010/wordml" xmlns:w15="http://schemas.microsoft.com/office/word/2012/wordml" xmlns:w16cex="http://schemas.microsoft.com/office/word/2018/wordml/cex" xmlns:w16cid="http://schemas.microsoft.com/office/word/2016/wordml/cid" xmlns:w16="http://schemas.microsoft.com/office/word/2018/wordml" xmlns:w16du="http://schemas.microsoft.com/office/word/2023/wordml/word16du" xmlns:w16sdtdh="http://schemas.microsoft.com/office/word/2020/wordml/sdtdatahash" xmlns:w16sdtfl="http://schemas.microsoft.com/office/word/2024/wordml/sdtformatlock" xmlns:w16se="http://schemas.microsoft.com/office/word/2015/wordml/symex" xmlns:wpg="http://schemas.microsoft.com/office/word/2010/wordprocessingGroup" xmlns:wpi="http://schemas.microsoft.com/office/word/2010/wordprocessingInk" xmlns:wne="http://schemas.microsoft.com/office/word/2006/wordml" xmlns:wps="http://schemas.microsoft.com/office/word/2010/wordprocessingShape" mc:Ignorable="w14 w15 w16se w16cid w16 w16cex w16sdtdh w16sdtfl w16du wp14">
   <w:endnote w:type="separator" w:id="-1">
     <w:p>
       <w:r>
@@ -10080,7 +11227,7 @@
 </file>
 
 <file path=word/footnotes.xml><?xml version="1.0" encoding="utf-8"?>
-<w:footnotes xmlns:wpc="http://schemas.microsoft.com/office/word/2010/wordprocessingCanvas" xmlns:cx="http://schemas.microsoft.com/office/drawing/2014/chartex" xmlns:cx1="http://schemas.microsoft.com/office/drawing/2015/9/8/chartex" xmlns:cx2="http://schemas.microsoft.com/office/drawing/2015/10/21/chartex" xmlns:cx3="http://schemas.microsoft.com/office/drawing/2016/5/9/chartex" xmlns:cx4="http://schemas.microsoft.com/office/drawing/2016/5/10/chartex" xmlns:cx5="http://schemas.microsoft.com/office/drawing/2016/5/11/chartex" xmlns:cx6="http://schemas.microsoft.com/office/drawing/2016/5/12/chartex" xmlns:cx7="http://schemas.microsoft.com/office/drawing/2016/5/13/chartex" xmlns:cx8="http://schemas.microsoft.com/office/drawing/2016/5/14/chartex" xmlns:mc="http://schemas.openxmlformats.org/markup-compatibility/2006" xmlns:m="http://schemas.openxmlformats.org/officeDocument/2006/math" xmlns:aink="http://schemas.microsoft.com/office/drawing/2016/ink" xmlns:am3d="http://schemas.microsoft.com/office/drawing/2017/model3d" xmlns:oel="http://schemas.microsoft.com/office/2019/extlst" xmlns:r="http://schemas.openxmlformats.org/officeDocument/2006/relationships" xmlns:wp14="http://schemas.microsoft.com/office/word/2010/wordprocessingDrawing" xmlns:wp="http://schemas.openxmlformats.org/drawingml/2006/wordprocessingDrawing" xmlns:wpg="http://schemas.microsoft.com/office/word/2010/wordprocessingGroup" xmlns:wpi="http://schemas.microsoft.com/office/word/2010/wordprocessingInk" xmlns:wps="http://schemas.microsoft.com/office/word/2010/wordprocessingShape" xmlns:o="urn:schemas-microsoft-com:office:office" xmlns:v="urn:schemas-microsoft-com:vml" xmlns:w10="urn:schemas-microsoft-com:office:word" xmlns:w="http://schemas.openxmlformats.org/wordprocessingml/2006/main" xmlns:w14="http://schemas.microsoft.com/office/word/2010/wordml" xmlns:w15="http://schemas.microsoft.com/office/word/2012/wordml" xmlns:w16cex="http://schemas.microsoft.com/office/word/2018/wordml/cex" xmlns:w16cid="http://schemas.microsoft.com/office/word/2016/wordml/cid" xmlns:w16="http://schemas.microsoft.com/office/word/2018/wordml" xmlns:w16sdtdh="http://schemas.microsoft.com/office/word/2020/wordml/sdtdatahash" xmlns:w16sdtfl="http://schemas.microsoft.com/office/word/2024/wordml/sdtformatlock" xmlns:w16se="http://schemas.microsoft.com/office/word/2015/wordml/symex" xmlns:w16du="http://schemas.microsoft.com/office/word/2023/wordml/word16du" xmlns:wne="http://schemas.microsoft.com/office/word/2006/wordml" mc:Ignorable="w14 w15 w16se w16cid w16 w16cex w16sdtdh w16sdtfl w16du wp14">
+<w:footnotes xmlns:wpc="http://schemas.microsoft.com/office/word/2010/wordprocessingCanvas" xmlns:cx="http://schemas.microsoft.com/office/drawing/2014/chartex" xmlns:cx1="http://schemas.microsoft.com/office/drawing/2015/9/8/chartex" xmlns:cx2="http://schemas.microsoft.com/office/drawing/2015/10/21/chartex" xmlns:cx3="http://schemas.microsoft.com/office/drawing/2016/5/9/chartex" xmlns:cx4="http://schemas.microsoft.com/office/drawing/2016/5/10/chartex" xmlns:cx5="http://schemas.microsoft.com/office/drawing/2016/5/11/chartex" xmlns:cx6="http://schemas.microsoft.com/office/drawing/2016/5/12/chartex" xmlns:cx7="http://schemas.microsoft.com/office/drawing/2016/5/13/chartex" xmlns:cx8="http://schemas.microsoft.com/office/drawing/2016/5/14/chartex" xmlns:mc="http://schemas.openxmlformats.org/markup-compatibility/2006" xmlns:aink="http://schemas.microsoft.com/office/drawing/2016/ink" xmlns:am3d="http://schemas.microsoft.com/office/drawing/2017/model3d" xmlns:o="urn:schemas-microsoft-com:office:office" xmlns:oel="http://schemas.microsoft.com/office/2019/extlst" xmlns:r="http://schemas.openxmlformats.org/officeDocument/2006/relationships" xmlns:m="http://schemas.openxmlformats.org/officeDocument/2006/math" xmlns:v="urn:schemas-microsoft-com:vml" xmlns:wp14="http://schemas.microsoft.com/office/word/2010/wordprocessingDrawing" xmlns:wp="http://schemas.openxmlformats.org/drawingml/2006/wordprocessingDrawing" xmlns:w10="urn:schemas-microsoft-com:office:word" xmlns:w="http://schemas.openxmlformats.org/wordprocessingml/2006/main" xmlns:w14="http://schemas.microsoft.com/office/word/2010/wordml" xmlns:w15="http://schemas.microsoft.com/office/word/2012/wordml" xmlns:w16cex="http://schemas.microsoft.com/office/word/2018/wordml/cex" xmlns:w16cid="http://schemas.microsoft.com/office/word/2016/wordml/cid" xmlns:w16="http://schemas.microsoft.com/office/word/2018/wordml" xmlns:w16du="http://schemas.microsoft.com/office/word/2023/wordml/word16du" xmlns:w16sdtdh="http://schemas.microsoft.com/office/word/2020/wordml/sdtdatahash" xmlns:w16sdtfl="http://schemas.microsoft.com/office/word/2024/wordml/sdtformatlock" xmlns:w16se="http://schemas.microsoft.com/office/word/2015/wordml/symex" xmlns:wpg="http://schemas.microsoft.com/office/word/2010/wordprocessingGroup" xmlns:wpi="http://schemas.microsoft.com/office/word/2010/wordprocessingInk" xmlns:wne="http://schemas.microsoft.com/office/word/2006/wordml" xmlns:wps="http://schemas.microsoft.com/office/word/2010/wordprocessingShape" mc:Ignorable="w14 w15 w16se w16cid w16 w16cex w16sdtdh w16sdtfl w16du wp14">
   <w:footnote w:type="separator" w:id="-1">
     <w:p>
       <w:r>
@@ -10099,7 +11246,7 @@
 </file>
 
 <file path=word/header1.xml><?xml version="1.0" encoding="utf-8"?>
-<w:hdr xmlns:wpc="http://schemas.microsoft.com/office/word/2010/wordprocessingCanvas" xmlns:cx="http://schemas.microsoft.com/office/drawing/2014/chartex" xmlns:cx1="http://schemas.microsoft.com/office/drawing/2015/9/8/chartex" xmlns:cx2="http://schemas.microsoft.com/office/drawing/2015/10/21/chartex" xmlns:cx3="http://schemas.microsoft.com/office/drawing/2016/5/9/chartex" xmlns:cx4="http://schemas.microsoft.com/office/drawing/2016/5/10/chartex" xmlns:cx5="http://schemas.microsoft.com/office/drawing/2016/5/11/chartex" xmlns:cx6="http://schemas.microsoft.com/office/drawing/2016/5/12/chartex" xmlns:cx7="http://schemas.microsoft.com/office/drawing/2016/5/13/chartex" xmlns:cx8="http://schemas.microsoft.com/office/drawing/2016/5/14/chartex" xmlns:mc="http://schemas.openxmlformats.org/markup-compatibility/2006" xmlns:m="http://schemas.openxmlformats.org/officeDocument/2006/math" xmlns:aink="http://schemas.microsoft.com/office/drawing/2016/ink" xmlns:am3d="http://schemas.microsoft.com/office/drawing/2017/model3d" xmlns:oel="http://schemas.microsoft.com/office/2019/extlst" xmlns:r="http://schemas.openxmlformats.org/officeDocument/2006/relationships" xmlns:wp14="http://schemas.microsoft.com/office/word/2010/wordprocessingDrawing" xmlns:wp="http://schemas.openxmlformats.org/drawingml/2006/wordprocessingDrawing" xmlns:wpg="http://schemas.microsoft.com/office/word/2010/wordprocessingGroup" xmlns:wpi="http://schemas.microsoft.com/office/word/2010/wordprocessingInk" xmlns:wps="http://schemas.microsoft.com/office/word/2010/wordprocessingShape" xmlns:o="urn:schemas-microsoft-com:office:office" xmlns:v="urn:schemas-microsoft-com:vml" xmlns:w10="urn:schemas-microsoft-com:office:word" xmlns:w="http://schemas.openxmlformats.org/wordprocessingml/2006/main" xmlns:w14="http://schemas.microsoft.com/office/word/2010/wordml" xmlns:w15="http://schemas.microsoft.com/office/word/2012/wordml" xmlns:w16cex="http://schemas.microsoft.com/office/word/2018/wordml/cex" xmlns:w16cid="http://schemas.microsoft.com/office/word/2016/wordml/cid" xmlns:w16="http://schemas.microsoft.com/office/word/2018/wordml" xmlns:w16sdtdh="http://schemas.microsoft.com/office/word/2020/wordml/sdtdatahash" xmlns:w16sdtfl="http://schemas.microsoft.com/office/word/2024/wordml/sdtformatlock" xmlns:w16se="http://schemas.microsoft.com/office/word/2015/wordml/symex" xmlns:w16du="http://schemas.microsoft.com/office/word/2023/wordml/word16du" xmlns:wne="http://schemas.microsoft.com/office/word/2006/wordml" mc:Ignorable="w14 w15 w16se w16cid w16 w16cex w16sdtdh w16sdtfl w16du wp14">
+<w:hdr xmlns:wpc="http://schemas.microsoft.com/office/word/2010/wordprocessingCanvas" xmlns:cx="http://schemas.microsoft.com/office/drawing/2014/chartex" xmlns:cx1="http://schemas.microsoft.com/office/drawing/2015/9/8/chartex" xmlns:cx2="http://schemas.microsoft.com/office/drawing/2015/10/21/chartex" xmlns:cx3="http://schemas.microsoft.com/office/drawing/2016/5/9/chartex" xmlns:cx4="http://schemas.microsoft.com/office/drawing/2016/5/10/chartex" xmlns:cx5="http://schemas.microsoft.com/office/drawing/2016/5/11/chartex" xmlns:cx6="http://schemas.microsoft.com/office/drawing/2016/5/12/chartex" xmlns:cx7="http://schemas.microsoft.com/office/drawing/2016/5/13/chartex" xmlns:cx8="http://schemas.microsoft.com/office/drawing/2016/5/14/chartex" xmlns:mc="http://schemas.openxmlformats.org/markup-compatibility/2006" xmlns:aink="http://schemas.microsoft.com/office/drawing/2016/ink" xmlns:am3d="http://schemas.microsoft.com/office/drawing/2017/model3d" xmlns:o="urn:schemas-microsoft-com:office:office" xmlns:oel="http://schemas.microsoft.com/office/2019/extlst" xmlns:r="http://schemas.openxmlformats.org/officeDocument/2006/relationships" xmlns:m="http://schemas.openxmlformats.org/officeDocument/2006/math" xmlns:v="urn:schemas-microsoft-com:vml" xmlns:wp14="http://schemas.microsoft.com/office/word/2010/wordprocessingDrawing" xmlns:wp="http://schemas.openxmlformats.org/drawingml/2006/wordprocessingDrawing" xmlns:w10="urn:schemas-microsoft-com:office:word" xmlns:w="http://schemas.openxmlformats.org/wordprocessingml/2006/main" xmlns:w14="http://schemas.microsoft.com/office/word/2010/wordml" xmlns:w15="http://schemas.microsoft.com/office/word/2012/wordml" xmlns:w16cex="http://schemas.microsoft.com/office/word/2018/wordml/cex" xmlns:w16cid="http://schemas.microsoft.com/office/word/2016/wordml/cid" xmlns:w16="http://schemas.microsoft.com/office/word/2018/wordml" xmlns:w16du="http://schemas.microsoft.com/office/word/2023/wordml/word16du" xmlns:w16sdtdh="http://schemas.microsoft.com/office/word/2020/wordml/sdtdatahash" xmlns:w16sdtfl="http://schemas.microsoft.com/office/word/2024/wordml/sdtformatlock" xmlns:w16se="http://schemas.microsoft.com/office/word/2015/wordml/symex" xmlns:wpg="http://schemas.microsoft.com/office/word/2010/wordprocessingGroup" xmlns:wpi="http://schemas.microsoft.com/office/word/2010/wordprocessingInk" xmlns:wne="http://schemas.microsoft.com/office/word/2006/wordml" xmlns:wps="http://schemas.microsoft.com/office/word/2010/wordprocessingShape" mc:Ignorable="w14 w15 w16se w16cid w16 w16cex w16sdtdh w16sdtfl w16du wp14">
   <w:p>
     <w:pPr>
       <w:jc w:val="right"/>
@@ -10127,7 +11274,7 @@
 </file>
 
 <file path=word/numbering.xml><?xml version="1.0" encoding="utf-8"?>
-<w:numbering xmlns:wpc="http://schemas.microsoft.com/office/word/2010/wordprocessingCanvas" xmlns:cx="http://schemas.microsoft.com/office/drawing/2014/chartex" xmlns:cx1="http://schemas.microsoft.com/office/drawing/2015/9/8/chartex" xmlns:cx2="http://schemas.microsoft.com/office/drawing/2015/10/21/chartex" xmlns:cx3="http://schemas.microsoft.com/office/drawing/2016/5/9/chartex" xmlns:cx4="http://schemas.microsoft.com/office/drawing/2016/5/10/chartex" xmlns:cx5="http://schemas.microsoft.com/office/drawing/2016/5/11/chartex" xmlns:cx6="http://schemas.microsoft.com/office/drawing/2016/5/12/chartex" xmlns:cx7="http://schemas.microsoft.com/office/drawing/2016/5/13/chartex" xmlns:cx8="http://schemas.microsoft.com/office/drawing/2016/5/14/chartex" xmlns:mc="http://schemas.openxmlformats.org/markup-compatibility/2006" xmlns:m="http://schemas.openxmlformats.org/officeDocument/2006/math" xmlns:aink="http://schemas.microsoft.com/office/drawing/2016/ink" xmlns:am3d="http://schemas.microsoft.com/office/drawing/2017/model3d" xmlns:oel="http://schemas.microsoft.com/office/2019/extlst" xmlns:r="http://schemas.openxmlformats.org/officeDocument/2006/relationships" xmlns:wp14="http://schemas.microsoft.com/office/word/2010/wordprocessingDrawing" xmlns:wp="http://schemas.openxmlformats.org/drawingml/2006/wordprocessingDrawing" xmlns:wpg="http://schemas.microsoft.com/office/word/2010/wordprocessingGroup" xmlns:wpi="http://schemas.microsoft.com/office/word/2010/wordprocessingInk" xmlns:wps="http://schemas.microsoft.com/office/word/2010/wordprocessingShape" xmlns:o="urn:schemas-microsoft-com:office:office" xmlns:v="urn:schemas-microsoft-com:vml" xmlns:w10="urn:schemas-microsoft-com:office:word" xmlns:w="http://schemas.openxmlformats.org/wordprocessingml/2006/main" xmlns:w14="http://schemas.microsoft.com/office/word/2010/wordml" xmlns:w15="http://schemas.microsoft.com/office/word/2012/wordml" xmlns:w16cex="http://schemas.microsoft.com/office/word/2018/wordml/cex" xmlns:w16cid="http://schemas.microsoft.com/office/word/2016/wordml/cid" xmlns:w16="http://schemas.microsoft.com/office/word/2018/wordml" xmlns:w16sdtdh="http://schemas.microsoft.com/office/word/2020/wordml/sdtdatahash" xmlns:w16sdtfl="http://schemas.microsoft.com/office/word/2024/wordml/sdtformatlock" xmlns:w16se="http://schemas.microsoft.com/office/word/2015/wordml/symex" xmlns:w16du="http://schemas.microsoft.com/office/word/2023/wordml/word16du" xmlns:wne="http://schemas.microsoft.com/office/word/2006/wordml" mc:Ignorable="w14 w15 w16se w16cid w16 w16cex w16sdtdh w16sdtfl w16du wp14">
+<w:numbering xmlns:wpc="http://schemas.microsoft.com/office/word/2010/wordprocessingCanvas" xmlns:cx="http://schemas.microsoft.com/office/drawing/2014/chartex" xmlns:cx1="http://schemas.microsoft.com/office/drawing/2015/9/8/chartex" xmlns:cx2="http://schemas.microsoft.com/office/drawing/2015/10/21/chartex" xmlns:cx3="http://schemas.microsoft.com/office/drawing/2016/5/9/chartex" xmlns:cx4="http://schemas.microsoft.com/office/drawing/2016/5/10/chartex" xmlns:cx5="http://schemas.microsoft.com/office/drawing/2016/5/11/chartex" xmlns:cx6="http://schemas.microsoft.com/office/drawing/2016/5/12/chartex" xmlns:cx7="http://schemas.microsoft.com/office/drawing/2016/5/13/chartex" xmlns:cx8="http://schemas.microsoft.com/office/drawing/2016/5/14/chartex" xmlns:mc="http://schemas.openxmlformats.org/markup-compatibility/2006" xmlns:aink="http://schemas.microsoft.com/office/drawing/2016/ink" xmlns:am3d="http://schemas.microsoft.com/office/drawing/2017/model3d" xmlns:o="urn:schemas-microsoft-com:office:office" xmlns:oel="http://schemas.microsoft.com/office/2019/extlst" xmlns:r="http://schemas.openxmlformats.org/officeDocument/2006/relationships" xmlns:m="http://schemas.openxmlformats.org/officeDocument/2006/math" xmlns:v="urn:schemas-microsoft-com:vml" xmlns:wp14="http://schemas.microsoft.com/office/word/2010/wordprocessingDrawing" xmlns:wp="http://schemas.openxmlformats.org/drawingml/2006/wordprocessingDrawing" xmlns:w10="urn:schemas-microsoft-com:office:word" xmlns:w="http://schemas.openxmlformats.org/wordprocessingml/2006/main" xmlns:w14="http://schemas.microsoft.com/office/word/2010/wordml" xmlns:w15="http://schemas.microsoft.com/office/word/2012/wordml" xmlns:w16cex="http://schemas.microsoft.com/office/word/2018/wordml/cex" xmlns:w16cid="http://schemas.microsoft.com/office/word/2016/wordml/cid" xmlns:w16="http://schemas.microsoft.com/office/word/2018/wordml" xmlns:w16du="http://schemas.microsoft.com/office/word/2023/wordml/word16du" xmlns:w16sdtdh="http://schemas.microsoft.com/office/word/2020/wordml/sdtdatahash" xmlns:w16sdtfl="http://schemas.microsoft.com/office/word/2024/wordml/sdtformatlock" xmlns:w16se="http://schemas.microsoft.com/office/word/2015/wordml/symex" xmlns:wpg="http://schemas.microsoft.com/office/word/2010/wordprocessingGroup" xmlns:wpi="http://schemas.microsoft.com/office/word/2010/wordprocessingInk" xmlns:wne="http://schemas.microsoft.com/office/word/2006/wordml" xmlns:wps="http://schemas.microsoft.com/office/word/2010/wordprocessingShape" mc:Ignorable="w14 w15 w16se w16cid w16 w16cex w16sdtdh w16sdtfl w16du wp14">
   <w:abstractNum w:abstractNumId="0" w15:restartNumberingAfterBreak="0">
     <w:nsid w:val="40832FD4"/>
     <w:multiLevelType w:val="hybridMultilevel"/>
@@ -10284,7 +11431,7 @@
 </file>
 
 <file path=word/styles.xml><?xml version="1.0" encoding="utf-8"?>
-<w:styles xmlns:mc="http://schemas.openxmlformats.org/markup-compatibility/2006" xmlns:r="http://schemas.openxmlformats.org/officeDocument/2006/relationships" xmlns:w="http://schemas.openxmlformats.org/wordprocessingml/2006/main" xmlns:w14="http://schemas.microsoft.com/office/word/2010/wordml" xmlns:w15="http://schemas.microsoft.com/office/word/2012/wordml" xmlns:w16cex="http://schemas.microsoft.com/office/word/2018/wordml/cex" xmlns:w16cid="http://schemas.microsoft.com/office/word/2016/wordml/cid" xmlns:w16="http://schemas.microsoft.com/office/word/2018/wordml" xmlns:w16sdtdh="http://schemas.microsoft.com/office/word/2020/wordml/sdtdatahash" xmlns:w16sdtfl="http://schemas.microsoft.com/office/word/2024/wordml/sdtformatlock" xmlns:w16se="http://schemas.microsoft.com/office/word/2015/wordml/symex" xmlns:w16du="http://schemas.microsoft.com/office/word/2023/wordml/word16du" mc:Ignorable="w14 w15 w16se w16cid w16 w16cex w16sdtdh w16sdtfl w16du">
+<w:styles xmlns:mc="http://schemas.openxmlformats.org/markup-compatibility/2006" xmlns:r="http://schemas.openxmlformats.org/officeDocument/2006/relationships" xmlns:w="http://schemas.openxmlformats.org/wordprocessingml/2006/main" xmlns:w14="http://schemas.microsoft.com/office/word/2010/wordml" xmlns:w15="http://schemas.microsoft.com/office/word/2012/wordml" xmlns:w16cex="http://schemas.microsoft.com/office/word/2018/wordml/cex" xmlns:w16cid="http://schemas.microsoft.com/office/word/2016/wordml/cid" xmlns:w16="http://schemas.microsoft.com/office/word/2018/wordml" xmlns:w16du="http://schemas.microsoft.com/office/word/2023/wordml/word16du" xmlns:w16sdtdh="http://schemas.microsoft.com/office/word/2020/wordml/sdtdatahash" xmlns:w16sdtfl="http://schemas.microsoft.com/office/word/2024/wordml/sdtformatlock" xmlns:w16se="http://schemas.microsoft.com/office/word/2015/wordml/symex" mc:Ignorable="w14 w15 w16se w16cid w16 w16cex w16sdtdh w16sdtfl w16du">
   <w:docDefaults>
     <w:rPrDefault>
       <w:rPr>
@@ -10678,6 +11825,7 @@
   <w:style w:type="paragraph" w:default="1" w:styleId="Normal">
     <w:name w:val="Normal"/>
     <w:qFormat/>
+    <w:rsid w:val="007959DD"/>
     <w:pPr>
       <w:spacing w:line="480" w:lineRule="auto"/>
     </w:pPr>
@@ -10697,6 +11845,7 @@
   </w:style>
   <w:style w:type="paragraph" w:styleId="Ttulo2">
     <w:name w:val="heading 2"/>
+    <w:link w:val="Ttulo2Car"/>
     <w:uiPriority w:val="9"/>
     <w:unhideWhenUsed/>
     <w:qFormat/>
@@ -10879,6 +12028,18 @@
     <w:rPr>
       <w:sz w:val="20"/>
       <w:szCs w:val="20"/>
+    </w:rPr>
+  </w:style>
+  <w:style w:type="character" w:customStyle="1" w:styleId="Ttulo2Car">
+    <w:name w:val="Título 2 Car"/>
+    <w:basedOn w:val="Fuentedeprrafopredeter"/>
+    <w:link w:val="Ttulo2"/>
+    <w:uiPriority w:val="9"/>
+    <w:rsid w:val="00F85E8E"/>
+    <w:rPr>
+      <w:color w:val="2E74B5"/>
+      <w:sz w:val="26"/>
+      <w:szCs w:val="26"/>
     </w:rPr>
   </w:style>
 </w:styles>

</xml_diff>

<commit_message>
Diagrama UML del patron Prototype
</commit_message>
<xml_diff>
--- a/Documentacion/Semana 6/plataforma-Comercio-Energia.docx
+++ b/Documentacion/Semana 6/plataforma-Comercio-Energia.docx
@@ -3363,6 +3363,52 @@
           <w:lang w:val="es-CO"/>
         </w:rPr>
         <w:instrText>PAGEREF bm_fig22 \h</w:instrText>
+      </w:r>
+      <w:r>
+        <w:fldChar w:fldCharType="separate"/>
+      </w:r>
+      <w:r>
+        <w:rPr>
+          <w:noProof/>
+          <w:lang w:val="es-CO"/>
+        </w:rPr>
+        <w:t>1</w:t>
+      </w:r>
+      <w:r>
+        <w:fldChar w:fldCharType="end"/>
+      </w:r>
+    </w:p>
+    <w:p>
+      <w:pPr>
+        <w:tabs>
+          <w:tab w:val="right" w:leader="dot" w:pos="9360"/>
+        </w:tabs>
+        <w:spacing w:after="80" w:line="360" w:lineRule="auto"/>
+        <w:ind w:left="360" w:hanging="360"/>
+        <w:rPr>
+          <w:lang w:val="es-CO"/>
+        </w:rPr>
+      </w:pPr>
+      <w:r>
+        <w:rPr>
+          <w:lang w:val="es-CO"/>
+        </w:rPr>
+        <w:t>Figura 23. Diagrama UML de clases del patrón Prototype aplicado a los dispositivos IoT</w:t>
+      </w:r>
+      <w:r>
+        <w:rPr>
+          <w:lang w:val="es-CO"/>
+        </w:rPr>
+        <w:tab/>
+      </w:r>
+      <w:r>
+        <w:fldChar w:fldCharType="begin"/>
+      </w:r>
+      <w:r>
+        <w:rPr>
+          <w:lang w:val="es-CO"/>
+        </w:rPr>
+        <w:instrText>PAGEREF bm_fig23 \h</w:instrText>
       </w:r>
       <w:r>
         <w:fldChar w:fldCharType="separate"/>
@@ -10677,6 +10723,100 @@
           <w:lang w:val="es-CO"/>
         </w:rPr>
         <w:t xml:space="preserve">El Factory Method y el Abstract Factory crean objetos desde una descripción estática (un tipo, un canal); el Prototype crea objetos a partir de una instancia ya configurada en tiempo de ejecución, incluyendo ajustes que nadie escribió en el código. Son complementarios: la fábrica sigue siendo el punto de entrada para el primer dispositivo de un tipo; el Prototype entra cuando ya existe uno calibrado y hay que repetirlo.</w:t>
+      </w:r>
+    </w:p>
+    <w:p>
+      <w:pPr>
+        <w:spacing w:before="200"/>
+        <w:rPr>
+          <w:lang w:val="es-CO"/>
+        </w:rPr>
+      </w:pPr>
+      <w:bookmarkStart w:id="67" w:name="bm_fig23"/>
+      <w:r>
+        <w:rPr>
+          <w:b/>
+          <w:bCs/>
+          <w:lang w:val="es-CO"/>
+        </w:rPr>
+        <w:t>Figura 23</w:t>
+      </w:r>
+      <w:bookmarkEnd w:id="67"/>
+    </w:p>
+    <w:p>
+      <w:pPr>
+        <w:rPr>
+          <w:lang w:val="es-CO"/>
+        </w:rPr>
+      </w:pPr>
+      <w:r>
+        <w:rPr>
+          <w:i/>
+          <w:iCs/>
+          <w:lang w:val="es-CO"/>
+        </w:rPr>
+        <w:t xml:space="preserve">Diagrama UML de clases del patrón Prototype aplicado a los dispositivos IoT</w:t>
+      </w:r>
+    </w:p>
+    <w:p>
+      <w:pPr>
+        <w:jc w:val="center"/>
+      </w:pPr>
+      <w:r>
+        <w:drawing>
+          <wp:inline xmlns:a="http://schemas.openxmlformats.org/drawingml/2006/main" xmlns:pic="http://schemas.openxmlformats.org/drawingml/2006/picture">
+            <wp:extent cx="5486400" cy="4689446"/>
+            <wp:docPr id="2105890760" name="Picture 2105890760"/>
+            <wp:cNvGraphicFramePr>
+              <a:graphicFrameLocks noChangeAspect="1"/>
+            </wp:cNvGraphicFramePr>
+            <a:graphic>
+              <a:graphicData uri="http://schemas.openxmlformats.org/drawingml/2006/picture">
+                <pic:pic>
+                  <pic:nvPicPr>
+                    <pic:cNvPr id="0" name="UML Patron Prototype.jpeg"/>
+                    <pic:cNvPicPr/>
+                  </pic:nvPicPr>
+                  <pic:blipFill>
+                    <a:blip r:embed="rId30"/>
+                    <a:stretch>
+                      <a:fillRect/>
+                    </a:stretch>
+                  </pic:blipFill>
+                  <pic:spPr>
+                    <a:xfrm>
+                      <a:off x="0" y="0"/>
+                      <a:ext cx="5486400" cy="4689446"/>
+                    </a:xfrm>
+                    <a:prstGeom prst="rect"/>
+                  </pic:spPr>
+                </pic:pic>
+              </a:graphicData>
+            </a:graphic>
+          </wp:inline>
+        </w:drawing>
+      </w:r>
+    </w:p>
+    <w:p>
+      <w:pPr>
+        <w:spacing w:before="120"/>
+        <w:rPr>
+          <w:lang w:val="es-CO"/>
+        </w:rPr>
+      </w:pPr>
+      <w:r>
+        <w:rPr>
+          <w:i/>
+          <w:iCs/>
+          <w:lang w:val="es-CO"/>
+        </w:rPr>
+        <w:t xml:space="preserve">Nota. </w:t>
+      </w:r>
+      <w:r>
+        <w:rPr>
+          <w:lang w:val="es-CO"/>
+        </w:rPr>
+        <w:t xml:space="preserve">Diagrama de clases generado a partir de Documentacion/Semana 6/prototype.py, mostrando la interfaz PrototipoDispositivo, el producto DispositivoIoT que la implementa y el RegistroPlantillas que guarda copias y clona bajo demanda.</w:t>
       </w:r>
     </w:p>
     <w:p>

</xml_diff>

<commit_message>
Renumeracion de todas las figuras del documento
</commit_message>
<xml_diff>
--- a/Documentacion/Semana 6/plataforma-Comercio-Energia.docx
+++ b/Documentacion/Semana 6/plataforma-Comercio-Energia.docx
@@ -2427,7 +2427,7 @@
         <w:rPr>
           <w:lang w:val="es-CO"/>
         </w:rPr>
-        <w:t>Figura 2. Plataforma Voltia en ejecución, evidenciando el estado compartido gestionado por el Singleton</w:t>
+        <w:t>Figura 2. Diagrama UML de clases del patrón Singleton aplicado en PlataformaEnergia</w:t>
       </w:r>
       <w:r>
         <w:rPr>
@@ -2473,7 +2473,7 @@
         <w:rPr>
           <w:lang w:val="es-CO"/>
         </w:rPr>
-        <w:t>Figura 3. Código fuente de la metaclase SingletonMeta en el archivo plataforma.py del proyecto</w:t>
+        <w:t>Figura 3. Plataforma Voltia en ejecución, evidenciando el estado compartido gestionado por el Singleton</w:t>
       </w:r>
       <w:r>
         <w:rPr>
@@ -2519,7 +2519,7 @@
         <w:rPr>
           <w:lang w:val="es-CO"/>
         </w:rPr>
-        <w:t>Figura 4. Resultados de la ejecución de las pruebas unitarias del patrón Singleton</w:t>
+        <w:t>Figura 4. Código fuente de la metaclase SingletonMeta en el archivo plataforma.py del proyecto</w:t>
       </w:r>
       <w:r>
         <w:rPr>
@@ -2565,7 +2565,7 @@
         <w:rPr>
           <w:lang w:val="es-CO"/>
         </w:rPr>
-        <w:t>Figura 5. Resultados de la ejecución de las pruebas unitarias del patrón Factory Method</w:t>
+        <w:t>Figura 5. Resultados de la ejecución de las pruebas unitarias del patrón Singleton</w:t>
       </w:r>
       <w:r>
         <w:rPr>
@@ -2611,7 +2611,7 @@
         <w:rPr>
           <w:lang w:val="es-CO"/>
         </w:rPr>
-        <w:t>Figura 6. Documentación interactiva (Swagger) de los endpoints de dispositivos IoT de la API</w:t>
+        <w:t>Figura 6. Diagrama UML de clases del patrón Factory Method aplicado a los dispositivos IoT</w:t>
       </w:r>
       <w:r>
         <w:rPr>
@@ -2657,7 +2657,7 @@
         <w:rPr>
           <w:lang w:val="es-CO"/>
         </w:rPr>
-        <w:t>Figura 7. Interfaz de la plataforma para conectar un dispositivo IoT seleccionando su tipo</w:t>
+        <w:t>Figura 7. Resultados de la ejecución de las pruebas unitarias del patrón Factory Method</w:t>
       </w:r>
       <w:r>
         <w:rPr>
@@ -2703,7 +2703,7 @@
         <w:rPr>
           <w:lang w:val="es-CO"/>
         </w:rPr>
-        <w:t>Figura 8. Fábrica abstracta CanalNotificacionFactory y una de sus fábricas concretas en notificaciones.py</w:t>
+        <w:t>Figura 8. Documentación interactiva (Swagger) de los endpoints de dispositivos IoT de la API</w:t>
       </w:r>
       <w:r>
         <w:rPr>
@@ -2749,7 +2749,7 @@
         <w:rPr>
           <w:lang w:val="es-CO"/>
         </w:rPr>
-        <w:t>Figura 9. Resultados de la ejecución de las pruebas unitarias del patrón Abstract Factory</w:t>
+        <w:t>Figura 9. Interfaz de la plataforma para conectar un dispositivo IoT seleccionando su tipo</w:t>
       </w:r>
       <w:r>
         <w:rPr>
@@ -2795,7 +2795,7 @@
         <w:rPr>
           <w:lang w:val="es-CO"/>
         </w:rPr>
-        <w:t>Figura 10. Documentación interactiva (Swagger) de los endpoints de notificaciones de la API</w:t>
+        <w:t>Figura 10. Fábrica abstracta CanalNotificacionFactory y una de sus fábricas concretas en notificaciones.py</w:t>
       </w:r>
       <w:r>
         <w:rPr>
@@ -2841,7 +2841,7 @@
         <w:rPr>
           <w:lang w:val="es-CO"/>
         </w:rPr>
-        <w:t>Figura 11. Interfaz de la plataforma mostrando un mismo aviso con el formato de cada canal</w:t>
+        <w:t>Figura 11. Diagrama UML de clases del patrón Abstract Factory aplicado a los canales de notificación</w:t>
       </w:r>
       <w:r>
         <w:rPr>
@@ -2887,7 +2887,7 @@
         <w:rPr>
           <w:lang w:val="es-CO"/>
         </w:rPr>
-        <w:t>Figura 12. Builder abstracto ReporteBuilder y el director DirectorReportes en reportes.py</w:t>
+        <w:t>Figura 12. Resultados de la ejecución de las pruebas unitarias del patrón Abstract Factory</w:t>
       </w:r>
       <w:r>
         <w:rPr>
@@ -2933,7 +2933,7 @@
         <w:rPr>
           <w:lang w:val="es-CO"/>
         </w:rPr>
-        <w:t>Figura 13. Resultados de la ejecución de las pruebas unitarias del patrón Builder</w:t>
+        <w:t>Figura 13. Documentación interactiva (Swagger) de los endpoints de notificaciones de la API</w:t>
       </w:r>
       <w:r>
         <w:rPr>
@@ -2979,7 +2979,7 @@
         <w:rPr>
           <w:lang w:val="es-CO"/>
         </w:rPr>
-        <w:t>Figura 14. Documentación interactiva (Swagger) del endpoint de generación de reportes</w:t>
+        <w:t>Figura 14. Interfaz de la plataforma mostrando un mismo aviso con el formato de cada canal</w:t>
       </w:r>
       <w:r>
         <w:rPr>
@@ -3025,7 +3025,7 @@
         <w:rPr>
           <w:lang w:val="es-CO"/>
         </w:rPr>
-        <w:t>Figura 15. Interfaz de la plataforma generando un reporte energético en distintos formatos</w:t>
+        <w:t>Figura 15. Builder abstracto ReporteBuilder y el director DirectorReportes en reportes.py</w:t>
       </w:r>
       <w:r>
         <w:rPr>
@@ -3071,7 +3071,7 @@
         <w:rPr>
           <w:lang w:val="es-CO"/>
         </w:rPr>
-        <w:t>Figura 16. Diagrama UML de clases del patrón Singleton aplicado en PlataformaEnergia</w:t>
+        <w:t>Figura 16. Diagrama UML de clases del patrón Builder aplicado a la generación de reportes energéticos</w:t>
       </w:r>
       <w:r>
         <w:rPr>
@@ -3117,7 +3117,7 @@
         <w:rPr>
           <w:lang w:val="es-CO"/>
         </w:rPr>
-        <w:t>Figura 17. Diagrama UML de clases del patrón Factory Method aplicado a los dispositivos IoT</w:t>
+        <w:t>Figura 17. Resultados de la ejecución de las pruebas unitarias del patrón Builder</w:t>
       </w:r>
       <w:r>
         <w:rPr>
@@ -3163,7 +3163,7 @@
         <w:rPr>
           <w:lang w:val="es-CO"/>
         </w:rPr>
-        <w:t>Figura 18. Diagrama UML de clases del patrón Abstract Factory aplicado a los canales de notificación</w:t>
+        <w:t>Figura 18. Documentación interactiva (Swagger) del endpoint de generación de reportes</w:t>
       </w:r>
       <w:r>
         <w:rPr>
@@ -3209,7 +3209,7 @@
         <w:rPr>
           <w:lang w:val="es-CO"/>
         </w:rPr>
-        <w:t>Figura 19. Diagrama UML de clases del patrón Builder aplicado a la generación de reportes energéticos</w:t>
+        <w:t>Figura 19. Interfaz de la plataforma generando un reporte energético en distintos formatos</w:t>
       </w:r>
       <w:r>
         <w:rPr>
@@ -4689,14 +4689,14 @@
           <w:lang w:val="es-CO"/>
         </w:rPr>
       </w:pPr>
-      <w:bookmarkStart w:id="12" w:name="bm_fig16"/>
-      <w:r>
-        <w:rPr>
-          <w:b/>
-          <w:bCs/>
-          <w:lang w:val="es-CO"/>
-        </w:rPr>
-        <w:t>Figura 16</w:t>
+      <w:bookmarkStart w:id="12" w:name="bm_fig2"/>
+      <w:r>
+        <w:rPr>
+          <w:b/>
+          <w:bCs/>
+          <w:lang w:val="es-CO"/>
+        </w:rPr>
+        <w:t>Figura 2</w:t>
       </w:r>
       <w:bookmarkEnd w:id="12"/>
     </w:p>
@@ -4962,14 +4962,14 @@
           <w:lang w:val="es-CO"/>
         </w:rPr>
       </w:pPr>
-      <w:bookmarkStart w:id="16" w:name="bm_fig2"/>
-      <w:r>
-        <w:rPr>
-          <w:b/>
-          <w:bCs/>
-          <w:lang w:val="es-CO"/>
-        </w:rPr>
-        <w:t>Figura 2</w:t>
+      <w:bookmarkStart w:id="16" w:name="bm_fig3"/>
+      <w:r>
+        <w:rPr>
+          <w:b/>
+          <w:bCs/>
+          <w:lang w:val="es-CO"/>
+        </w:rPr>
+        <w:t>Figura 3</w:t>
       </w:r>
       <w:bookmarkEnd w:id="16"/>
     </w:p>
@@ -5072,7 +5072,7 @@
         <w:rPr>
           <w:lang w:val="es-CO"/>
         </w:rPr>
-        <w:t>Por su parte, la Figura 3 confirma que la implementación desplegada en el proyecto corresponde efectivamente al código presentado en la Figura 1.</w:t>
+        <w:t>Por su parte, la Figura 4 confirma que la implementación desplegada en el proyecto corresponde efectivamente al código presentado en la Figura 1.</w:t>
       </w:r>
     </w:p>
     <w:p>
@@ -5082,14 +5082,14 @@
           <w:lang w:val="es-CO"/>
         </w:rPr>
       </w:pPr>
-      <w:bookmarkStart w:id="17" w:name="bm_fig3"/>
-      <w:r>
-        <w:rPr>
-          <w:b/>
-          <w:bCs/>
-          <w:lang w:val="es-CO"/>
-        </w:rPr>
-        <w:t>Figura 3</w:t>
+      <w:bookmarkStart w:id="17" w:name="bm_fig4"/>
+      <w:r>
+        <w:rPr>
+          <w:b/>
+          <w:bCs/>
+          <w:lang w:val="es-CO"/>
+        </w:rPr>
+        <w:t>Figura 4</w:t>
       </w:r>
       <w:bookmarkEnd w:id="17"/>
     </w:p>
@@ -5214,7 +5214,7 @@
         <w:rPr>
           <w:lang w:val="es-CO"/>
         </w:rPr>
-        <w:t>La validación del patrón Singleton se realizó mediante pruebas unitarias automatizadas con pytest, las cuales verifican que el comportamiento de la metaclase SingletonMeta y de la clase PlataformaEnergia se ajusta a lo esperado. Como se observa en la Figura 4, la suite Patrones/Semana 2/test_singleton.py ejecutó 18 pruebas, todas ellas superadas exitosamente.</w:t>
+        <w:t>La validación del patrón Singleton se realizó mediante pruebas unitarias automatizadas con pytest, las cuales verifican que el comportamiento de la metaclase SingletonMeta y de la clase PlataformaEnergia se ajusta a lo esperado. Como se observa en la Figura 5, la suite Patrones/Semana 2/test_singleton.py ejecutó 18 pruebas, todas ellas superadas exitosamente.</w:t>
       </w:r>
     </w:p>
     <w:p>
@@ -5224,14 +5224,14 @@
           <w:lang w:val="es-CO"/>
         </w:rPr>
       </w:pPr>
-      <w:bookmarkStart w:id="19" w:name="bm_fig4"/>
-      <w:r>
-        <w:rPr>
-          <w:b/>
-          <w:bCs/>
-          <w:lang w:val="es-CO"/>
-        </w:rPr>
-        <w:t>Figura 4</w:t>
+      <w:bookmarkStart w:id="19" w:name="bm_fig5"/>
+      <w:r>
+        <w:rPr>
+          <w:b/>
+          <w:bCs/>
+          <w:lang w:val="es-CO"/>
+        </w:rPr>
+        <w:t>Figura 5</w:t>
       </w:r>
       <w:bookmarkEnd w:id="19"/>
     </w:p>
@@ -5831,7 +5831,7 @@
           <w:lang w:val="es-CO"/>
         </w:rPr>
       </w:pPr>
-      <w:bookmarkStart w:id="24" w:name="bm_fig17"/>
+      <w:bookmarkStart w:id="24" w:name="bm_fig6"/>
       <w:r>
         <w:rPr>
           <w:b/>
@@ -5839,7 +5839,7 @@
           <w:lang w:val="es-CO"/>
         </w:rPr>
         <w:lastRenderedPageBreak/>
-        <w:t>Figura 17</w:t>
+        <w:t>Figura 6</w:t>
       </w:r>
       <w:bookmarkEnd w:id="24"/>
     </w:p>
@@ -6071,8 +6071,7 @@
         <w:rPr>
           <w:lang w:val="es-CO"/>
         </w:rPr>
-        <w:lastRenderedPageBreak/>
-        <w:t>La validación del patrón Factory Method se realizó mediante pruebas unitarias automatizadas con pytest, las cuales verifican que el registro de fábricas y la creación de cada tipo de dispositivo IoT funcionan correctamente. Como se observa en la Figura 5, la suite Patrones/Semana 3/test_factory_method.py ejecutó 16 pruebas, todas ellas superadas exitosamente, lo que confirma junto con la validación previa del patrón Singleton que el conjunto completo de pruebas automatizadas del proyecto pasa sin errores.</w:t>
+        <w:t>La validación del patrón Factory Method se realizó mediante pruebas unitarias automatizadas con pytest, las cuales verifican que el registro de fábricas y la creación de cada tipo de dispositivo IoT funcionan correctamente. Como se observa en la Figura 7, la suite Patrones/Semana 3/test_factory_method.py ejecutó 16 pruebas, todas ellas superadas exitosamente, lo que confirma junto con la validación previa del patrón Singleton que el conjunto completo de pruebas automatizadas del proyecto pasa sin errores.</w:t>
       </w:r>
     </w:p>
     <w:p>
@@ -6082,14 +6081,14 @@
           <w:lang w:val="es-CO"/>
         </w:rPr>
       </w:pPr>
-      <w:bookmarkStart w:id="28" w:name="bm_fig5"/>
-      <w:r>
-        <w:rPr>
-          <w:b/>
-          <w:bCs/>
-          <w:lang w:val="es-CO"/>
-        </w:rPr>
-        <w:t>Figura 5</w:t>
+      <w:bookmarkStart w:id="28" w:name="bm_fig7"/>
+      <w:r>
+        <w:rPr>
+          <w:b/>
+          <w:bCs/>
+          <w:lang w:val="es-CO"/>
+        </w:rPr>
+        <w:t>Figura 7</w:t>
       </w:r>
       <w:bookmarkEnd w:id="28"/>
     </w:p>
@@ -6191,7 +6190,7 @@
         <w:rPr>
           <w:lang w:val="es-CO"/>
         </w:rPr>
-        <w:t>Además de las pruebas unitarias, el funcionamiento del patrón se validó de manera funcional a través de la API y de la interfaz de la plataforma. La Figura 6 muestra la documentación interactiva (Swagger) generada por FastAPI, donde se listan los endpoints de dispositivos IoT —entre ellos GET y POST /iot/dispositivos— que internamente invocan el punto único de resolución crear_dispositivo(tipo, id, usuario_id) del Factory Method.</w:t>
+        <w:t>Además de las pruebas unitarias, el funcionamiento del patrón se validó de manera funcional a través de la API y de la interfaz de la plataforma. La Figura 8 muestra la documentación interactiva (Swagger) generada por FastAPI, donde se listan los endpoints de dispositivos IoT —entre ellos GET y POST /iot/dispositivos— que internamente invocan el punto único de resolución crear_dispositivo(tipo, id, usuario_id) del Factory Method.</w:t>
       </w:r>
     </w:p>
     <w:p>
@@ -6201,7 +6200,7 @@
           <w:lang w:val="es-CO"/>
         </w:rPr>
       </w:pPr>
-      <w:bookmarkStart w:id="29" w:name="bm_fig6"/>
+      <w:bookmarkStart w:id="29" w:name="bm_fig8"/>
       <w:r>
         <w:rPr>
           <w:b/>
@@ -6209,7 +6208,7 @@
           <w:lang w:val="es-CO"/>
         </w:rPr>
         <w:lastRenderedPageBreak/>
-        <w:t>Figura 6</w:t>
+        <w:t>Figura 8</w:t>
       </w:r>
       <w:bookmarkEnd w:id="29"/>
     </w:p>
@@ -6311,7 +6310,7 @@
         <w:rPr>
           <w:lang w:val="es-CO"/>
         </w:rPr>
-        <w:t>Por su parte, la Figura 7 evidencia el uso del patrón desde la interfaz de usuario de la plataforma: en la pestaña IoT &amp; Predicción, el formulario Conectar Dispositivo permite seleccionar el tipo de dispositivo (por ejemplo, Batería) antes de conectarlo, selección que la API traduce en el parámetro tipo recibido por crear_dispositivo. Es precisamente este parámetro el que el Factory Method utiliza para decidir, en tiempo de ejecución, qué producto concreto (PanelSolar, BateriaInteligente o MedidorInteligente) debe instanciarse, sin que el resto de la plataforma necesite conocer esa decisión.</w:t>
+        <w:t>Por su parte, la Figura 9 evidencia el uso del patrón desde la interfaz de usuario de la plataforma: en la pestaña IoT &amp; Predicción, el formulario Conectar Dispositivo permite seleccionar el tipo de dispositivo (por ejemplo, Batería) antes de conectarlo, selección que la API traduce en el parámetro tipo recibido por crear_dispositivo. Es precisamente este parámetro el que el Factory Method utiliza para decidir, en tiempo de ejecución, qué producto concreto (PanelSolar, BateriaInteligente o MedidorInteligente) debe instanciarse, sin que el resto de la plataforma necesite conocer esa decisión.</w:t>
       </w:r>
     </w:p>
     <w:p>
@@ -6321,14 +6320,14 @@
           <w:lang w:val="es-CO"/>
         </w:rPr>
       </w:pPr>
-      <w:bookmarkStart w:id="30" w:name="bm_fig7"/>
-      <w:r>
-        <w:rPr>
-          <w:b/>
-          <w:bCs/>
-          <w:lang w:val="es-CO"/>
-        </w:rPr>
-        <w:t>Figura 7</w:t>
+      <w:bookmarkStart w:id="30" w:name="bm_fig9"/>
+      <w:r>
+        <w:rPr>
+          <w:b/>
+          <w:bCs/>
+          <w:lang w:val="es-CO"/>
+        </w:rPr>
+        <w:t>Figura 9</w:t>
       </w:r>
       <w:bookmarkEnd w:id="30"/>
     </w:p>
@@ -6878,14 +6877,14 @@
           <w:lang w:val="es-CO"/>
         </w:rPr>
       </w:pPr>
-      <w:bookmarkStart w:id="34" w:name="bm_fig8"/>
-      <w:r>
-        <w:rPr>
-          <w:b/>
-          <w:bCs/>
-          <w:lang w:val="es-CO"/>
-        </w:rPr>
-        <w:t>Figura 8</w:t>
+      <w:bookmarkStart w:id="34" w:name="bm_fig10"/>
+      <w:r>
+        <w:rPr>
+          <w:b/>
+          <w:bCs/>
+          <w:lang w:val="es-CO"/>
+        </w:rPr>
+        <w:t>Figura 10</w:t>
       </w:r>
       <w:bookmarkEnd w:id="34"/>
     </w:p>
@@ -7430,14 +7429,14 @@
           <w:lang w:val="es-CO"/>
         </w:rPr>
       </w:pPr>
-      <w:bookmarkStart w:id="36" w:name="bm_fig18"/>
-      <w:r>
-        <w:rPr>
-          <w:b/>
-          <w:bCs/>
-          <w:lang w:val="es-CO"/>
-        </w:rPr>
-        <w:t>Figura 18</w:t>
+      <w:bookmarkStart w:id="36" w:name="bm_fig11"/>
+      <w:r>
+        <w:rPr>
+          <w:b/>
+          <w:bCs/>
+          <w:lang w:val="es-CO"/>
+        </w:rPr>
+        <w:t>Figura 11</w:t>
       </w:r>
       <w:bookmarkEnd w:id="36"/>
     </w:p>
@@ -7687,7 +7686,7 @@
         <w:rPr>
           <w:lang w:val="es-CO"/>
         </w:rPr>
-        <w:t>La validación del patrón Abstract Factory se realizó mediante pruebas unitarias automatizadas con pytest, que verifican que el código cliente nunca instancia notificadores concretos, que cada fábrica de canal construye la familia completa (transacción, alerta IoT y reporte) y que todos los mensajes de un mismo servicio salen por el mismo canal respetando sus restricciones de formato. Como se observa en la Figura 9, la suite Patrones/Semana 4/test_abstract_factory.py ejecutó 27 casos, todos superados, y el conjunto completo de pruebas del proyecto —Singleton, Factory Method y Abstract Factory— pasa sin errores.</w:t>
+        <w:t>La validación del patrón Abstract Factory se realizó mediante pruebas unitarias automatizadas con pytest, que verifican que el código cliente nunca instancia notificadores concretos, que cada fábrica de canal construye la familia completa (transacción, alerta IoT y reporte) y que todos los mensajes de un mismo servicio salen por el mismo canal respetando sus restricciones de formato. Como se observa en la Figura 12, la suite Patrones/Semana 4/test_abstract_factory.py ejecutó 27 casos, todos superados, y el conjunto completo de pruebas del proyecto —Singleton, Factory Method y Abstract Factory— pasa sin errores.</w:t>
       </w:r>
     </w:p>
     <w:p>
@@ -7697,14 +7696,14 @@
           <w:lang w:val="es-CO"/>
         </w:rPr>
       </w:pPr>
-      <w:bookmarkStart w:id="40" w:name="bm_fig9"/>
-      <w:r>
-        <w:rPr>
-          <w:b/>
-          <w:bCs/>
-          <w:lang w:val="es-CO"/>
-        </w:rPr>
-        <w:t>Figura 9</w:t>
+      <w:bookmarkStart w:id="40" w:name="bm_fig12"/>
+      <w:r>
+        <w:rPr>
+          <w:b/>
+          <w:bCs/>
+          <w:lang w:val="es-CO"/>
+        </w:rPr>
+        <w:t>Figura 12</w:t>
       </w:r>
       <w:bookmarkEnd w:id="40"/>
     </w:p>
@@ -7918,7 +7917,7 @@
         <w:rPr>
           <w:lang w:val="es-CO"/>
         </w:rPr>
-        <w:t>Además de las pruebas unitarias, el funcionamiento del patrón se validó de manera funcional a través de la API y de la interfaz. La Figura 10 muestra la documentación interactiva (Swagger) de FastAPI con los endpoints de notificaciones —GET /notificaciones, GET /notificaciones/canales, PUT /usuarios/me/canal y POST /reportes/generar—, que internamente invocan crear_servicio(canal) para construir la familia de avisos del usuario.</w:t>
+        <w:t>Además de las pruebas unitarias, el funcionamiento del patrón se validó de manera funcional a través de la API y de la interfaz. La Figura 13 muestra la documentación interactiva (Swagger) de FastAPI con los endpoints de notificaciones —GET /notificaciones, GET /notificaciones/canales, PUT /usuarios/me/canal y POST /reportes/generar—, que internamente invocan crear_servicio(canal) para construir la familia de avisos del usuario.</w:t>
       </w:r>
     </w:p>
     <w:p>
@@ -7928,14 +7927,14 @@
           <w:lang w:val="es-CO"/>
         </w:rPr>
       </w:pPr>
-      <w:bookmarkStart w:id="41" w:name="bm_fig10"/>
-      <w:r>
-        <w:rPr>
-          <w:b/>
-          <w:bCs/>
-          <w:lang w:val="es-CO"/>
-        </w:rPr>
-        <w:t>Figura 10</w:t>
+      <w:bookmarkStart w:id="41" w:name="bm_fig13"/>
+      <w:r>
+        <w:rPr>
+          <w:b/>
+          <w:bCs/>
+          <w:lang w:val="es-CO"/>
+        </w:rPr>
+        <w:t>Figura 13</w:t>
       </w:r>
       <w:bookmarkEnd w:id="41"/>
     </w:p>
@@ -8068,7 +8067,7 @@
         <w:rPr>
           <w:lang w:val="es-CO"/>
         </w:rPr>
-        <w:t>Por su parte, la Figura 11 evidencia el uso del patrón desde la interfaz de usuario: en la pestaña Notificaciones, un mismo evento —el cierre de una operación en la subasta— se presenta a cada usuario con el formato de su canal (un SMS breve sin asunto para quien eligió ese medio y una notificación push con payload para quien optó por la aplicación móvil). Es la fábrica de canal seleccionada según canal_notificacion la que determina, en tiempo de ejecución, qué familia de notificadores construye los mensajes.</w:t>
+        <w:t>Por su parte, la Figura 14 evidencia el uso del patrón desde la interfaz de usuario: en la pestaña Notificaciones, un mismo evento —el cierre de una operación en la subasta— se presenta a cada usuario con el formato de su canal (un SMS breve sin asunto para quien eligió ese medio y una notificación push con payload para quien optó por la aplicación móvil). Es la fábrica de canal seleccionada según canal_notificacion la que determina, en tiempo de ejecución, qué familia de notificadores construye los mensajes.</w:t>
       </w:r>
     </w:p>
     <w:p>
@@ -8080,7 +8079,7 @@
           <w:lang w:val="es-CO"/>
         </w:rPr>
       </w:pPr>
-      <w:bookmarkStart w:id="42" w:name="bm_fig11"/>
+      <w:bookmarkStart w:id="42" w:name="bm_fig14"/>
     </w:p>
     <w:p>
       <w:pPr>
@@ -8125,7 +8124,7 @@
           <w:bCs/>
           <w:lang w:val="es-CO"/>
         </w:rPr>
-        <w:t>Figura 11</w:t>
+        <w:t>Figura 14</w:t>
       </w:r>
       <w:bookmarkEnd w:id="42"/>
     </w:p>
@@ -8719,14 +8718,14 @@
           <w:lang w:val="es-CO"/>
         </w:rPr>
       </w:pPr>
-      <w:bookmarkStart w:id="46" w:name="bm_fig12"/>
-      <w:r>
-        <w:rPr>
-          <w:b/>
-          <w:bCs/>
-          <w:lang w:val="es-CO"/>
-        </w:rPr>
-        <w:t>Figura 12</w:t>
+      <w:bookmarkStart w:id="46" w:name="bm_fig15"/>
+      <w:r>
+        <w:rPr>
+          <w:b/>
+          <w:bCs/>
+          <w:lang w:val="es-CO"/>
+        </w:rPr>
+        <w:t>Figura 15</w:t>
       </w:r>
       <w:bookmarkEnd w:id="46"/>
     </w:p>
@@ -9236,14 +9235,14 @@
           <w:lang w:val="es-CO"/>
         </w:rPr>
       </w:pPr>
-      <w:bookmarkStart w:id="48" w:name="bm_fig19"/>
-      <w:r>
-        <w:rPr>
-          <w:b/>
-          <w:bCs/>
-          <w:lang w:val="es-CO"/>
-        </w:rPr>
-        <w:t>Figura 19</w:t>
+      <w:bookmarkStart w:id="48" w:name="bm_fig16"/>
+      <w:r>
+        <w:rPr>
+          <w:b/>
+          <w:bCs/>
+          <w:lang w:val="es-CO"/>
+        </w:rPr>
+        <w:t>Figura 16</w:t>
       </w:r>
       <w:bookmarkEnd w:id="48"/>
     </w:p>
@@ -9481,8 +9480,7 @@
         <w:rPr>
           <w:lang w:val="es-CO"/>
         </w:rPr>
-        <w:lastRenderedPageBreak/>
-        <w:t>respeta el contrato que consume el canal de notificación. Como se observa en la Figura 13, la suite Patrones/Semana 5/test_builder.py ejecutó 30 casos, todos superados, y el conjunto completo de pruebas del proyecto —Singleton, Factory Method, Abstract Factory y Builder— pasa sin errores.</w:t>
+        <w:t>respeta el contrato que consume el canal de notificación. Como se observa en la Figura 17, la suite Patrones/Semana 5/test_builder.py ejecutó 30 casos, todos superados, y el conjunto completo de pruebas del proyecto —Singleton, Factory Method, Abstract Factory y Builder— pasa sin errores.</w:t>
       </w:r>
     </w:p>
     <w:p>
@@ -9492,14 +9490,14 @@
           <w:lang w:val="es-CO"/>
         </w:rPr>
       </w:pPr>
-      <w:bookmarkStart w:id="52" w:name="bm_fig13"/>
-      <w:r>
-        <w:rPr>
-          <w:b/>
-          <w:bCs/>
-          <w:lang w:val="es-CO"/>
-        </w:rPr>
-        <w:t>Figura 13</w:t>
+      <w:bookmarkStart w:id="52" w:name="bm_fig17"/>
+      <w:r>
+        <w:rPr>
+          <w:b/>
+          <w:bCs/>
+          <w:lang w:val="es-CO"/>
+        </w:rPr>
+        <w:t>Figura 17</w:t>
       </w:r>
       <w:bookmarkEnd w:id="52"/>
     </w:p>
@@ -9704,7 +9702,7 @@
         <w:rPr>
           <w:lang w:val="es-CO"/>
         </w:rPr>
-        <w:t>Además de las pruebas unitarias, el funcionamiento del patrón se validó de manera funcional a través de la API y de la interfaz. La Figura 14 muestra la documentación interactiva (Swagger) de FastAPI con el endpoint POST /reportes/generar, que recibe el parámetro formato y devuelve el reporte construido junto con el aviso dejado en la bandeja del usuario.</w:t>
+        <w:t>Además de las pruebas unitarias, el funcionamiento del patrón se validó de manera funcional a través de la API y de la interfaz. La Figura 18 muestra la documentación interactiva (Swagger) de FastAPI con el endpoint POST /reportes/generar, que recibe el parámetro formato y devuelve el reporte construido junto con el aviso dejado en la bandeja del usuario.</w:t>
       </w:r>
     </w:p>
     <w:p>
@@ -9714,7 +9712,7 @@
           <w:lang w:val="es-CO"/>
         </w:rPr>
       </w:pPr>
-      <w:bookmarkStart w:id="53" w:name="bm_fig14"/>
+      <w:bookmarkStart w:id="53" w:name="bm_fig18"/>
       <w:r>
         <w:rPr>
           <w:b/>
@@ -9722,7 +9720,7 @@
           <w:lang w:val="es-CO"/>
         </w:rPr>
         <w:lastRenderedPageBreak/>
-        <w:t>Figura 14</w:t>
+        <w:t>Figura 18</w:t>
       </w:r>
       <w:bookmarkEnd w:id="53"/>
     </w:p>
@@ -9866,7 +9864,7 @@
         <w:rPr>
           <w:lang w:val="es-CO"/>
         </w:rPr>
-        <w:t>Por su parte, la Figura 15 evidencia el uso del patrón desde la interfaz: en la pestaña Notificaciones, el formulario Generar reporte permite elegir el formato antes de construirlo, y el reporte resultante se muestra según la representación seleccionada —secciones tituladas para el formato detallado, texto plano para el formato texto—. Es el builder correspondiente al formato el que determina la estructura del resultado, mientras que el resumen que llega a la bandeja siempre sale por el canal del usuario.</w:t>
+        <w:t>Por su parte, la Figura 19 evidencia el uso del patrón desde la interfaz: en la pestaña Notificaciones, el formulario Generar reporte permite elegir el formato antes de construirlo, y el reporte resultante se muestra según la representación seleccionada —secciones tituladas para el formato detallado, texto plano para el formato texto—. Es el builder correspondiente al formato el que determina la estructura del resultado, mientras que el resumen que llega a la bandeja siempre sale por el canal del usuario.</w:t>
       </w:r>
     </w:p>
     <w:p>
@@ -9878,7 +9876,7 @@
           <w:lang w:val="es-CO"/>
         </w:rPr>
       </w:pPr>
-      <w:bookmarkStart w:id="54" w:name="bm_fig15"/>
+      <w:bookmarkStart w:id="54" w:name="bm_fig19"/>
     </w:p>
     <w:p>
       <w:pPr>
@@ -9943,7 +9941,7 @@
           <w:bCs/>
           <w:lang w:val="es-CO"/>
         </w:rPr>
-        <w:t>Figura 15</w:t>
+        <w:t>Figura 19</w:t>
       </w:r>
       <w:bookmarkEnd w:id="54"/>
     </w:p>

</xml_diff>

<commit_message>
Integra Factory Method en la app real y completa el informe (figura de codigo, Objetivos Especificos, renumeracion)
</commit_message>
<xml_diff>
--- a/Documentacion/Semana 6/plataforma-Comercio-Energia.docx
+++ b/Documentacion/Semana 6/plataforma-Comercio-Energia.docx
@@ -540,6 +540,54 @@
           <w:iCs/>
           <w:lang w:val="es-CO"/>
         </w:rPr>
+        <w:t>Objetivos Específicos</w:t>
+      </w:r>
+      <w:r>
+        <w:rPr>
+          <w:lang w:val="es-CO"/>
+        </w:rPr>
+        <w:tab/>
+      </w:r>
+      <w:r>
+        <w:fldChar w:fldCharType="begin"/>
+      </w:r>
+      <w:r>
+        <w:rPr>
+          <w:lang w:val="es-CO"/>
+        </w:rPr>
+        <w:instrText>PAGEREF bm_objetivos_especificos \h</w:instrText>
+      </w:r>
+      <w:r>
+        <w:fldChar w:fldCharType="separate"/>
+      </w:r>
+      <w:r>
+        <w:rPr>
+          <w:noProof/>
+          <w:lang w:val="es-CO"/>
+        </w:rPr>
+        <w:t>1</w:t>
+      </w:r>
+      <w:r>
+        <w:fldChar w:fldCharType="end"/>
+      </w:r>
+    </w:p>
+    <w:p>
+      <w:pPr>
+        <w:tabs>
+          <w:tab w:val="right" w:leader="dot" w:pos="9360"/>
+        </w:tabs>
+        <w:spacing w:after="80" w:line="360" w:lineRule="auto"/>
+        <w:ind w:left="720"/>
+        <w:rPr>
+          <w:lang w:val="es-CO"/>
+        </w:rPr>
+      </w:pPr>
+      <w:r>
+        <w:rPr>
+          <w:i/>
+          <w:iCs/>
+          <w:lang w:val="es-CO"/>
+        </w:rPr>
         <w:t>Impacto Esperado</w:t>
       </w:r>
       <w:r>
@@ -2611,7 +2659,7 @@
         <w:rPr>
           <w:lang w:val="es-CO"/>
         </w:rPr>
-        <w:t>Figura 6. Diagrama UML de clases del patrón Factory Method aplicado a los dispositivos IoT</w:t>
+        <w:t>Figura 6. Fábrica abstracta DispositivoIoTFactory y una de sus fábricas concretas en factory_method.py</w:t>
       </w:r>
       <w:r>
         <w:rPr>
@@ -2626,7 +2674,7 @@
         <w:rPr>
           <w:lang w:val="es-CO"/>
         </w:rPr>
-        <w:instrText>PAGEREF bm_fig6 \h</w:instrText>
+        <w:instrText>PAGEREF bm_fig90 \h</w:instrText>
       </w:r>
       <w:r>
         <w:fldChar w:fldCharType="separate"/>
@@ -2657,7 +2705,7 @@
         <w:rPr>
           <w:lang w:val="es-CO"/>
         </w:rPr>
-        <w:t>Figura 7. Resultados de la ejecución de las pruebas unitarias del patrón Factory Method</w:t>
+        <w:t>Figura 7. Diagrama UML de clases del patrón Factory Method aplicado a los dispositivos IoT</w:t>
       </w:r>
       <w:r>
         <w:rPr>
@@ -2703,7 +2751,7 @@
         <w:rPr>
           <w:lang w:val="es-CO"/>
         </w:rPr>
-        <w:t>Figura 8. Documentación interactiva (Swagger) de los endpoints de dispositivos IoT de la API</w:t>
+        <w:t>Figura 8. Resultados de la ejecución de las pruebas unitarias del patrón Factory Method</w:t>
       </w:r>
       <w:r>
         <w:rPr>
@@ -2749,7 +2797,7 @@
         <w:rPr>
           <w:lang w:val="es-CO"/>
         </w:rPr>
-        <w:t>Figura 9. Interfaz de la plataforma para conectar un dispositivo IoT seleccionando su tipo</w:t>
+        <w:t>Figura 9. Documentación interactiva (Swagger) de los endpoints de dispositivos IoT de la API</w:t>
       </w:r>
       <w:r>
         <w:rPr>
@@ -2795,7 +2843,7 @@
         <w:rPr>
           <w:lang w:val="es-CO"/>
         </w:rPr>
-        <w:t>Figura 10. Fábrica abstracta CanalNotificacionFactory y una de sus fábricas concretas en notificaciones.py</w:t>
+        <w:t>Figura 10. Interfaz de la plataforma para conectar un dispositivo IoT seleccionando su tipo</w:t>
       </w:r>
       <w:r>
         <w:rPr>
@@ -2841,7 +2889,7 @@
         <w:rPr>
           <w:lang w:val="es-CO"/>
         </w:rPr>
-        <w:t>Figura 11. Diagrama UML de clases del patrón Abstract Factory aplicado a los canales de notificación</w:t>
+        <w:t>Figura 11. Fábrica abstracta CanalNotificacionFactory y una de sus fábricas concretas en notificaciones.py</w:t>
       </w:r>
       <w:r>
         <w:rPr>
@@ -2887,7 +2935,7 @@
         <w:rPr>
           <w:lang w:val="es-CO"/>
         </w:rPr>
-        <w:t>Figura 12. Resultados de la ejecución de las pruebas unitarias del patrón Abstract Factory</w:t>
+        <w:t>Figura 12. Diagrama UML de clases del patrón Abstract Factory aplicado a los canales de notificación</w:t>
       </w:r>
       <w:r>
         <w:rPr>
@@ -2933,7 +2981,7 @@
         <w:rPr>
           <w:lang w:val="es-CO"/>
         </w:rPr>
-        <w:t>Figura 13. Documentación interactiva (Swagger) de los endpoints de notificaciones de la API</w:t>
+        <w:t>Figura 13. Resultados de la ejecución de las pruebas unitarias del patrón Abstract Factory</w:t>
       </w:r>
       <w:r>
         <w:rPr>
@@ -2979,7 +3027,7 @@
         <w:rPr>
           <w:lang w:val="es-CO"/>
         </w:rPr>
-        <w:t>Figura 14. Interfaz de la plataforma mostrando un mismo aviso con el formato de cada canal</w:t>
+        <w:t>Figura 14. Documentación interactiva (Swagger) de los endpoints de notificaciones de la API</w:t>
       </w:r>
       <w:r>
         <w:rPr>
@@ -3025,7 +3073,7 @@
         <w:rPr>
           <w:lang w:val="es-CO"/>
         </w:rPr>
-        <w:t>Figura 15. Builder abstracto ReporteBuilder y el director DirectorReportes en reportes.py</w:t>
+        <w:t>Figura 15. Interfaz de la plataforma mostrando un mismo aviso con el formato de cada canal</w:t>
       </w:r>
       <w:r>
         <w:rPr>
@@ -3071,7 +3119,7 @@
         <w:rPr>
           <w:lang w:val="es-CO"/>
         </w:rPr>
-        <w:t>Figura 16. Diagrama UML de clases del patrón Builder aplicado a la generación de reportes energéticos</w:t>
+        <w:t>Figura 16. Builder abstracto ReporteBuilder y el director DirectorReportes en reportes.py</w:t>
       </w:r>
       <w:r>
         <w:rPr>
@@ -3117,7 +3165,7 @@
         <w:rPr>
           <w:lang w:val="es-CO"/>
         </w:rPr>
-        <w:t>Figura 17. Resultados de la ejecución de las pruebas unitarias del patrón Builder</w:t>
+        <w:t>Figura 17. Diagrama UML de clases del patrón Builder aplicado a la generación de reportes energéticos</w:t>
       </w:r>
       <w:r>
         <w:rPr>
@@ -3163,7 +3211,7 @@
         <w:rPr>
           <w:lang w:val="es-CO"/>
         </w:rPr>
-        <w:t>Figura 18. Documentación interactiva (Swagger) del endpoint de generación de reportes</w:t>
+        <w:t>Figura 18. Resultados de la ejecución de las pruebas unitarias del patrón Builder</w:t>
       </w:r>
       <w:r>
         <w:rPr>
@@ -3209,7 +3257,7 @@
         <w:rPr>
           <w:lang w:val="es-CO"/>
         </w:rPr>
-        <w:t>Figura 19. Interfaz de la plataforma generando un reporte energético en distintos formatos</w:t>
+        <w:t>Figura 19. Documentación interactiva (Swagger) del endpoint de generación de reportes</w:t>
       </w:r>
       <w:r>
         <w:rPr>
@@ -3255,7 +3303,7 @@
         <w:rPr>
           <w:lang w:val="es-CO"/>
         </w:rPr>
-        <w:t>Figura 20. Método clonar() de DispositivoIoT en prototype.py</w:t>
+        <w:t>Figura 20. Interfaz de la plataforma generando un reporte energético en distintos formatos</w:t>
       </w:r>
       <w:r>
         <w:rPr>
@@ -3301,7 +3349,7 @@
         <w:rPr>
           <w:lang w:val="es-CO"/>
         </w:rPr>
-        <w:t>Figura 21. Diagrama UML de clases del patrón Prototype aplicado a los dispositivos IoT</w:t>
+        <w:t>Figura 21. Método clonar() de DispositivoIoT en prototype.py</w:t>
       </w:r>
       <w:r>
         <w:rPr>
@@ -3347,7 +3395,7 @@
         <w:rPr>
           <w:lang w:val="es-CO"/>
         </w:rPr>
-        <w:t>Figura 22. Resultados de la ejecución de las pruebas unitarias del patrón Prototype</w:t>
+        <w:t>Figura 22. Diagrama UML de clases del patrón Prototype aplicado a los dispositivos IoT</w:t>
       </w:r>
       <w:r>
         <w:rPr>
@@ -3393,7 +3441,7 @@
         <w:rPr>
           <w:lang w:val="es-CO"/>
         </w:rPr>
-        <w:t>Figura 23. Interfaz de la plataforma para clonar un dispositivo IoT ya calibrado</w:t>
+        <w:t>Figura 23. Resultados de la ejecución de las pruebas unitarias del patrón Prototype</w:t>
       </w:r>
       <w:r>
         <w:rPr>
@@ -3409,6 +3457,52 @@
           <w:lang w:val="es-CO"/>
         </w:rPr>
         <w:instrText>PAGEREF bm_fig23 \h</w:instrText>
+      </w:r>
+      <w:r>
+        <w:fldChar w:fldCharType="separate"/>
+      </w:r>
+      <w:r>
+        <w:rPr>
+          <w:noProof/>
+          <w:lang w:val="es-CO"/>
+        </w:rPr>
+        <w:t>1</w:t>
+      </w:r>
+      <w:r>
+        <w:fldChar w:fldCharType="end"/>
+      </w:r>
+    </w:p>
+    <w:p>
+      <w:pPr>
+        <w:tabs>
+          <w:tab w:val="right" w:leader="dot" w:pos="9360"/>
+        </w:tabs>
+        <w:spacing w:after="80" w:line="360" w:lineRule="auto"/>
+        <w:ind w:left="360" w:hanging="360"/>
+        <w:rPr>
+          <w:lang w:val="es-CO"/>
+        </w:rPr>
+      </w:pPr>
+      <w:r>
+        <w:rPr>
+          <w:lang w:val="es-CO"/>
+        </w:rPr>
+        <w:t>Figura 24. Interfaz de la plataforma para clonar un dispositivo IoT ya calibrado</w:t>
+      </w:r>
+      <w:r>
+        <w:rPr>
+          <w:lang w:val="es-CO"/>
+        </w:rPr>
+        <w:tab/>
+      </w:r>
+      <w:r>
+        <w:fldChar w:fldCharType="begin"/>
+      </w:r>
+      <w:r>
+        <w:rPr>
+          <w:lang w:val="es-CO"/>
+        </w:rPr>
+        <w:instrText>PAGEREF bm_fig24 \h</w:instrText>
       </w:r>
       <w:r>
         <w:fldChar w:fldCharType="separate"/>
@@ -4038,6 +4132,123 @@
         </w:rPr>
         <w:lastRenderedPageBreak/>
         <w:t>Desarrollar una plataforma digital para la compra y venta de excedentes energéticos entre usuarios, incorporando un sistema de subastas en tiempo real, dispositivos IoT domésticos y modelos de predicción de producción y consumo energético.</w:t>
+      </w:r>
+    </w:p>
+    <w:p>
+      <w:pPr>
+        <w:pStyle w:val="Ttulo3"/>
+        <w:spacing w:before="200" w:after="100" w:line="480" w:lineRule="auto"/>
+        <w:rPr>
+          <w:lang w:val="es-CO"/>
+        </w:rPr>
+      </w:pPr>
+      <w:bookmarkStart w:id="69" w:name="bm_objetivos_especificos"/>
+      <w:r>
+        <w:rPr>
+          <w:b/>
+          <w:bCs/>
+          <w:i/>
+          <w:iCs/>
+          <w:color w:val="000000"/>
+          <w:lang w:val="es-CO"/>
+        </w:rPr>
+        <w:t>Objetivos Específicos</w:t>
+      </w:r>
+      <w:bookmarkEnd w:id="69"/>
+    </w:p>
+    <w:p>
+      <w:pPr>
+        <w:pStyle w:val="Prrafodelista"/>
+        <w:numPr>
+          <w:ilvl w:val="0"/>
+          <w:numId w:val="2"/>
+        </w:numPr>
+        <w:spacing w:line="480" w:lineRule="auto"/>
+        <w:rPr>
+          <w:lang w:val="es-CO"/>
+        </w:rPr>
+      </w:pPr>
+      <w:r>
+        <w:rPr>
+          <w:lang w:val="es-CO"/>
+        </w:rPr>
+        <w:t xml:space="preserve">Garantizar, mediante el patrón Singleton, que toda la plataforma comparta un único estado consistente (usuarios, órdenes, dispositivos), incluso bajo acceso concurrente.</w:t>
+      </w:r>
+    </w:p>
+    <w:p>
+      <w:pPr>
+        <w:pStyle w:val="Prrafodelista"/>
+        <w:numPr>
+          <w:ilvl w:val="0"/>
+          <w:numId w:val="2"/>
+        </w:numPr>
+        <w:spacing w:line="480" w:lineRule="auto"/>
+        <w:rPr>
+          <w:lang w:val="es-CO"/>
+        </w:rPr>
+      </w:pPr>
+      <w:r>
+        <w:rPr>
+          <w:lang w:val="es-CO"/>
+        </w:rPr>
+        <w:t xml:space="preserve">Aplicar el patrón Factory Method para integrar distintos tipos de dispositivos IoT domésticos (paneles solares, baterías, medidores) sin acoplar su creación al resto del sistema.</w:t>
+      </w:r>
+    </w:p>
+    <w:p>
+      <w:pPr>
+        <w:pStyle w:val="Prrafodelista"/>
+        <w:numPr>
+          <w:ilvl w:val="0"/>
+          <w:numId w:val="2"/>
+        </w:numPr>
+        <w:spacing w:line="480" w:lineRule="auto"/>
+        <w:rPr>
+          <w:lang w:val="es-CO"/>
+        </w:rPr>
+      </w:pPr>
+      <w:r>
+        <w:rPr>
+          <w:lang w:val="es-CO"/>
+        </w:rPr>
+        <w:t xml:space="preserve">Aplicar el patrón Abstract Factory para que cada canal de notificación (correo, SMS, push) genere una familia coherente de avisos a los usuarios.</w:t>
+      </w:r>
+    </w:p>
+    <w:p>
+      <w:pPr>
+        <w:pStyle w:val="Prrafodelista"/>
+        <w:numPr>
+          <w:ilvl w:val="0"/>
+          <w:numId w:val="2"/>
+        </w:numPr>
+        <w:spacing w:line="480" w:lineRule="auto"/>
+        <w:rPr>
+          <w:lang w:val="es-CO"/>
+        </w:rPr>
+      </w:pPr>
+      <w:r>
+        <w:rPr>
+          <w:lang w:val="es-CO"/>
+        </w:rPr>
+        <w:t xml:space="preserve">Aplicar el patrón Builder para construir el reporte energético del usuario paso a paso y obtenerlo en distintas representaciones según el contexto de consumo.</w:t>
+      </w:r>
+    </w:p>
+    <w:p>
+      <w:pPr>
+        <w:pStyle w:val="Prrafodelista"/>
+        <w:numPr>
+          <w:ilvl w:val="0"/>
+          <w:numId w:val="2"/>
+        </w:numPr>
+        <w:spacing w:line="480" w:lineRule="auto"/>
+        <w:rPr>
+          <w:lang w:val="es-CO"/>
+        </w:rPr>
+      </w:pPr>
+      <w:r>
+        <w:rPr>
+          <w:lang w:val="es-CO"/>
+        </w:rPr>
+        <w:t xml:space="preserve">Aplicar el patrón Prototype para permitir la clonación de dispositivos IoT ya calibrados, reduciendo la configuración repetitiva en instalaciones con varios dispositivos similares.</w:t>
       </w:r>
     </w:p>
     <w:p>
@@ -5759,6 +5970,313 @@
     </w:p>
     <w:p>
       <w:pPr>
+        <w:spacing w:before="200"/>
+        <w:rPr>
+          <w:lang w:val="es-CO"/>
+        </w:rPr>
+      </w:pPr>
+      <w:bookmarkStart w:id="68" w:name="bm_fig90"/>
+      <w:r>
+        <w:rPr>
+          <w:b/>
+          <w:bCs/>
+          <w:lang w:val="es-CO"/>
+        </w:rPr>
+        <w:t>Figura 6</w:t>
+      </w:r>
+      <w:bookmarkEnd w:id="68"/>
+    </w:p>
+    <w:p>
+      <w:pPr>
+        <w:rPr>
+          <w:lang w:val="es-CO"/>
+        </w:rPr>
+      </w:pPr>
+      <w:r>
+        <w:rPr>
+          <w:i/>
+          <w:iCs/>
+          <w:lang w:val="es-CO"/>
+        </w:rPr>
+        <w:t xml:space="preserve">Fábrica abstracta DispositivoIoTFactory y una de sus fábricas concretas en factory_method.py</w:t>
+      </w:r>
+    </w:p>
+    <w:p>
+      <w:pPr>
+        <w:spacing w:before="120"/>
+        <w:ind w:left="720"/>
+        <w:rPr>
+          <w:lang w:val="es-CO"/>
+        </w:rPr>
+      </w:pPr>
+      <w:r>
+        <w:rPr>
+          <w:rFonts w:ascii="Courier New" w:eastAsia="Courier New" w:hAnsi="Courier New" w:cs="Courier New"/>
+          <w:sz w:val="20"/>
+          <w:szCs w:val="20"/>
+          <w:lang w:val="es-CO"/>
+        </w:rPr>
+        <w:t xml:space="preserve">class DispositivoIoTFactory(ABC):</w:t>
+      </w:r>
+    </w:p>
+    <w:p>
+      <w:pPr>
+        <w:spacing w:before="120"/>
+        <w:ind w:left="720"/>
+        <w:rPr>
+          <w:lang w:val="es-CO"/>
+        </w:rPr>
+      </w:pPr>
+      <w:r>
+        <w:rPr>
+          <w:rFonts w:ascii="Courier New" w:eastAsia="Courier New" w:hAnsi="Courier New" w:cs="Courier New"/>
+          <w:sz w:val="20"/>
+          <w:szCs w:val="20"/>
+          <w:lang w:val="es-CO"/>
+        </w:rPr>
+        <w:t xml:space="preserve">    @abstractmethod</w:t>
+      </w:r>
+    </w:p>
+    <w:p>
+      <w:pPr>
+        <w:spacing w:before="120"/>
+        <w:ind w:left="720"/>
+        <w:rPr>
+          <w:lang w:val="es-CO"/>
+        </w:rPr>
+      </w:pPr>
+      <w:r>
+        <w:rPr>
+          <w:rFonts w:ascii="Courier New" w:eastAsia="Courier New" w:hAnsi="Courier New" w:cs="Courier New"/>
+          <w:sz w:val="20"/>
+          <w:szCs w:val="20"/>
+          <w:lang w:val="es-CO"/>
+        </w:rPr>
+        <w:t xml:space="preserve">    def crear_dispositivo(self, id_dispositivo, usuario_id, umbral_min, umbral_max) -&gt; DispositivoIoT: ...</w:t>
+      </w:r>
+    </w:p>
+    <w:p>
+      <w:pPr>
+        <w:spacing w:before="120"/>
+        <w:ind w:left="720"/>
+        <w:rPr>
+          <w:lang w:val="es-CO"/>
+        </w:rPr>
+      </w:pPr>
+      <w:r>
+        <w:rPr>
+          <w:rFonts w:ascii="Courier New" w:eastAsia="Courier New" w:hAnsi="Courier New" w:cs="Courier New"/>
+          <w:sz w:val="20"/>
+          <w:szCs w:val="20"/>
+          <w:lang w:val="es-CO"/>
+        </w:rPr>
+        <w:t xml:space="preserve"/>
+      </w:r>
+    </w:p>
+    <w:p>
+      <w:pPr>
+        <w:spacing w:before="120"/>
+        <w:ind w:left="720"/>
+        <w:rPr>
+          <w:lang w:val="es-CO"/>
+        </w:rPr>
+      </w:pPr>
+      <w:r>
+        <w:rPr>
+          <w:rFonts w:ascii="Courier New" w:eastAsia="Courier New" w:hAnsi="Courier New" w:cs="Courier New"/>
+          <w:sz w:val="20"/>
+          <w:szCs w:val="20"/>
+          <w:lang w:val="es-CO"/>
+        </w:rPr>
+        <w:t xml:space="preserve">    def registrar(self, id_dispositivo, usuario_id, umbral_min=None, umbral_max=None):</w:t>
+      </w:r>
+    </w:p>
+    <w:p>
+      <w:pPr>
+        <w:spacing w:before="120"/>
+        <w:ind w:left="720"/>
+        <w:rPr>
+          <w:lang w:val="es-CO"/>
+        </w:rPr>
+      </w:pPr>
+      <w:r>
+        <w:rPr>
+          <w:rFonts w:ascii="Courier New" w:eastAsia="Courier New" w:hAnsi="Courier New" w:cs="Courier New"/>
+          <w:sz w:val="20"/>
+          <w:szCs w:val="20"/>
+          <w:lang w:val="es-CO"/>
+        </w:rPr>
+        <w:t xml:space="preserve">        if umbral_min is None and umbral_max is None:</w:t>
+      </w:r>
+    </w:p>
+    <w:p>
+      <w:pPr>
+        <w:spacing w:before="120"/>
+        <w:ind w:left="720"/>
+        <w:rPr>
+          <w:lang w:val="es-CO"/>
+        </w:rPr>
+      </w:pPr>
+      <w:r>
+        <w:rPr>
+          <w:rFonts w:ascii="Courier New" w:eastAsia="Courier New" w:hAnsi="Courier New" w:cs="Courier New"/>
+          <w:sz w:val="20"/>
+          <w:szCs w:val="20"/>
+          <w:lang w:val="es-CO"/>
+        </w:rPr>
+        <w:t xml:space="preserve">            umbral_min, umbral_max = UMBRALES_IOT.get(self.tipo, (None, None))</w:t>
+      </w:r>
+    </w:p>
+    <w:p>
+      <w:pPr>
+        <w:spacing w:before="120"/>
+        <w:ind w:left="720"/>
+        <w:rPr>
+          <w:lang w:val="es-CO"/>
+        </w:rPr>
+      </w:pPr>
+      <w:r>
+        <w:rPr>
+          <w:rFonts w:ascii="Courier New" w:eastAsia="Courier New" w:hAnsi="Courier New" w:cs="Courier New"/>
+          <w:sz w:val="20"/>
+          <w:szCs w:val="20"/>
+          <w:lang w:val="es-CO"/>
+        </w:rPr>
+        <w:t xml:space="preserve">        return self.crear_dispositivo(id_dispositivo, usuario_id, umbral_min, umbral_max)</w:t>
+      </w:r>
+    </w:p>
+    <w:p>
+      <w:pPr>
+        <w:spacing w:before="120"/>
+        <w:ind w:left="720"/>
+        <w:rPr>
+          <w:lang w:val="es-CO"/>
+        </w:rPr>
+      </w:pPr>
+      <w:r>
+        <w:rPr>
+          <w:rFonts w:ascii="Courier New" w:eastAsia="Courier New" w:hAnsi="Courier New" w:cs="Courier New"/>
+          <w:sz w:val="20"/>
+          <w:szCs w:val="20"/>
+          <w:lang w:val="es-CO"/>
+        </w:rPr>
+        <w:t xml:space="preserve"/>
+      </w:r>
+    </w:p>
+    <w:p>
+      <w:pPr>
+        <w:spacing w:before="120"/>
+        <w:ind w:left="720"/>
+        <w:rPr>
+          <w:lang w:val="es-CO"/>
+        </w:rPr>
+      </w:pPr>
+      <w:r>
+        <w:rPr>
+          <w:rFonts w:ascii="Courier New" w:eastAsia="Courier New" w:hAnsi="Courier New" w:cs="Courier New"/>
+          <w:sz w:val="20"/>
+          <w:szCs w:val="20"/>
+          <w:lang w:val="es-CO"/>
+        </w:rPr>
+        <w:t xml:space="preserve"/>
+      </w:r>
+    </w:p>
+    <w:p>
+      <w:pPr>
+        <w:spacing w:before="120"/>
+        <w:ind w:left="720"/>
+        <w:rPr>
+          <w:lang w:val="es-CO"/>
+        </w:rPr>
+      </w:pPr>
+      <w:r>
+        <w:rPr>
+          <w:rFonts w:ascii="Courier New" w:eastAsia="Courier New" w:hAnsi="Courier New" w:cs="Courier New"/>
+          <w:sz w:val="20"/>
+          <w:szCs w:val="20"/>
+          <w:lang w:val="es-CO"/>
+        </w:rPr>
+        <w:t xml:space="preserve">class PanelSolarFactory(DispositivoIoTFactory):</w:t>
+      </w:r>
+    </w:p>
+    <w:p>
+      <w:pPr>
+        <w:spacing w:before="120"/>
+        <w:ind w:left="720"/>
+        <w:rPr>
+          <w:lang w:val="es-CO"/>
+        </w:rPr>
+      </w:pPr>
+      <w:r>
+        <w:rPr>
+          <w:rFonts w:ascii="Courier New" w:eastAsia="Courier New" w:hAnsi="Courier New" w:cs="Courier New"/>
+          <w:sz w:val="20"/>
+          <w:szCs w:val="20"/>
+          <w:lang w:val="es-CO"/>
+        </w:rPr>
+        <w:t xml:space="preserve">    tipo = "panel_solar"</w:t>
+      </w:r>
+    </w:p>
+    <w:p>
+      <w:pPr>
+        <w:spacing w:before="120"/>
+        <w:ind w:left="720"/>
+        <w:rPr>
+          <w:lang w:val="es-CO"/>
+        </w:rPr>
+      </w:pPr>
+      <w:r>
+        <w:rPr>
+          <w:rFonts w:ascii="Courier New" w:eastAsia="Courier New" w:hAnsi="Courier New" w:cs="Courier New"/>
+          <w:sz w:val="20"/>
+          <w:szCs w:val="20"/>
+          <w:lang w:val="es-CO"/>
+        </w:rPr>
+        <w:t xml:space="preserve">    def crear_dispositivo(self, id_dispositivo, usuario_id, umbral_min, umbral_max):</w:t>
+      </w:r>
+    </w:p>
+    <w:p>
+      <w:pPr>
+        <w:spacing w:before="120"/>
+        <w:ind w:left="720"/>
+        <w:rPr>
+          <w:lang w:val="es-CO"/>
+        </w:rPr>
+      </w:pPr>
+      <w:r>
+        <w:rPr>
+          <w:rFonts w:ascii="Courier New" w:eastAsia="Courier New" w:hAnsi="Courier New" w:cs="Courier New"/>
+          <w:sz w:val="20"/>
+          <w:szCs w:val="20"/>
+          <w:lang w:val="es-CO"/>
+        </w:rPr>
+        <w:t xml:space="preserve">        return DispositivoIoT(id_dispositivo, usuario_id, self.tipo, umbral_min, umbral_max)</w:t>
+      </w:r>
+    </w:p>
+    <w:p>
+      <w:pPr>
+        <w:spacing w:before="120"/>
+        <w:rPr>
+          <w:lang w:val="es-CO"/>
+        </w:rPr>
+      </w:pPr>
+      <w:r>
+        <w:rPr>
+          <w:i/>
+          <w:iCs/>
+          <w:lang w:val="es-CO"/>
+        </w:rPr>
+        <w:t xml:space="preserve">Nota. </w:t>
+      </w:r>
+      <w:r>
+        <w:rPr>
+          <w:lang w:val="es-CO"/>
+        </w:rPr>
+        <w:t xml:space="preserve">Extracto de plataforma-energia-app/backend/factory_method.py. La lógica común (registrar) aplica los umbrales por defecto del tipo antes de delegar la construcción al Factory Method (crear_dispositivo); cada fábrica concreta solo decide qué tipo instanciar. Este módulo reemplazó la instanciación directa que antes hacía PlataformaEnergia.conectar_dispositivo().</w:t>
+      </w:r>
+    </w:p>
+    <w:p>
+      <w:pPr>
         <w:pStyle w:val="Ttulo3"/>
         <w:spacing w:before="200" w:after="100" w:line="480" w:lineRule="auto"/>
         <w:rPr>
@@ -5831,7 +6349,7 @@
           <w:lang w:val="es-CO"/>
         </w:rPr>
       </w:pPr>
-      <w:bookmarkStart w:id="24" w:name="bm_fig6"/>
+      <w:bookmarkStart w:id="24" w:name="bm_fig7"/>
       <w:r>
         <w:rPr>
           <w:b/>
@@ -5839,7 +6357,7 @@
           <w:lang w:val="es-CO"/>
         </w:rPr>
         <w:lastRenderedPageBreak/>
-        <w:t>Figura 6</w:t>
+        <w:t>Figura 7</w:t>
       </w:r>
       <w:bookmarkEnd w:id="24"/>
     </w:p>
@@ -6071,7 +6589,7 @@
         <w:rPr>
           <w:lang w:val="es-CO"/>
         </w:rPr>
-        <w:t>La validación del patrón Factory Method se realizó mediante pruebas unitarias automatizadas con pytest, las cuales verifican que el registro de fábricas y la creación de cada tipo de dispositivo IoT funcionan correctamente. Como se observa en la Figura 7, la suite Patrones/Semana 3/test_factory_method.py ejecutó 16 pruebas, todas ellas superadas exitosamente, lo que confirma junto con la validación previa del patrón Singleton que el conjunto completo de pruebas automatizadas del proyecto pasa sin errores.</w:t>
+        <w:t>La validación del patrón Factory Method se realizó mediante pruebas unitarias automatizadas con pytest, las cuales verifican que el registro de fábricas y la creación de cada tipo de dispositivo IoT funcionan correctamente. Como se observa en la Figura 8, la suite Patrones/Semana 3/test_factory_method.py ejecutó 16 pruebas, todas ellas superadas exitosamente, lo que confirma junto con la validación previa del patrón Singleton que el conjunto completo de pruebas automatizadas del proyecto pasa sin errores.</w:t>
       </w:r>
     </w:p>
     <w:p>
@@ -6081,14 +6599,14 @@
           <w:lang w:val="es-CO"/>
         </w:rPr>
       </w:pPr>
-      <w:bookmarkStart w:id="28" w:name="bm_fig7"/>
-      <w:r>
-        <w:rPr>
-          <w:b/>
-          <w:bCs/>
-          <w:lang w:val="es-CO"/>
-        </w:rPr>
-        <w:t>Figura 7</w:t>
+      <w:bookmarkStart w:id="28" w:name="bm_fig8"/>
+      <w:r>
+        <w:rPr>
+          <w:b/>
+          <w:bCs/>
+          <w:lang w:val="es-CO"/>
+        </w:rPr>
+        <w:t>Figura 8</w:t>
       </w:r>
       <w:bookmarkEnd w:id="28"/>
     </w:p>
@@ -6190,7 +6708,7 @@
         <w:rPr>
           <w:lang w:val="es-CO"/>
         </w:rPr>
-        <w:t>Además de las pruebas unitarias, el funcionamiento del patrón se validó de manera funcional a través de la API y de la interfaz de la plataforma. La Figura 8 muestra la documentación interactiva (Swagger) generada por FastAPI, donde se listan los endpoints de dispositivos IoT —entre ellos GET y POST /iot/dispositivos— que internamente invocan el punto único de resolución crear_dispositivo(tipo, id, usuario_id) del Factory Method.</w:t>
+        <w:t>Además de las pruebas unitarias, el funcionamiento del patrón se validó de manera funcional a través de la API y de la interfaz de la plataforma. La Figura 9 muestra la documentación interactiva (Swagger) generada por FastAPI, donde se listan los endpoints de dispositivos IoT —entre ellos GET y POST /iot/dispositivos— que internamente invocan el punto único de resolución crear_dispositivo(tipo, id, usuario_id) del Factory Method.</w:t>
       </w:r>
     </w:p>
     <w:p>
@@ -6200,7 +6718,7 @@
           <w:lang w:val="es-CO"/>
         </w:rPr>
       </w:pPr>
-      <w:bookmarkStart w:id="29" w:name="bm_fig8"/>
+      <w:bookmarkStart w:id="29" w:name="bm_fig9"/>
       <w:r>
         <w:rPr>
           <w:b/>
@@ -6208,7 +6726,7 @@
           <w:lang w:val="es-CO"/>
         </w:rPr>
         <w:lastRenderedPageBreak/>
-        <w:t>Figura 8</w:t>
+        <w:t>Figura 9</w:t>
       </w:r>
       <w:bookmarkEnd w:id="29"/>
     </w:p>
@@ -6310,7 +6828,7 @@
         <w:rPr>
           <w:lang w:val="es-CO"/>
         </w:rPr>
-        <w:t>Por su parte, la Figura 9 evidencia el uso del patrón desde la interfaz de usuario de la plataforma: en la pestaña IoT &amp; Predicción, el formulario Conectar Dispositivo permite seleccionar el tipo de dispositivo (por ejemplo, Batería) antes de conectarlo, selección que la API traduce en el parámetro tipo recibido por crear_dispositivo. Es precisamente este parámetro el que el Factory Method utiliza para decidir, en tiempo de ejecución, qué producto concreto (PanelSolar, BateriaInteligente o MedidorInteligente) debe instanciarse, sin que el resto de la plataforma necesite conocer esa decisión.</w:t>
+        <w:t>Por su parte, la Figura 10 evidencia el uso del patrón desde la interfaz de usuario de la plataforma: en la pestaña IoT &amp; Predicción, el formulario Conectar Dispositivo permite seleccionar el tipo de dispositivo (por ejemplo, Batería) antes de conectarlo, selección que la API traduce en el parámetro tipo recibido por crear_dispositivo. Es precisamente este parámetro el que el Factory Method utiliza para decidir, en tiempo de ejecución, qué producto concreto (PanelSolar, BateriaInteligente o MedidorInteligente) debe instanciarse, sin que el resto de la plataforma necesite conocer esa decisión.</w:t>
       </w:r>
     </w:p>
     <w:p>
@@ -6320,14 +6838,14 @@
           <w:lang w:val="es-CO"/>
         </w:rPr>
       </w:pPr>
-      <w:bookmarkStart w:id="30" w:name="bm_fig9"/>
-      <w:r>
-        <w:rPr>
-          <w:b/>
-          <w:bCs/>
-          <w:lang w:val="es-CO"/>
-        </w:rPr>
-        <w:t>Figura 9</w:t>
+      <w:bookmarkStart w:id="30" w:name="bm_fig10"/>
+      <w:r>
+        <w:rPr>
+          <w:b/>
+          <w:bCs/>
+          <w:lang w:val="es-CO"/>
+        </w:rPr>
+        <w:t>Figura 10</w:t>
       </w:r>
       <w:bookmarkEnd w:id="30"/>
     </w:p>
@@ -6877,14 +7395,14 @@
           <w:lang w:val="es-CO"/>
         </w:rPr>
       </w:pPr>
-      <w:bookmarkStart w:id="34" w:name="bm_fig10"/>
-      <w:r>
-        <w:rPr>
-          <w:b/>
-          <w:bCs/>
-          <w:lang w:val="es-CO"/>
-        </w:rPr>
-        <w:t>Figura 10</w:t>
+      <w:bookmarkStart w:id="34" w:name="bm_fig11"/>
+      <w:r>
+        <w:rPr>
+          <w:b/>
+          <w:bCs/>
+          <w:lang w:val="es-CO"/>
+        </w:rPr>
+        <w:t>Figura 11</w:t>
       </w:r>
       <w:bookmarkEnd w:id="34"/>
     </w:p>
@@ -7429,14 +7947,14 @@
           <w:lang w:val="es-CO"/>
         </w:rPr>
       </w:pPr>
-      <w:bookmarkStart w:id="36" w:name="bm_fig11"/>
-      <w:r>
-        <w:rPr>
-          <w:b/>
-          <w:bCs/>
-          <w:lang w:val="es-CO"/>
-        </w:rPr>
-        <w:t>Figura 11</w:t>
+      <w:bookmarkStart w:id="36" w:name="bm_fig12"/>
+      <w:r>
+        <w:rPr>
+          <w:b/>
+          <w:bCs/>
+          <w:lang w:val="es-CO"/>
+        </w:rPr>
+        <w:t>Figura 12</w:t>
       </w:r>
       <w:bookmarkEnd w:id="36"/>
     </w:p>
@@ -7686,7 +8204,7 @@
         <w:rPr>
           <w:lang w:val="es-CO"/>
         </w:rPr>
-        <w:t>La validación del patrón Abstract Factory se realizó mediante pruebas unitarias automatizadas con pytest, que verifican que el código cliente nunca instancia notificadores concretos, que cada fábrica de canal construye la familia completa (transacción, alerta IoT y reporte) y que todos los mensajes de un mismo servicio salen por el mismo canal respetando sus restricciones de formato. Como se observa en la Figura 12, la suite Patrones/Semana 4/test_abstract_factory.py ejecutó 27 casos, todos superados, y el conjunto completo de pruebas del proyecto —Singleton, Factory Method y Abstract Factory— pasa sin errores.</w:t>
+        <w:t>La validación del patrón Abstract Factory se realizó mediante pruebas unitarias automatizadas con pytest, que verifican que el código cliente nunca instancia notificadores concretos, que cada fábrica de canal construye la familia completa (transacción, alerta IoT y reporte) y que todos los mensajes de un mismo servicio salen por el mismo canal respetando sus restricciones de formato. Como se observa en la Figura 13, la suite Patrones/Semana 4/test_abstract_factory.py ejecutó 27 casos, todos superados, y el conjunto completo de pruebas del proyecto —Singleton, Factory Method y Abstract Factory— pasa sin errores.</w:t>
       </w:r>
     </w:p>
     <w:p>
@@ -7696,14 +8214,14 @@
           <w:lang w:val="es-CO"/>
         </w:rPr>
       </w:pPr>
-      <w:bookmarkStart w:id="40" w:name="bm_fig12"/>
-      <w:r>
-        <w:rPr>
-          <w:b/>
-          <w:bCs/>
-          <w:lang w:val="es-CO"/>
-        </w:rPr>
-        <w:t>Figura 12</w:t>
+      <w:bookmarkStart w:id="40" w:name="bm_fig13"/>
+      <w:r>
+        <w:rPr>
+          <w:b/>
+          <w:bCs/>
+          <w:lang w:val="es-CO"/>
+        </w:rPr>
+        <w:t>Figura 13</w:t>
       </w:r>
       <w:bookmarkEnd w:id="40"/>
     </w:p>
@@ -7917,7 +8435,7 @@
         <w:rPr>
           <w:lang w:val="es-CO"/>
         </w:rPr>
-        <w:t>Además de las pruebas unitarias, el funcionamiento del patrón se validó de manera funcional a través de la API y de la interfaz. La Figura 13 muestra la documentación interactiva (Swagger) de FastAPI con los endpoints de notificaciones —GET /notificaciones, GET /notificaciones/canales, PUT /usuarios/me/canal y POST /reportes/generar—, que internamente invocan crear_servicio(canal) para construir la familia de avisos del usuario.</w:t>
+        <w:t>Además de las pruebas unitarias, el funcionamiento del patrón se validó de manera funcional a través de la API y de la interfaz. La Figura 14 muestra la documentación interactiva (Swagger) de FastAPI con los endpoints de notificaciones —GET /notificaciones, GET /notificaciones/canales, PUT /usuarios/me/canal y POST /reportes/generar—, que internamente invocan crear_servicio(canal) para construir la familia de avisos del usuario.</w:t>
       </w:r>
     </w:p>
     <w:p>
@@ -7927,14 +8445,14 @@
           <w:lang w:val="es-CO"/>
         </w:rPr>
       </w:pPr>
-      <w:bookmarkStart w:id="41" w:name="bm_fig13"/>
-      <w:r>
-        <w:rPr>
-          <w:b/>
-          <w:bCs/>
-          <w:lang w:val="es-CO"/>
-        </w:rPr>
-        <w:t>Figura 13</w:t>
+      <w:bookmarkStart w:id="41" w:name="bm_fig14"/>
+      <w:r>
+        <w:rPr>
+          <w:b/>
+          <w:bCs/>
+          <w:lang w:val="es-CO"/>
+        </w:rPr>
+        <w:t>Figura 14</w:t>
       </w:r>
       <w:bookmarkEnd w:id="41"/>
     </w:p>
@@ -8067,7 +8585,7 @@
         <w:rPr>
           <w:lang w:val="es-CO"/>
         </w:rPr>
-        <w:t>Por su parte, la Figura 14 evidencia el uso del patrón desde la interfaz de usuario: en la pestaña Notificaciones, un mismo evento —el cierre de una operación en la subasta— se presenta a cada usuario con el formato de su canal (un SMS breve sin asunto para quien eligió ese medio y una notificación push con payload para quien optó por la aplicación móvil). Es la fábrica de canal seleccionada según canal_notificacion la que determina, en tiempo de ejecución, qué familia de notificadores construye los mensajes.</w:t>
+        <w:t>Por su parte, la Figura 15 evidencia el uso del patrón desde la interfaz de usuario: en la pestaña Notificaciones, un mismo evento —el cierre de una operación en la subasta— se presenta a cada usuario con el formato de su canal (un SMS breve sin asunto para quien eligió ese medio y una notificación push con payload para quien optó por la aplicación móvil). Es la fábrica de canal seleccionada según canal_notificacion la que determina, en tiempo de ejecución, qué familia de notificadores construye los mensajes.</w:t>
       </w:r>
     </w:p>
     <w:p>
@@ -8079,7 +8597,7 @@
           <w:lang w:val="es-CO"/>
         </w:rPr>
       </w:pPr>
-      <w:bookmarkStart w:id="42" w:name="bm_fig14"/>
+      <w:bookmarkStart w:id="42" w:name="bm_fig15"/>
     </w:p>
     <w:p>
       <w:pPr>
@@ -8124,7 +8642,7 @@
           <w:bCs/>
           <w:lang w:val="es-CO"/>
         </w:rPr>
-        <w:t>Figura 14</w:t>
+        <w:t>Figura 15</w:t>
       </w:r>
       <w:bookmarkEnd w:id="42"/>
     </w:p>
@@ -8718,14 +9236,14 @@
           <w:lang w:val="es-CO"/>
         </w:rPr>
       </w:pPr>
-      <w:bookmarkStart w:id="46" w:name="bm_fig15"/>
-      <w:r>
-        <w:rPr>
-          <w:b/>
-          <w:bCs/>
-          <w:lang w:val="es-CO"/>
-        </w:rPr>
-        <w:t>Figura 15</w:t>
+      <w:bookmarkStart w:id="46" w:name="bm_fig16"/>
+      <w:r>
+        <w:rPr>
+          <w:b/>
+          <w:bCs/>
+          <w:lang w:val="es-CO"/>
+        </w:rPr>
+        <w:t>Figura 16</w:t>
       </w:r>
       <w:bookmarkEnd w:id="46"/>
     </w:p>
@@ -9235,14 +9753,14 @@
           <w:lang w:val="es-CO"/>
         </w:rPr>
       </w:pPr>
-      <w:bookmarkStart w:id="48" w:name="bm_fig16"/>
-      <w:r>
-        <w:rPr>
-          <w:b/>
-          <w:bCs/>
-          <w:lang w:val="es-CO"/>
-        </w:rPr>
-        <w:t>Figura 16</w:t>
+      <w:bookmarkStart w:id="48" w:name="bm_fig17"/>
+      <w:r>
+        <w:rPr>
+          <w:b/>
+          <w:bCs/>
+          <w:lang w:val="es-CO"/>
+        </w:rPr>
+        <w:t>Figura 17</w:t>
       </w:r>
       <w:bookmarkEnd w:id="48"/>
     </w:p>
@@ -9480,7 +9998,7 @@
         <w:rPr>
           <w:lang w:val="es-CO"/>
         </w:rPr>
-        <w:t>respeta el contrato que consume el canal de notificación. Como se observa en la Figura 17, la suite Patrones/Semana 5/test_builder.py ejecutó 30 casos, todos superados, y el conjunto completo de pruebas del proyecto —Singleton, Factory Method, Abstract Factory y Builder— pasa sin errores.</w:t>
+        <w:t>respeta el contrato que consume el canal de notificación. Como se observa en la Figura 18, la suite Patrones/Semana 5/test_builder.py ejecutó 30 casos, todos superados, y el conjunto completo de pruebas del proyecto —Singleton, Factory Method, Abstract Factory y Builder— pasa sin errores.</w:t>
       </w:r>
     </w:p>
     <w:p>
@@ -9490,14 +10008,14 @@
           <w:lang w:val="es-CO"/>
         </w:rPr>
       </w:pPr>
-      <w:bookmarkStart w:id="52" w:name="bm_fig17"/>
-      <w:r>
-        <w:rPr>
-          <w:b/>
-          <w:bCs/>
-          <w:lang w:val="es-CO"/>
-        </w:rPr>
-        <w:t>Figura 17</w:t>
+      <w:bookmarkStart w:id="52" w:name="bm_fig18"/>
+      <w:r>
+        <w:rPr>
+          <w:b/>
+          <w:bCs/>
+          <w:lang w:val="es-CO"/>
+        </w:rPr>
+        <w:t>Figura 18</w:t>
       </w:r>
       <w:bookmarkEnd w:id="52"/>
     </w:p>
@@ -9702,7 +10220,7 @@
         <w:rPr>
           <w:lang w:val="es-CO"/>
         </w:rPr>
-        <w:t>Además de las pruebas unitarias, el funcionamiento del patrón se validó de manera funcional a través de la API y de la interfaz. La Figura 18 muestra la documentación interactiva (Swagger) de FastAPI con el endpoint POST /reportes/generar, que recibe el parámetro formato y devuelve el reporte construido junto con el aviso dejado en la bandeja del usuario.</w:t>
+        <w:t>Además de las pruebas unitarias, el funcionamiento del patrón se validó de manera funcional a través de la API y de la interfaz. La Figura 19 muestra la documentación interactiva (Swagger) de FastAPI con el endpoint POST /reportes/generar, que recibe el parámetro formato y devuelve el reporte construido junto con el aviso dejado en la bandeja del usuario.</w:t>
       </w:r>
     </w:p>
     <w:p>
@@ -9712,7 +10230,7 @@
           <w:lang w:val="es-CO"/>
         </w:rPr>
       </w:pPr>
-      <w:bookmarkStart w:id="53" w:name="bm_fig18"/>
+      <w:bookmarkStart w:id="53" w:name="bm_fig19"/>
       <w:r>
         <w:rPr>
           <w:b/>
@@ -9720,7 +10238,7 @@
           <w:lang w:val="es-CO"/>
         </w:rPr>
         <w:lastRenderedPageBreak/>
-        <w:t>Figura 18</w:t>
+        <w:t>Figura 19</w:t>
       </w:r>
       <w:bookmarkEnd w:id="53"/>
     </w:p>
@@ -9864,7 +10382,7 @@
         <w:rPr>
           <w:lang w:val="es-CO"/>
         </w:rPr>
-        <w:t>Por su parte, la Figura 19 evidencia el uso del patrón desde la interfaz: en la pestaña Notificaciones, el formulario Generar reporte permite elegir el formato antes de construirlo, y el reporte resultante se muestra según la representación seleccionada —secciones tituladas para el formato detallado, texto plano para el formato texto—. Es el builder correspondiente al formato el que determina la estructura del resultado, mientras que el resumen que llega a la bandeja siempre sale por el canal del usuario.</w:t>
+        <w:t>Por su parte, la Figura 20 evidencia el uso del patrón desde la interfaz: en la pestaña Notificaciones, el formulario Generar reporte permite elegir el formato antes de construirlo, y el reporte resultante se muestra según la representación seleccionada —secciones tituladas para el formato detallado, texto plano para el formato texto—. Es el builder correspondiente al formato el que determina la estructura del resultado, mientras que el resumen que llega a la bandeja siempre sale por el canal del usuario.</w:t>
       </w:r>
     </w:p>
     <w:p>
@@ -9876,7 +10394,7 @@
           <w:lang w:val="es-CO"/>
         </w:rPr>
       </w:pPr>
-      <w:bookmarkStart w:id="54" w:name="bm_fig19"/>
+      <w:bookmarkStart w:id="54" w:name="bm_fig20"/>
     </w:p>
     <w:p>
       <w:pPr>
@@ -9941,7 +10459,7 @@
           <w:bCs/>
           <w:lang w:val="es-CO"/>
         </w:rPr>
-        <w:t>Figura 19</w:t>
+        <w:t>Figura 20</w:t>
       </w:r>
       <w:bookmarkEnd w:id="54"/>
     </w:p>
@@ -10425,14 +10943,14 @@
           <w:lang w:val="es-CO"/>
         </w:rPr>
       </w:pPr>
-      <w:bookmarkStart w:id="60" w:name="bm_fig20"/>
-      <w:r>
-        <w:rPr>
-          <w:b/>
-          <w:bCs/>
-          <w:lang w:val="es-CO"/>
-        </w:rPr>
-        <w:t>Figura 20</w:t>
+      <w:bookmarkStart w:id="60" w:name="bm_fig21"/>
+      <w:r>
+        <w:rPr>
+          <w:b/>
+          <w:bCs/>
+          <w:lang w:val="es-CO"/>
+        </w:rPr>
+        <w:t>Figura 21</w:t>
       </w:r>
       <w:bookmarkEnd w:id="60"/>
     </w:p>
@@ -10730,14 +11248,14 @@
           <w:lang w:val="es-CO"/>
         </w:rPr>
       </w:pPr>
-      <w:bookmarkStart w:id="67" w:name="bm_fig21"/>
-      <w:r>
-        <w:rPr>
-          <w:b/>
-          <w:bCs/>
-          <w:lang w:val="es-CO"/>
-        </w:rPr>
-        <w:t>Figura 21</w:t>
+      <w:bookmarkStart w:id="67" w:name="bm_fig22"/>
+      <w:r>
+        <w:rPr>
+          <w:b/>
+          <w:bCs/>
+          <w:lang w:val="es-CO"/>
+        </w:rPr>
+        <w:t>Figura 22</w:t>
       </w:r>
       <w:bookmarkEnd w:id="67"/>
     </w:p>
@@ -10948,7 +11466,7 @@
         <w:rPr>
           <w:lang w:val="es-CO"/>
         </w:rPr>
-        <w:t>La validación del patrón Prototype se realizó mediante pruebas unitarias automatizadas con pytest, que verifican que clonar produce un objeto distinto del original, que la copia es profunda —el clon no comparte listas mutables con el original ni con otros clones—, que los overrides puntuales no alteran el original, y que el RegistroPlantillas resuelve plantillas por nombre con el mismo contrato que las demás fábricas del proyecto. Como se observa en la Figura 22, la suite Documentacion/Semana 6/test_prototype.py ejecutó 24 casos, todos superados, y el conjunto completo de pruebas del proyecto —Singleton, Factory Method, Abstract Factory, Builder y Prototype— pasa sin errores (115 casos en total).</w:t>
+        <w:t>La validación del patrón Prototype se realizó mediante pruebas unitarias automatizadas con pytest, que verifican que clonar produce un objeto distinto del original, que la copia es profunda —el clon no comparte listas mutables con el original ni con otros clones—, que los overrides puntuales no alteran el original, y que el RegistroPlantillas resuelve plantillas por nombre con el mismo contrato que las demás fábricas del proyecto. Como se observa en la Figura 23, la suite Documentacion/Semana 6/test_prototype.py ejecutó 24 casos, todos superados, y el conjunto completo de pruebas del proyecto —Singleton, Factory Method, Abstract Factory, Builder y Prototype— pasa sin errores (115 casos en total).</w:t>
       </w:r>
     </w:p>
     <w:p>
@@ -10958,14 +11476,14 @@
           <w:lang w:val="es-CO"/>
         </w:rPr>
       </w:pPr>
-      <w:bookmarkStart w:id="65" w:name="bm_fig22"/>
-      <w:r>
-        <w:rPr>
-          <w:b/>
-          <w:bCs/>
-          <w:lang w:val="es-CO"/>
-        </w:rPr>
-        <w:t>Figura 22</w:t>
+      <w:bookmarkStart w:id="65" w:name="bm_fig23"/>
+      <w:r>
+        <w:rPr>
+          <w:b/>
+          <w:bCs/>
+          <w:lang w:val="es-CO"/>
+        </w:rPr>
+        <w:t>Figura 23</w:t>
       </w:r>
       <w:bookmarkEnd w:id="65"/>
     </w:p>
@@ -11067,7 +11585,7 @@
         <w:rPr>
           <w:lang w:val="es-CO"/>
         </w:rPr>
-        <w:t>Además de las pruebas unitarias, el funcionamiento del patrón se validó de manera funcional desde la interfaz. La Figura 23 muestra la pestaña IoT &amp; Predicción de la plataforma Voltia, con la tabla Dispositivos conectados —que expone los umbrales de cada uno— y la tarjeta Clonar dispositivo calibrado, donde se elige el dispositivo de origen, se asigna un id nuevo y, opcionalmente, se ajusta un umbral puntual antes de clonar.</w:t>
+        <w:t>Además de las pruebas unitarias, el funcionamiento del patrón se validó de manera funcional desde la interfaz. La Figura 24 muestra la pestaña IoT &amp; Predicción de la plataforma Voltia, con la tabla Dispositivos conectados —que expone los umbrales de cada uno— y la tarjeta Clonar dispositivo calibrado, donde se elige el dispositivo de origen, se asigna un id nuevo y, opcionalmente, se ajusta un umbral puntual antes de clonar.</w:t>
       </w:r>
     </w:p>
     <w:p>
@@ -11077,14 +11595,14 @@
           <w:lang w:val="es-CO"/>
         </w:rPr>
       </w:pPr>
-      <w:bookmarkStart w:id="66" w:name="bm_fig23"/>
-      <w:r>
-        <w:rPr>
-          <w:b/>
-          <w:bCs/>
-          <w:lang w:val="es-CO"/>
-        </w:rPr>
-        <w:t>Figura 23</w:t>
+      <w:bookmarkStart w:id="66" w:name="bm_fig24"/>
+      <w:r>
+        <w:rPr>
+          <w:b/>
+          <w:bCs/>
+          <w:lang w:val="es-CO"/>
+        </w:rPr>
+        <w:t>Figura 24</w:t>
       </w:r>
       <w:bookmarkEnd w:id="66"/>
     </w:p>

</xml_diff>